<commit_message>
Update and finalise system design document
</commit_message>
<xml_diff>
--- a/System Design Document.docx
+++ b/System Design Document.docx
@@ -53,6 +53,23 @@
         <w:jc w:val="center"/>
         <w:rPr>
           <w:rFonts w:ascii="Georgia" w:hAnsi="Georgia"/>
+          <w:color w:val="3B3838" w:themeColor="background2" w:themeShade="40"/>
+        </w:rPr>
+      </w:pPr>
+      <w:r>
+        <w:rPr>
+          <w:rFonts w:ascii="Georgia" w:hAnsi="Georgia"/>
+          <w:color w:val="3B3838" w:themeColor="background2" w:themeShade="40"/>
+        </w:rPr>
+        <w:t>Dead Man’s Draw++</w:t>
+      </w:r>
+    </w:p>
+    <w:p>
+      <w:pPr>
+        <w:pStyle w:val="Subtitle"/>
+        <w:jc w:val="center"/>
+        <w:rPr>
+          <w:rFonts w:ascii="Georgia" w:hAnsi="Georgia"/>
         </w:rPr>
       </w:pPr>
       <w:r>
@@ -73,16 +90,8 @@
         <w:rPr>
           <w:rFonts w:ascii="Georgia" w:hAnsi="Georgia"/>
         </w:rPr>
-        <w:t xml:space="preserve">Kimchhay </w:t>
-      </w:r>
-      <w:proofErr w:type="spellStart"/>
-      <w:r>
-        <w:rPr>
-          <w:rFonts w:ascii="Georgia" w:hAnsi="Georgia"/>
-        </w:rPr>
-        <w:t>Leng</w:t>
-      </w:r>
-      <w:proofErr w:type="spellEnd"/>
+        <w:t>COMP 1039 | Design Patterns with C++ | Assignment 1</w:t>
+      </w:r>
     </w:p>
     <w:p>
       <w:pPr>
@@ -91,18 +100,74 @@
           <w:rFonts w:ascii="Georgia" w:hAnsi="Georgia"/>
         </w:rPr>
       </w:pPr>
-      <w:hyperlink r:id="rId6" w:history="1">
+      <w:r>
+        <w:rPr>
+          <w:rFonts w:ascii="Georgia" w:hAnsi="Georgia"/>
+        </w:rPr>
+        <w:t>Student Name: Kimchhay Leng</w:t>
+      </w:r>
+    </w:p>
+    <w:p>
+      <w:pPr>
+        <w:jc w:val="center"/>
+        <w:rPr>
+          <w:rFonts w:ascii="Georgia" w:hAnsi="Georgia"/>
+        </w:rPr>
+      </w:pPr>
+      <w:r>
+        <w:rPr>
+          <w:rFonts w:ascii="Georgia" w:hAnsi="Georgia"/>
+        </w:rPr>
+        <w:t xml:space="preserve">Email Address: </w:t>
+      </w:r>
+      <w:hyperlink r:id="rId7" w:history="1">
         <w:r>
           <w:rPr>
             <w:rStyle w:val="Hyperlink"/>
             <w:rFonts w:ascii="Georgia" w:hAnsi="Georgia"/>
           </w:rPr>
-          <w:t>A2942784@adelaide.student.edu.au</w:t>
+          <w:t>a2942784@student.adelaide.edu.au</w:t>
         </w:r>
       </w:hyperlink>
     </w:p>
     <w:p>
       <w:pPr>
+        <w:jc w:val="center"/>
+        <w:rPr>
+          <w:rFonts w:ascii="Georgia" w:hAnsi="Georgia"/>
+        </w:rPr>
+      </w:pPr>
+      <w:r>
+        <w:rPr>
+          <w:rFonts w:ascii="Georgia" w:hAnsi="Georgia"/>
+        </w:rPr>
+        <w:t>Student ID: a2942784</w:t>
+      </w:r>
+    </w:p>
+    <w:p>
+      <w:pPr>
+        <w:jc w:val="center"/>
+        <w:rPr>
+          <w:rFonts w:ascii="Georgia" w:hAnsi="Georgia"/>
+        </w:rPr>
+      </w:pPr>
+      <w:r>
+        <w:rPr>
+          <w:rFonts w:ascii="Georgia" w:hAnsi="Georgia"/>
+        </w:rPr>
+        <w:t>Adelaide University | 2026</w:t>
+      </w:r>
+    </w:p>
+    <w:p>
+      <w:pPr>
+        <w:jc w:val="center"/>
+        <w:rPr>
+          <w:rFonts w:ascii="Georgia" w:hAnsi="Georgia"/>
+        </w:rPr>
+      </w:pPr>
+    </w:p>
+    <w:p>
+      <w:pPr>
         <w:rPr>
           <w:rFonts w:ascii="Georgia" w:hAnsi="Georgia"/>
         </w:rPr>
@@ -116,10 +181,1135 @@
     </w:p>
     <w:p>
       <w:pPr>
-        <w:jc w:val="center"/>
-        <w:rPr>
-          <w:rFonts w:ascii="Georgia" w:hAnsi="Georgia"/>
-        </w:rPr>
+        <w:pStyle w:val="Heading1"/>
+        <w:numPr>
+          <w:ilvl w:val="0"/>
+          <w:numId w:val="1"/>
+        </w:numPr>
+      </w:pPr>
+      <w:r>
+        <w:lastRenderedPageBreak/>
+        <w:t>System Overview:</w:t>
+      </w:r>
+    </w:p>
+    <w:p>
+      <w:pPr>
+        <w:rPr>
+          <w:rFonts w:ascii="Georgia" w:hAnsi="Georgia"/>
+        </w:rPr>
+      </w:pPr>
+      <w:r>
+        <w:rPr>
+          <w:rFonts w:ascii="Georgia" w:hAnsi="Georgia"/>
+        </w:rPr>
+        <w:t>Dead Man’s Draw++ is a 2-player command-line card game implemented in C++. Players take turns drawing cards from a shared deck and accumulating points in their bank. Each card has a special ability that triggers when drawn. If a player draws two cards of the same suit in one turn. They bust and lose all cards drawn that turn. The player with the highest score at the end of 20 turns wins.</w:t>
+      </w:r>
+    </w:p>
+    <w:p>
+      <w:pPr>
+        <w:pStyle w:val="Heading1"/>
+        <w:numPr>
+          <w:ilvl w:val="0"/>
+          <w:numId w:val="1"/>
+        </w:numPr>
+      </w:pPr>
+      <w:r>
+        <w:t>Architecture Overview</w:t>
+      </w:r>
+    </w:p>
+    <w:p>
+      <w:pPr>
+        <w:rPr>
+          <w:rFonts w:ascii="Georgia" w:hAnsi="Georgia"/>
+        </w:rPr>
+      </w:pPr>
+      <w:r>
+        <w:rPr>
+          <w:rFonts w:ascii="Georgia" w:hAnsi="Georgia"/>
+        </w:rPr>
+        <w:t xml:space="preserve">The system follows a layered object-oriented architecture with three core </w:t>
+      </w:r>
+      <w:r>
+        <w:rPr>
+          <w:rFonts w:ascii="Georgia" w:hAnsi="Georgia"/>
+        </w:rPr>
+        <w:t xml:space="preserve">and one helper </w:t>
+      </w:r>
+      <w:r>
+        <w:rPr>
+          <w:rFonts w:ascii="Georgia" w:hAnsi="Georgia"/>
+        </w:rPr>
+        <w:t>class categories:</w:t>
+      </w:r>
+    </w:p>
+    <w:p>
+      <w:pPr>
+        <w:pStyle w:val="ListParagraph"/>
+        <w:numPr>
+          <w:ilvl w:val="0"/>
+          <w:numId w:val="2"/>
+        </w:numPr>
+        <w:rPr>
+          <w:rFonts w:ascii="Georgia" w:hAnsi="Georgia"/>
+        </w:rPr>
+      </w:pPr>
+      <w:r>
+        <w:rPr>
+          <w:rFonts w:ascii="Georgia" w:hAnsi="Georgia"/>
+        </w:rPr>
+        <w:t>Game: the top-level controller that drives the entire program.</w:t>
+      </w:r>
+    </w:p>
+    <w:p>
+      <w:pPr>
+        <w:pStyle w:val="ListParagraph"/>
+        <w:numPr>
+          <w:ilvl w:val="0"/>
+          <w:numId w:val="2"/>
+        </w:numPr>
+        <w:rPr>
+          <w:rFonts w:ascii="Georgia" w:hAnsi="Georgia"/>
+        </w:rPr>
+      </w:pPr>
+      <w:r>
+        <w:rPr>
+          <w:rFonts w:ascii="Georgia" w:hAnsi="Georgia"/>
+        </w:rPr>
+        <w:t>Player: manages each player’s state (play area, bank, score)</w:t>
+      </w:r>
+    </w:p>
+    <w:p>
+      <w:pPr>
+        <w:pStyle w:val="ListParagraph"/>
+        <w:numPr>
+          <w:ilvl w:val="0"/>
+          <w:numId w:val="2"/>
+        </w:numPr>
+        <w:rPr>
+          <w:rFonts w:ascii="Georgia" w:hAnsi="Georgia"/>
+        </w:rPr>
+      </w:pPr>
+      <w:r>
+        <w:rPr>
+          <w:rFonts w:ascii="Georgia" w:hAnsi="Georgia"/>
+        </w:rPr>
+        <w:t>Card hierarchy: an abstract base class with 9 concrete subclasses, one per suit</w:t>
+      </w:r>
+    </w:p>
+    <w:p>
+      <w:pPr>
+        <w:pStyle w:val="ListParagraph"/>
+        <w:numPr>
+          <w:ilvl w:val="0"/>
+          <w:numId w:val="2"/>
+        </w:numPr>
+        <w:rPr>
+          <w:rFonts w:ascii="Georgia" w:hAnsi="Georgia"/>
+        </w:rPr>
+      </w:pPr>
+      <w:r>
+        <w:rPr>
+          <w:rFonts w:ascii="Georgia" w:hAnsi="Georgia"/>
+        </w:rPr>
+        <w:t>CardHelper: shared utility functions used by card abilities.</w:t>
+      </w:r>
+    </w:p>
+    <w:p>
+      <w:pPr>
+        <w:rPr>
+          <w:rFonts w:ascii="Georgia" w:hAnsi="Georgia"/>
+        </w:rPr>
+      </w:pPr>
+      <w:r>
+        <w:rPr>
+          <w:rFonts w:ascii="Georgia" w:hAnsi="Georgia"/>
+        </w:rPr>
+        <w:t xml:space="preserve">The key </w:t>
+      </w:r>
+      <w:r>
+        <w:rPr>
+          <w:rFonts w:ascii="Georgia" w:hAnsi="Georgia"/>
+        </w:rPr>
+        <w:t>principle for designing this game is that each card is responsible for its own ability. Game and Player do not have suit-specific logic as they can simply call card-&gt;play() and the correct behaviour runs automatically through polymorphism. This makes it easy to add or remove card types without touching any other class.</w:t>
+      </w:r>
+    </w:p>
+    <w:p>
+      <w:pPr>
+        <w:pStyle w:val="Heading1"/>
+        <w:numPr>
+          <w:ilvl w:val="0"/>
+          <w:numId w:val="1"/>
+        </w:numPr>
+      </w:pPr>
+      <w:r>
+        <w:lastRenderedPageBreak/>
+        <w:t>UML Class Diagram</w:t>
+      </w:r>
+    </w:p>
+    <w:p>
+      <w:r>
+        <w:rPr>
+          <w:noProof/>
+        </w:rPr>
+        <w:drawing>
+          <wp:inline distT="0" distB="0" distL="0" distR="0" wp14:anchorId="7594B68B" wp14:editId="5BD0A67B">
+            <wp:extent cx="5943600" cy="4926330"/>
+            <wp:effectExtent l="19050" t="19050" r="19050" b="26670"/>
+            <wp:docPr id="1" name="Picture 1" descr="A diagram of a company&#10;&#10;Description automatically generated"/>
+            <wp:cNvGraphicFramePr>
+              <a:graphicFrameLocks xmlns:a="http://schemas.openxmlformats.org/drawingml/2006/main" noChangeAspect="1"/>
+            </wp:cNvGraphicFramePr>
+            <a:graphic xmlns:a="http://schemas.openxmlformats.org/drawingml/2006/main">
+              <a:graphicData uri="http://schemas.openxmlformats.org/drawingml/2006/picture">
+                <pic:pic xmlns:pic="http://schemas.openxmlformats.org/drawingml/2006/picture">
+                  <pic:nvPicPr>
+                    <pic:cNvPr id="1" name="Picture 1" descr="A diagram of a company&#10;&#10;Description automatically generated"/>
+                    <pic:cNvPicPr/>
+                  </pic:nvPicPr>
+                  <pic:blipFill>
+                    <a:blip r:embed="rId8">
+                      <a:extLst>
+                        <a:ext uri="{28A0092B-C50C-407E-A947-70E740481C1C}">
+                          <a14:useLocalDpi xmlns:a14="http://schemas.microsoft.com/office/drawing/2010/main" val="0"/>
+                        </a:ext>
+                      </a:extLst>
+                    </a:blip>
+                    <a:stretch>
+                      <a:fillRect/>
+                    </a:stretch>
+                  </pic:blipFill>
+                  <pic:spPr>
+                    <a:xfrm>
+                      <a:off x="0" y="0"/>
+                      <a:ext cx="5943600" cy="4926330"/>
+                    </a:xfrm>
+                    <a:prstGeom prst="rect">
+                      <a:avLst/>
+                    </a:prstGeom>
+                    <a:ln w="9525">
+                      <a:solidFill>
+                        <a:schemeClr val="tx1"/>
+                      </a:solidFill>
+                    </a:ln>
+                  </pic:spPr>
+                </pic:pic>
+              </a:graphicData>
+            </a:graphic>
+          </wp:inline>
+        </w:drawing>
+      </w:r>
+    </w:p>
+    <w:p>
+      <w:pPr>
+        <w:rPr>
+          <w:rFonts w:ascii="Georgia" w:hAnsi="Georgia"/>
+        </w:rPr>
+      </w:pPr>
+      <w:r>
+        <w:rPr>
+          <w:rFonts w:ascii="Georgia" w:hAnsi="Georgia"/>
+          <w:b/>
+          <w:bCs/>
+        </w:rPr>
+        <w:t>Game to Player (composition, 1 to 2):</w:t>
+      </w:r>
+      <w:r>
+        <w:rPr>
+          <w:rFonts w:ascii="Georgia" w:hAnsi="Georgia"/>
+        </w:rPr>
+        <w:t xml:space="preserve"> Game creates both players with “new” and deletes them in its destructor. Exactly 2 players always exist. The arrow goes one way only as Player never stores a reference back to Game; it only receives Game as method parameter.</w:t>
+      </w:r>
+    </w:p>
+    <w:p>
+      <w:pPr>
+        <w:rPr>
+          <w:rFonts w:ascii="Georgia" w:hAnsi="Georgia"/>
+        </w:rPr>
+      </w:pPr>
+      <w:r>
+        <w:rPr>
+          <w:rFonts w:ascii="Georgia" w:hAnsi="Georgia"/>
+          <w:b/>
+          <w:bCs/>
+        </w:rPr>
+        <w:t>Game to Card (composition, 1 to *):</w:t>
+      </w:r>
+      <w:r>
+        <w:rPr>
+          <w:rFonts w:ascii="Georgia" w:hAnsi="Georgia"/>
+        </w:rPr>
+        <w:t xml:space="preserve"> Game creates all 54 cards in createDeck() and is the only class that calls “</w:t>
+      </w:r>
+      <w:r>
+        <w:rPr>
+          <w:rFonts w:ascii="Georgia" w:hAnsi="Georgia"/>
+        </w:rPr>
+        <w:t>delete</w:t>
+      </w:r>
+      <w:r>
+        <w:rPr>
+          <w:rFonts w:ascii="Georgia" w:hAnsi="Georgia"/>
+        </w:rPr>
+        <w:t>” on them. Cards live in _deck and _discard as CardCollection attributes. The * multiplicity reflects that the count varies as cards move around.</w:t>
+      </w:r>
+    </w:p>
+    <w:p>
+      <w:pPr>
+        <w:rPr>
+          <w:rFonts w:ascii="Georgia" w:hAnsi="Georgia"/>
+        </w:rPr>
+      </w:pPr>
+      <w:r>
+        <w:rPr>
+          <w:rFonts w:ascii="Georgia" w:hAnsi="Georgia"/>
+          <w:b/>
+          <w:bCs/>
+        </w:rPr>
+        <w:t>Player to Card (association, 1 to *):</w:t>
+      </w:r>
+      <w:r>
+        <w:rPr>
+          <w:rFonts w:ascii="Georgia" w:hAnsi="Georgia"/>
+        </w:rPr>
+        <w:t xml:space="preserve"> Player holds card pointers in _playArea and _bank, but does not own them. Game owns all cards. </w:t>
+      </w:r>
+    </w:p>
+    <w:p>
+      <w:pPr>
+        <w:rPr>
+          <w:rFonts w:ascii="Georgia" w:hAnsi="Georgia"/>
+        </w:rPr>
+      </w:pPr>
+      <w:r>
+        <w:rPr>
+          <w:rFonts w:ascii="Georgia" w:hAnsi="Georgia"/>
+          <w:b/>
+          <w:bCs/>
+        </w:rPr>
+        <w:t>Card to CardType (dependency, 1 to 1):</w:t>
+      </w:r>
+      <w:r>
+        <w:rPr>
+          <w:rFonts w:ascii="Georgia" w:hAnsi="Georgia"/>
+        </w:rPr>
+        <w:t xml:space="preserve"> Card stores _cardType as an attribute and returns it from type(). The enum has no lifetime of its own, so it is a dependency rather than composition.</w:t>
+      </w:r>
+    </w:p>
+    <w:p>
+      <w:pPr>
+        <w:rPr>
+          <w:rFonts w:ascii="Georgia" w:hAnsi="Georgia"/>
+        </w:rPr>
+      </w:pPr>
+      <w:r>
+        <w:rPr>
+          <w:rFonts w:ascii="Georgia" w:hAnsi="Georgia"/>
+          <w:b/>
+          <w:bCs/>
+        </w:rPr>
+        <w:t>Card to concrete card subclasses (inheritance):</w:t>
+      </w:r>
+      <w:r>
+        <w:rPr>
+          <w:rFonts w:ascii="Georgia" w:hAnsi="Georgia"/>
+        </w:rPr>
+        <w:t xml:space="preserve"> All 9 subclasses inherit from the abstract base class. ChestCard is the only one that overrides willAddToBank() in addition to str() and play().</w:t>
+      </w:r>
+    </w:p>
+    <w:p>
+      <w:pPr>
+        <w:rPr>
+          <w:rFonts w:ascii="Georgia" w:hAnsi="Georgia"/>
+        </w:rPr>
+      </w:pPr>
+      <w:r>
+        <w:rPr>
+          <w:rFonts w:ascii="Georgia" w:hAnsi="Georgia"/>
+          <w:b/>
+          <w:bCs/>
+        </w:rPr>
+        <w:lastRenderedPageBreak/>
+        <w:t>CannonCard, SwordCard, HookCard to CardHelper (dependency):</w:t>
+      </w:r>
+      <w:r>
+        <w:rPr>
+          <w:rFonts w:ascii="Georgia" w:hAnsi="Georgia"/>
+        </w:rPr>
+        <w:t xml:space="preserve"> These three classes depend on the selectSuit() and removeTopCard() methods.</w:t>
+      </w:r>
+    </w:p>
+    <w:p>
+      <w:pPr>
+        <w:pStyle w:val="Heading1"/>
+        <w:numPr>
+          <w:ilvl w:val="0"/>
+          <w:numId w:val="1"/>
+        </w:numPr>
+      </w:pPr>
+      <w:r>
+        <w:t>Design Decisions</w:t>
+      </w:r>
+    </w:p>
+    <w:p>
+      <w:pPr>
+        <w:pStyle w:val="Heading2"/>
+        <w:numPr>
+          <w:ilvl w:val="1"/>
+          <w:numId w:val="1"/>
+        </w:numPr>
+      </w:pPr>
+      <w:r>
+        <w:t>Card is an abstract class with pure virtual methods</w:t>
+      </w:r>
+    </w:p>
+    <w:p>
+      <w:pPr>
+        <w:pStyle w:val="ListParagraph"/>
+        <w:numPr>
+          <w:ilvl w:val="0"/>
+          <w:numId w:val="3"/>
+        </w:numPr>
+      </w:pPr>
+      <w:r>
+        <w:rPr>
+          <w:rFonts w:ascii="Georgia" w:hAnsi="Georgia"/>
+        </w:rPr>
+        <w:t>str() and play() are declared as pure virtual (=0), which means Card cannot be instantiated directly and only concrete subclasses, such as CannonCard or MermaidCard can be created.</w:t>
+      </w:r>
+    </w:p>
+    <w:p>
+      <w:pPr>
+        <w:pStyle w:val="ListParagraph"/>
+        <w:numPr>
+          <w:ilvl w:val="0"/>
+          <w:numId w:val="3"/>
+        </w:numPr>
+      </w:pPr>
+      <w:r>
+        <w:rPr>
+          <w:rFonts w:ascii="Georgia" w:hAnsi="Georgia"/>
+        </w:rPr>
+        <w:t>This forces every card type to define its own string representation and ability, which prevents incomplete card objects from entering the game.</w:t>
+      </w:r>
+    </w:p>
+    <w:p>
+      <w:pPr>
+        <w:pStyle w:val="ListParagraph"/>
+        <w:numPr>
+          <w:ilvl w:val="0"/>
+          <w:numId w:val="3"/>
+        </w:numPr>
+      </w:pPr>
+      <w:r>
+        <w:rPr>
+          <w:rFonts w:ascii="Georgia" w:hAnsi="Georgia"/>
+        </w:rPr>
+        <w:t>Game and Player never need to know which specific card they are holding</w:t>
+      </w:r>
+      <w:r>
+        <w:rPr>
+          <w:rFonts w:ascii="Georgia" w:hAnsi="Georgia"/>
+        </w:rPr>
+        <w:t>; they can just call card-&gt;play() and polymorphism routes to the correct subclass automatically.</w:t>
+      </w:r>
+    </w:p>
+    <w:p>
+      <w:pPr>
+        <w:pStyle w:val="ListParagraph"/>
+        <w:numPr>
+          <w:ilvl w:val="0"/>
+          <w:numId w:val="3"/>
+        </w:numPr>
+      </w:pPr>
+      <w:r>
+        <w:rPr>
+          <w:rFonts w:ascii="Georgia" w:hAnsi="Georgia"/>
+        </w:rPr>
+        <w:t>This is the Single Responsibility Principle, where each card is responsible for its own behaviour, not Game or Player.</w:t>
+      </w:r>
+    </w:p>
+    <w:p>
+      <w:pPr>
+        <w:pStyle w:val="Heading2"/>
+        <w:numPr>
+          <w:ilvl w:val="1"/>
+          <w:numId w:val="1"/>
+        </w:numPr>
+      </w:pPr>
+      <w:r>
+        <w:t>Card::play() takes Game and Player as parameters rather than storing them</w:t>
+      </w:r>
+    </w:p>
+    <w:p>
+      <w:pPr>
+        <w:pStyle w:val="ListParagraph"/>
+        <w:numPr>
+          <w:ilvl w:val="0"/>
+          <w:numId w:val="5"/>
+        </w:numPr>
+      </w:pPr>
+      <w:r>
+        <w:rPr>
+          <w:rFonts w:ascii="Georgia" w:hAnsi="Georgia"/>
+        </w:rPr>
+        <w:t>Card abilities need temporary access to the game state, such as the deck, discard pile, the other player’s bank, etc.</w:t>
+      </w:r>
+    </w:p>
+    <w:p>
+      <w:pPr>
+        <w:pStyle w:val="ListParagraph"/>
+        <w:numPr>
+          <w:ilvl w:val="0"/>
+          <w:numId w:val="5"/>
+        </w:numPr>
+      </w:pPr>
+      <w:r>
+        <w:rPr>
+          <w:rFonts w:ascii="Georgia" w:hAnsi="Georgia"/>
+        </w:rPr>
+        <w:t>Rather than storing a permanent Game* or Player* inside every car object, these are passed in as method parameters only when the ability fires.</w:t>
+      </w:r>
+    </w:p>
+    <w:p>
+      <w:pPr>
+        <w:pStyle w:val="ListParagraph"/>
+        <w:numPr>
+          <w:ilvl w:val="0"/>
+          <w:numId w:val="5"/>
+        </w:numPr>
+      </w:pPr>
+      <w:r>
+        <w:rPr>
+          <w:rFonts w:ascii="Georgia" w:hAnsi="Georgia"/>
+        </w:rPr>
+        <w:t>This keeps Card loosely coupled which means a Card does not permanently depend on Game or Player, it only borrows them for the duration of play().</w:t>
+      </w:r>
+    </w:p>
+    <w:p>
+      <w:pPr>
+        <w:pStyle w:val="Heading2"/>
+        <w:numPr>
+          <w:ilvl w:val="1"/>
+          <w:numId w:val="1"/>
+        </w:numPr>
+      </w:pPr>
+      <w:r>
+        <w:t>Game owns all Card objects (composition)</w:t>
+      </w:r>
+    </w:p>
+    <w:p>
+      <w:pPr>
+        <w:pStyle w:val="ListParagraph"/>
+        <w:numPr>
+          <w:ilvl w:val="0"/>
+          <w:numId w:val="7"/>
+        </w:numPr>
+      </w:pPr>
+      <w:r>
+        <w:rPr>
+          <w:rFonts w:ascii="Georgia" w:hAnsi="Georgia"/>
+        </w:rPr>
+        <w:t>All 54 cards are created with new inside Game::createDeck() and stored in _deck</w:t>
+      </w:r>
+    </w:p>
+    <w:p>
+      <w:pPr>
+        <w:pStyle w:val="ListParagraph"/>
+        <w:numPr>
+          <w:ilvl w:val="0"/>
+          <w:numId w:val="7"/>
+        </w:numPr>
+      </w:pPr>
+      <w:r>
+        <w:rPr>
+          <w:rFonts w:ascii="Georgia" w:hAnsi="Georgia"/>
+        </w:rPr>
+        <w:t>From there, card pointers move between _deck, player areas, player banks, and _discard, but the objects themselves never move</w:t>
+      </w:r>
+    </w:p>
+    <w:p>
+      <w:pPr>
+        <w:pStyle w:val="ListParagraph"/>
+        <w:numPr>
+          <w:ilvl w:val="0"/>
+          <w:numId w:val="7"/>
+        </w:numPr>
+      </w:pPr>
+      <w:r>
+        <w:rPr>
+          <w:rFonts w:ascii="Georgia" w:hAnsi="Georgia"/>
+        </w:rPr>
+        <w:t>Game’s destructor is the only place that calls delete on cards. It deletes everything in _deck, _discard, and both players' banks and play areas.</w:t>
+      </w:r>
+    </w:p>
+    <w:p>
+      <w:pPr>
+        <w:pStyle w:val="ListParagraph"/>
+        <w:numPr>
+          <w:ilvl w:val="0"/>
+          <w:numId w:val="7"/>
+        </w:numPr>
+      </w:pPr>
+      <w:r>
+        <w:rPr>
+          <w:rFonts w:ascii="Georgia" w:hAnsi="Georgia"/>
+        </w:rPr>
+        <w:t>Player’s destructor deliberately does nothing with cards to prevent double-free crashes.</w:t>
+      </w:r>
+    </w:p>
+    <w:p>
+      <w:pPr>
+        <w:pStyle w:val="ListParagraph"/>
+        <w:numPr>
+          <w:ilvl w:val="0"/>
+          <w:numId w:val="7"/>
+        </w:numPr>
+      </w:pPr>
+      <w:r>
+        <w:rPr>
+          <w:rFonts w:ascii="Georgia" w:hAnsi="Georgia"/>
+        </w:rPr>
+        <w:t>The rule followed throughout: whoever calls new is responsible for deleting.</w:t>
+      </w:r>
+    </w:p>
+    <w:p>
+      <w:pPr>
+        <w:pStyle w:val="Heading2"/>
+        <w:numPr>
+          <w:ilvl w:val="1"/>
+          <w:numId w:val="1"/>
+        </w:numPr>
+      </w:pPr>
+      <w:r>
+        <w:t>willAddToBank() exists as a separate virtual  method</w:t>
+      </w:r>
+    </w:p>
+    <w:p>
+      <w:pPr>
+        <w:pStyle w:val="ListParagraph"/>
+        <w:numPr>
+          <w:ilvl w:val="0"/>
+          <w:numId w:val="9"/>
+        </w:numPr>
+      </w:pPr>
+      <w:r>
+        <w:rPr>
+          <w:rFonts w:ascii="Georgia" w:hAnsi="Georgia"/>
+        </w:rPr>
+        <w:t>The Chest and Key ability is unusual as it fires at banking time, not when draw.</w:t>
+      </w:r>
+    </w:p>
+    <w:p>
+      <w:pPr>
+        <w:pStyle w:val="ListParagraph"/>
+        <w:numPr>
+          <w:ilvl w:val="0"/>
+          <w:numId w:val="9"/>
+        </w:numPr>
+      </w:pPr>
+      <w:r>
+        <w:rPr>
+          <w:rFonts w:ascii="Georgia" w:hAnsi="Georgia"/>
+        </w:rPr>
+        <w:t>Rather than adding special-case logic to Game or Player (e.g. ‘If this is a ChestCard and there is a KeyCard…’, a separate virtual method willAddToBank() is defined on Card.</w:t>
+      </w:r>
+    </w:p>
+    <w:p>
+      <w:pPr>
+        <w:pStyle w:val="ListParagraph"/>
+        <w:numPr>
+          <w:ilvl w:val="0"/>
+          <w:numId w:val="9"/>
+        </w:numPr>
+      </w:pPr>
+      <w:r>
+        <w:rPr>
+          <w:rFonts w:ascii="Georgia" w:hAnsi="Georgia"/>
+        </w:rPr>
+        <w:t>The default implementation does nothing, so 8 of 9 card types completely ignore it.</w:t>
+      </w:r>
+    </w:p>
+    <w:p>
+      <w:pPr>
+        <w:pStyle w:val="ListParagraph"/>
+        <w:numPr>
+          <w:ilvl w:val="0"/>
+          <w:numId w:val="9"/>
+        </w:numPr>
+      </w:pPr>
+      <w:r>
+        <w:rPr>
+          <w:rFonts w:ascii="Georgia" w:hAnsi="Georgia"/>
+        </w:rPr>
+        <w:t>Only ChestCard overrides it to detect a Key in the play area and draw bonus cards.</w:t>
+      </w:r>
+    </w:p>
+    <w:p>
+      <w:pPr>
+        <w:pStyle w:val="ListParagraph"/>
+        <w:numPr>
+          <w:ilvl w:val="0"/>
+          <w:numId w:val="9"/>
+        </w:numPr>
+      </w:pPr>
+      <w:r>
+        <w:rPr>
+          <w:rFonts w:ascii="Georgia" w:hAnsi="Georgia"/>
+        </w:rPr>
+        <w:t>Player::bankCard() calls willAddToBank() on every card uniformly. It does not need to know which cards respond to it.</w:t>
+      </w:r>
+    </w:p>
+    <w:p>
+      <w:pPr>
+        <w:pStyle w:val="Heading2"/>
+        <w:numPr>
+          <w:ilvl w:val="1"/>
+          <w:numId w:val="1"/>
+        </w:numPr>
+      </w:pPr>
+      <w:r>
+        <w:lastRenderedPageBreak/>
+        <w:t>_bustedThisTurn flag on Player</w:t>
+      </w:r>
+    </w:p>
+    <w:p>
+      <w:pPr>
+        <w:pStyle w:val="ListParagraph"/>
+        <w:numPr>
+          <w:ilvl w:val="0"/>
+          <w:numId w:val="10"/>
+        </w:numPr>
+      </w:pPr>
+      <w:r>
+        <w:rPr>
+          <w:rFonts w:ascii="Georgia" w:hAnsi="Georgia"/>
+        </w:rPr>
+        <w:t>Without this flag, busts caused inside card abilities (Kraken, Sword, Hook) were invisible to Game::runTurn().</w:t>
+      </w:r>
+    </w:p>
+    <w:p>
+      <w:pPr>
+        <w:pStyle w:val="ListParagraph"/>
+        <w:numPr>
+          <w:ilvl w:val="0"/>
+          <w:numId w:val="10"/>
+        </w:numPr>
+      </w:pPr>
+      <w:r>
+        <w:rPr>
+          <w:rFonts w:ascii="Georgia" w:hAnsi="Georgia"/>
+        </w:rPr>
+        <w:t>When Kraken’s play() calls player.playCard() and causes a bust internally, bustDiscard() fires inside the card ability and sets _bustedThisTurn = true.</w:t>
+      </w:r>
+    </w:p>
+    <w:p>
+      <w:pPr>
+        <w:pStyle w:val="ListParagraph"/>
+        <w:numPr>
+          <w:ilvl w:val="0"/>
+          <w:numId w:val="10"/>
+        </w:numPr>
+      </w:pPr>
+      <w:r>
+        <w:rPr>
+          <w:rFonts w:ascii="Georgia" w:hAnsi="Georgia"/>
+        </w:rPr>
+        <w:t>runTurn() then checks hasBustedThisTurn() after the card ability returns, and ends the turn correctly without calling bustDiscard() a second time.</w:t>
+      </w:r>
+    </w:p>
+    <w:p>
+      <w:pPr>
+        <w:pStyle w:val="ListParagraph"/>
+        <w:numPr>
+          <w:ilvl w:val="0"/>
+          <w:numId w:val="10"/>
+        </w:numPr>
+      </w:pPr>
+      <w:r>
+        <w:rPr>
+          <w:rFonts w:ascii="Georgia" w:hAnsi="Georgia"/>
+        </w:rPr>
+        <w:t>The flag is reset at the start of every turn via resetBust(), called in Game::runTurn() before the draw loop begins.</w:t>
+      </w:r>
+    </w:p>
+    <w:p>
+      <w:pPr>
+        <w:pStyle w:val="Heading2"/>
+        <w:numPr>
+          <w:ilvl w:val="1"/>
+          <w:numId w:val="1"/>
+        </w:numPr>
+      </w:pPr>
+      <w:r>
+        <w:t xml:space="preserve"> CardHelper contains shared free functions, not a class</w:t>
+      </w:r>
+    </w:p>
+    <w:p>
+      <w:pPr>
+        <w:pStyle w:val="ListParagraph"/>
+        <w:numPr>
+          <w:ilvl w:val="0"/>
+          <w:numId w:val="12"/>
+        </w:numPr>
+      </w:pPr>
+      <w:r>
+        <w:rPr>
+          <w:rFonts w:ascii="Georgia" w:hAnsi="Georgia"/>
+        </w:rPr>
+        <w:t>selectSuit() and removeTopCard() are used by three different card abilities such as CannonCard, SwordCard, and HookCard.</w:t>
+      </w:r>
+    </w:p>
+    <w:p>
+      <w:pPr>
+        <w:pStyle w:val="ListParagraph"/>
+        <w:numPr>
+          <w:ilvl w:val="0"/>
+          <w:numId w:val="12"/>
+        </w:numPr>
+      </w:pPr>
+      <w:r>
+        <w:rPr>
+          <w:rFonts w:ascii="Georgia" w:hAnsi="Georgia"/>
+        </w:rPr>
+        <w:t>Rather than duplicating this code in each card, it is extracted into two free functions in CardHelper.cpp with declarations in CardHelper.h</w:t>
+      </w:r>
+    </w:p>
+    <w:p>
+      <w:pPr>
+        <w:pStyle w:val="ListParagraph"/>
+        <w:numPr>
+          <w:ilvl w:val="0"/>
+          <w:numId w:val="12"/>
+        </w:numPr>
+      </w:pPr>
+      <w:r>
+        <w:rPr>
+          <w:rFonts w:ascii="Georgia" w:hAnsi="Georgia"/>
+        </w:rPr>
+        <w:t>They are free functions rather than a class because they have no state of their own as they are pure utility logic.</w:t>
+      </w:r>
+    </w:p>
+    <w:p>
+      <w:pPr>
+        <w:pStyle w:val="Heading2"/>
+        <w:numPr>
+          <w:ilvl w:val="1"/>
+          <w:numId w:val="1"/>
+        </w:numPr>
+      </w:pPr>
+      <w:r>
+        <w:t xml:space="preserve"> </w:t>
+      </w:r>
+      <w:r>
+        <w:t>CardCollection typedef</w:t>
+      </w:r>
+    </w:p>
+    <w:p>
+      <w:pPr>
+        <w:pStyle w:val="ListParagraph"/>
+        <w:numPr>
+          <w:ilvl w:val="0"/>
+          <w:numId w:val="13"/>
+        </w:numPr>
+      </w:pPr>
+      <w:r>
+        <w:rPr>
+          <w:rFonts w:ascii="Georgia" w:hAnsi="Georgia"/>
+        </w:rPr>
+        <w:t>Typedef std::vector&lt;Card*&gt; CardCollection is defined once in Card.h.</w:t>
+      </w:r>
+    </w:p>
+    <w:p>
+      <w:pPr>
+        <w:pStyle w:val="ListParagraph"/>
+        <w:numPr>
+          <w:ilvl w:val="0"/>
+          <w:numId w:val="13"/>
+        </w:numPr>
+      </w:pPr>
+      <w:r>
+        <w:rPr>
+          <w:rFonts w:ascii="Georgia" w:hAnsi="Georgia"/>
+        </w:rPr>
+        <w:t>This shorthand appears in dozens of places across the codebase, such as the deck, discard pile, play area, bank, and card ability parameters.</w:t>
+      </w:r>
+    </w:p>
+    <w:p>
+      <w:pPr>
+        <w:pStyle w:val="ListParagraph"/>
+        <w:numPr>
+          <w:ilvl w:val="0"/>
+          <w:numId w:val="13"/>
+        </w:numPr>
+      </w:pPr>
+      <w:r>
+        <w:rPr>
+          <w:rFonts w:ascii="Georgia" w:hAnsi="Georgia"/>
+        </w:rPr>
+        <w:t>Using the typedef makes the code more readable and means the underlying container can be changed in one place if needed.</w:t>
+      </w:r>
+    </w:p>
+    <w:p>
+      <w:pPr>
+        <w:pStyle w:val="Heading2"/>
+        <w:numPr>
+          <w:ilvl w:val="1"/>
+          <w:numId w:val="1"/>
+        </w:numPr>
+      </w:pPr>
+      <w:r>
+        <w:t xml:space="preserve"> </w:t>
+      </w:r>
+      <w:r>
+        <w:t>Scoring using std::map&lt;CardType, int&gt;</w:t>
+      </w:r>
+    </w:p>
+    <w:p>
+      <w:pPr>
+        <w:pStyle w:val="ListParagraph"/>
+        <w:numPr>
+          <w:ilvl w:val="0"/>
+          <w:numId w:val="15"/>
+        </w:numPr>
+      </w:pPr>
+      <w:r>
+        <w:rPr>
+          <w:rFonts w:ascii="Georgia" w:hAnsi="Georgia"/>
+        </w:rPr>
+        <w:t>The scoring rule is: sum the highest value card of each suit in the bank.</w:t>
+      </w:r>
+    </w:p>
+    <w:p>
+      <w:pPr>
+        <w:pStyle w:val="ListParagraph"/>
+        <w:numPr>
+          <w:ilvl w:val="0"/>
+          <w:numId w:val="15"/>
+        </w:numPr>
+      </w:pPr>
+      <w:r>
+        <w:rPr>
+          <w:rFonts w:ascii="Georgia" w:hAnsi="Georgia"/>
+        </w:rPr>
+        <w:t>A std::map</w:t>
+      </w:r>
+      <w:r>
+        <w:rPr>
+          <w:rFonts w:ascii="Georgia" w:hAnsi="Georgia"/>
+        </w:rPr>
+        <w:t xml:space="preserve"> is ideal for storing data like</w:t>
+      </w:r>
+      <w:r>
+        <w:rPr>
+          <w:rFonts w:ascii="Georgia" w:hAnsi="Georgia"/>
+        </w:rPr>
+        <w:t xml:space="preserve"> CardType as key and highest-value-seen as the value</w:t>
+      </w:r>
+      <w:r>
+        <w:rPr>
+          <w:rFonts w:ascii="Georgia" w:hAnsi="Georgia"/>
+        </w:rPr>
+        <w:t>.</w:t>
+      </w:r>
+    </w:p>
+    <w:p>
+      <w:pPr>
+        <w:pStyle w:val="ListParagraph"/>
+        <w:numPr>
+          <w:ilvl w:val="0"/>
+          <w:numId w:val="15"/>
+        </w:numPr>
+      </w:pPr>
+      <w:r>
+        <w:rPr>
+          <w:rFonts w:ascii="Georgia" w:hAnsi="Georgia"/>
+        </w:rPr>
+        <w:t>For each banked card, the map is updated if the current card’s value exceeds the stored value for that suit.</w:t>
+      </w:r>
+    </w:p>
+    <w:p>
+      <w:pPr>
+        <w:pStyle w:val="ListParagraph"/>
+        <w:numPr>
+          <w:ilvl w:val="0"/>
+          <w:numId w:val="15"/>
+        </w:numPr>
+      </w:pPr>
+      <w:r>
+        <w:rPr>
+          <w:rFonts w:ascii="Georgia" w:hAnsi="Georgia"/>
+        </w:rPr>
+        <w:t>At the end, the map values are summed.</w:t>
+      </w:r>
+    </w:p>
+    <w:p>
+      <w:pPr>
+        <w:pStyle w:val="Heading2"/>
+        <w:numPr>
+          <w:ilvl w:val="1"/>
+          <w:numId w:val="1"/>
+        </w:numPr>
+      </w:pPr>
+      <w:r>
+        <w:t xml:space="preserve"> Player switching uses the expression 1 - _currentPlayer</w:t>
+      </w:r>
+    </w:p>
+    <w:p>
+      <w:pPr>
+        <w:pStyle w:val="ListParagraph"/>
+        <w:numPr>
+          <w:ilvl w:val="0"/>
+          <w:numId w:val="16"/>
+        </w:numPr>
+      </w:pPr>
+      <w:r>
+        <w:rPr>
+          <w:rFonts w:ascii="Georgia" w:hAnsi="Georgia"/>
+        </w:rPr>
+        <w:t>_currentPlayer is always 0 or 1, representing which of the two players is active in the current turn.</w:t>
+      </w:r>
+    </w:p>
+    <w:p>
+      <w:pPr>
+        <w:pStyle w:val="ListParagraph"/>
+        <w:numPr>
+          <w:ilvl w:val="0"/>
+          <w:numId w:val="16"/>
+        </w:numPr>
+      </w:pPr>
+      <w:r>
+        <w:rPr>
+          <w:rFonts w:ascii="Georgia" w:hAnsi="Georgia"/>
+        </w:rPr>
+        <w:t>The expression 1 – 0 = 1 and 1 – 1 = 0 flips between the two player indices each turn.</w:t>
+      </w:r>
+    </w:p>
+    <w:p>
+      <w:pPr>
+        <w:pStyle w:val="ListParagraph"/>
+        <w:numPr>
+          <w:ilvl w:val="0"/>
+          <w:numId w:val="16"/>
+        </w:numPr>
+      </w:pPr>
+      <w:r>
+        <w:rPr>
+          <w:rFonts w:ascii="Georgia" w:hAnsi="Georgia"/>
+        </w:rPr>
+        <w:t xml:space="preserve">This </w:t>
+      </w:r>
+      <w:r>
+        <w:rPr>
+          <w:rFonts w:ascii="Georgia" w:hAnsi="Georgia"/>
+        </w:rPr>
+        <w:t>avoids</w:t>
+      </w:r>
+      <w:r>
+        <w:rPr>
+          <w:rFonts w:ascii="Georgia" w:hAnsi="Georgia"/>
+        </w:rPr>
+        <w:t xml:space="preserve"> an explicit if/else and is self-documenting once </w:t>
+      </w:r>
+      <w:r>
+        <w:rPr>
+          <w:rFonts w:ascii="Georgia" w:hAnsi="Georgia"/>
+        </w:rPr>
+        <w:t>understood.</w:t>
+      </w:r>
+    </w:p>
+    <w:p>
+      <w:pPr>
+        <w:pStyle w:val="Heading2"/>
+        <w:numPr>
+          <w:ilvl w:val="1"/>
+          <w:numId w:val="1"/>
+        </w:numPr>
+      </w:pPr>
+      <w:r>
+        <w:t>cin error handling in input loops</w:t>
+      </w:r>
+    </w:p>
+    <w:p>
+      <w:pPr>
+        <w:pStyle w:val="ListParagraph"/>
+        <w:numPr>
+          <w:ilvl w:val="0"/>
+          <w:numId w:val="19"/>
+        </w:numPr>
+        <w:rPr>
+          <w:rFonts w:ascii="Georgia" w:hAnsi="Georgia"/>
+        </w:rPr>
+      </w:pPr>
+      <w:r>
+        <w:rPr>
+          <w:rFonts w:ascii="Georgia" w:hAnsi="Georgia"/>
+        </w:rPr>
+        <w:t xml:space="preserve">When a </w:t>
+      </w:r>
+      <w:r>
+        <w:rPr>
+          <w:rFonts w:ascii="Georgia" w:hAnsi="Georgia"/>
+        </w:rPr>
+        <w:t>user types a non-integer where std::cin &gt;&gt; expects one, cin enters a fail state and stops reading.</w:t>
+      </w:r>
+    </w:p>
+    <w:p>
+      <w:pPr>
+        <w:pStyle w:val="ListParagraph"/>
+        <w:numPr>
+          <w:ilvl w:val="0"/>
+          <w:numId w:val="19"/>
+        </w:numPr>
+        <w:rPr>
+          <w:rFonts w:ascii="Georgia" w:hAnsi="Georgia"/>
+        </w:rPr>
+      </w:pPr>
+      <w:r>
+        <w:rPr>
+          <w:rFonts w:ascii="Georgia" w:hAnsi="Georgia"/>
+        </w:rPr>
+        <w:t>This caused an infinite loop because the loop condition stayed true, cin kept returning immediately, and the prompt flooded the output.</w:t>
+      </w:r>
+    </w:p>
+    <w:p>
+      <w:pPr>
+        <w:pStyle w:val="ListParagraph"/>
+        <w:numPr>
+          <w:ilvl w:val="0"/>
+          <w:numId w:val="19"/>
+        </w:numPr>
+        <w:rPr>
+          <w:rFonts w:ascii="Georgia" w:hAnsi="Georgia"/>
+        </w:rPr>
+      </w:pPr>
+      <w:r>
+        <w:rPr>
+          <w:rFonts w:ascii="Georgia" w:hAnsi="Georgia"/>
+        </w:rPr>
+        <w:t>The fix: check if (!(std::cin &gt;&gt; choice)) and if so call std::cin.clear() to reset the fail flag, then std::cin.ignore(1000, ‘\n’) to flush the bad input from the buffer.</w:t>
+      </w:r>
+    </w:p>
+    <w:p>
+      <w:pPr>
+        <w:pStyle w:val="ListParagraph"/>
+        <w:numPr>
+          <w:ilvl w:val="0"/>
+          <w:numId w:val="19"/>
+        </w:numPr>
+        <w:rPr>
+          <w:rFonts w:ascii="Georgia" w:hAnsi="Georgia"/>
+        </w:rPr>
+      </w:pPr>
+      <w:r>
+        <w:rPr>
+          <w:rFonts w:ascii="Georgia" w:hAnsi="Georgia"/>
+        </w:rPr>
+        <w:t>This pattern is applied to both selectSuit() in CardHelper.cpp and MapCard::play().</w:t>
+      </w:r>
+    </w:p>
+    <w:p>
+      <w:pPr>
+        <w:ind w:left="360"/>
       </w:pPr>
     </w:p>
     <w:sectPr>
@@ -180,6 +1370,2223 @@
     </w:p>
   </w:footnote>
 </w:footnotes>
+</file>
+
+<file path=word/numbering.xml><?xml version="1.0" encoding="utf-8"?>
+<w:numbering xmlns:wpc="http://schemas.microsoft.com/office/word/2010/wordprocessingCanvas" xmlns:cx="http://schemas.microsoft.com/office/drawing/2014/chartex" xmlns:cx1="http://schemas.microsoft.com/office/drawing/2015/9/8/chartex" xmlns:cx2="http://schemas.microsoft.com/office/drawing/2015/10/21/chartex" xmlns:cx3="http://schemas.microsoft.com/office/drawing/2016/5/9/chartex" xmlns:cx4="http://schemas.microsoft.com/office/drawing/2016/5/10/chartex" xmlns:cx5="http://schemas.microsoft.com/office/drawing/2016/5/11/chartex" xmlns:cx6="http://schemas.microsoft.com/office/drawing/2016/5/12/chartex" xmlns:cx7="http://schemas.microsoft.com/office/drawing/2016/5/13/chartex" xmlns:cx8="http://schemas.microsoft.com/office/drawing/2016/5/14/chartex" xmlns:mc="http://schemas.openxmlformats.org/markup-compatibility/2006" xmlns:aink="http://schemas.microsoft.com/office/drawing/2016/ink" xmlns:am3d="http://schemas.microsoft.com/office/drawing/2017/model3d" xmlns:o="urn:schemas-microsoft-com:office:office" xmlns:r="http://schemas.openxmlformats.org/officeDocument/2006/relationships" xmlns:m="http://schemas.openxmlformats.org/officeDocument/2006/math" xmlns:v="urn:schemas-microsoft-com:vml" xmlns:wp14="http://schemas.microsoft.com/office/word/2010/wordprocessingDrawing" xmlns:wp="http://schemas.openxmlformats.org/drawingml/2006/wordprocessingDrawing" xmlns:w10="urn:schemas-microsoft-com:office:word" xmlns:w="http://schemas.openxmlformats.org/wordprocessingml/2006/main" xmlns:w14="http://schemas.microsoft.com/office/word/2010/wordml" xmlns:w15="http://schemas.microsoft.com/office/word/2012/wordml" xmlns:w16cex="http://schemas.microsoft.com/office/word/2018/wordml/cex" xmlns:w16cid="http://schemas.microsoft.com/office/word/2016/wordml/cid" xmlns:w16="http://schemas.microsoft.com/office/word/2018/wordml" xmlns:w16sdtdh="http://schemas.microsoft.com/office/word/2020/wordml/sdtdatahash" xmlns:w16se="http://schemas.microsoft.com/office/word/2015/wordml/symex" xmlns:wpg="http://schemas.microsoft.com/office/word/2010/wordprocessingGroup" xmlns:wpi="http://schemas.microsoft.com/office/word/2010/wordprocessingInk" xmlns:wne="http://schemas.microsoft.com/office/word/2006/wordml" xmlns:wps="http://schemas.microsoft.com/office/word/2010/wordprocessingShape" mc:Ignorable="w14 w15 w16se w16cid w16 w16cex w16sdtdh wp14">
+  <w:abstractNum w:abstractNumId="0" w15:restartNumberingAfterBreak="0">
+    <w:nsid w:val="004E6150"/>
+    <w:multiLevelType w:val="hybridMultilevel"/>
+    <w:tmpl w:val="F81857EE"/>
+    <w:lvl w:ilvl="0" w:tplc="04090001">
+      <w:start w:val="1"/>
+      <w:numFmt w:val="bullet"/>
+      <w:lvlText w:val=""/>
+      <w:lvlJc w:val="left"/>
+      <w:pPr>
+        <w:ind w:left="1470" w:hanging="360"/>
+      </w:pPr>
+      <w:rPr>
+        <w:rFonts w:ascii="Symbol" w:hAnsi="Symbol" w:hint="default"/>
+      </w:rPr>
+    </w:lvl>
+    <w:lvl w:ilvl="1" w:tplc="04090003" w:tentative="1">
+      <w:start w:val="1"/>
+      <w:numFmt w:val="bullet"/>
+      <w:lvlText w:val="o"/>
+      <w:lvlJc w:val="left"/>
+      <w:pPr>
+        <w:ind w:left="2190" w:hanging="360"/>
+      </w:pPr>
+      <w:rPr>
+        <w:rFonts w:ascii="Courier New" w:hAnsi="Courier New" w:cs="Courier New" w:hint="default"/>
+      </w:rPr>
+    </w:lvl>
+    <w:lvl w:ilvl="2" w:tplc="04090005" w:tentative="1">
+      <w:start w:val="1"/>
+      <w:numFmt w:val="bullet"/>
+      <w:lvlText w:val=""/>
+      <w:lvlJc w:val="left"/>
+      <w:pPr>
+        <w:ind w:left="2910" w:hanging="360"/>
+      </w:pPr>
+      <w:rPr>
+        <w:rFonts w:ascii="Wingdings" w:hAnsi="Wingdings" w:hint="default"/>
+      </w:rPr>
+    </w:lvl>
+    <w:lvl w:ilvl="3" w:tplc="04090001" w:tentative="1">
+      <w:start w:val="1"/>
+      <w:numFmt w:val="bullet"/>
+      <w:lvlText w:val=""/>
+      <w:lvlJc w:val="left"/>
+      <w:pPr>
+        <w:ind w:left="3630" w:hanging="360"/>
+      </w:pPr>
+      <w:rPr>
+        <w:rFonts w:ascii="Symbol" w:hAnsi="Symbol" w:hint="default"/>
+      </w:rPr>
+    </w:lvl>
+    <w:lvl w:ilvl="4" w:tplc="04090003" w:tentative="1">
+      <w:start w:val="1"/>
+      <w:numFmt w:val="bullet"/>
+      <w:lvlText w:val="o"/>
+      <w:lvlJc w:val="left"/>
+      <w:pPr>
+        <w:ind w:left="4350" w:hanging="360"/>
+      </w:pPr>
+      <w:rPr>
+        <w:rFonts w:ascii="Courier New" w:hAnsi="Courier New" w:cs="Courier New" w:hint="default"/>
+      </w:rPr>
+    </w:lvl>
+    <w:lvl w:ilvl="5" w:tplc="04090005" w:tentative="1">
+      <w:start w:val="1"/>
+      <w:numFmt w:val="bullet"/>
+      <w:lvlText w:val=""/>
+      <w:lvlJc w:val="left"/>
+      <w:pPr>
+        <w:ind w:left="5070" w:hanging="360"/>
+      </w:pPr>
+      <w:rPr>
+        <w:rFonts w:ascii="Wingdings" w:hAnsi="Wingdings" w:hint="default"/>
+      </w:rPr>
+    </w:lvl>
+    <w:lvl w:ilvl="6" w:tplc="04090001" w:tentative="1">
+      <w:start w:val="1"/>
+      <w:numFmt w:val="bullet"/>
+      <w:lvlText w:val=""/>
+      <w:lvlJc w:val="left"/>
+      <w:pPr>
+        <w:ind w:left="5790" w:hanging="360"/>
+      </w:pPr>
+      <w:rPr>
+        <w:rFonts w:ascii="Symbol" w:hAnsi="Symbol" w:hint="default"/>
+      </w:rPr>
+    </w:lvl>
+    <w:lvl w:ilvl="7" w:tplc="04090003" w:tentative="1">
+      <w:start w:val="1"/>
+      <w:numFmt w:val="bullet"/>
+      <w:lvlText w:val="o"/>
+      <w:lvlJc w:val="left"/>
+      <w:pPr>
+        <w:ind w:left="6510" w:hanging="360"/>
+      </w:pPr>
+      <w:rPr>
+        <w:rFonts w:ascii="Courier New" w:hAnsi="Courier New" w:cs="Courier New" w:hint="default"/>
+      </w:rPr>
+    </w:lvl>
+    <w:lvl w:ilvl="8" w:tplc="04090005" w:tentative="1">
+      <w:start w:val="1"/>
+      <w:numFmt w:val="bullet"/>
+      <w:lvlText w:val=""/>
+      <w:lvlJc w:val="left"/>
+      <w:pPr>
+        <w:ind w:left="7230" w:hanging="360"/>
+      </w:pPr>
+      <w:rPr>
+        <w:rFonts w:ascii="Wingdings" w:hAnsi="Wingdings" w:hint="default"/>
+      </w:rPr>
+    </w:lvl>
+  </w:abstractNum>
+  <w:abstractNum w:abstractNumId="1" w15:restartNumberingAfterBreak="0">
+    <w:nsid w:val="0BD64EA8"/>
+    <w:multiLevelType w:val="hybridMultilevel"/>
+    <w:tmpl w:val="9CBC55EA"/>
+    <w:lvl w:ilvl="0" w:tplc="04090001">
+      <w:start w:val="1"/>
+      <w:numFmt w:val="bullet"/>
+      <w:lvlText w:val=""/>
+      <w:lvlJc w:val="left"/>
+      <w:pPr>
+        <w:ind w:left="1080" w:hanging="360"/>
+      </w:pPr>
+      <w:rPr>
+        <w:rFonts w:ascii="Symbol" w:hAnsi="Symbol" w:hint="default"/>
+      </w:rPr>
+    </w:lvl>
+    <w:lvl w:ilvl="1" w:tplc="04090003" w:tentative="1">
+      <w:start w:val="1"/>
+      <w:numFmt w:val="bullet"/>
+      <w:lvlText w:val="o"/>
+      <w:lvlJc w:val="left"/>
+      <w:pPr>
+        <w:ind w:left="1800" w:hanging="360"/>
+      </w:pPr>
+      <w:rPr>
+        <w:rFonts w:ascii="Courier New" w:hAnsi="Courier New" w:cs="Courier New" w:hint="default"/>
+      </w:rPr>
+    </w:lvl>
+    <w:lvl w:ilvl="2" w:tplc="04090005" w:tentative="1">
+      <w:start w:val="1"/>
+      <w:numFmt w:val="bullet"/>
+      <w:lvlText w:val=""/>
+      <w:lvlJc w:val="left"/>
+      <w:pPr>
+        <w:ind w:left="2520" w:hanging="360"/>
+      </w:pPr>
+      <w:rPr>
+        <w:rFonts w:ascii="Wingdings" w:hAnsi="Wingdings" w:hint="default"/>
+      </w:rPr>
+    </w:lvl>
+    <w:lvl w:ilvl="3" w:tplc="04090001" w:tentative="1">
+      <w:start w:val="1"/>
+      <w:numFmt w:val="bullet"/>
+      <w:lvlText w:val=""/>
+      <w:lvlJc w:val="left"/>
+      <w:pPr>
+        <w:ind w:left="3240" w:hanging="360"/>
+      </w:pPr>
+      <w:rPr>
+        <w:rFonts w:ascii="Symbol" w:hAnsi="Symbol" w:hint="default"/>
+      </w:rPr>
+    </w:lvl>
+    <w:lvl w:ilvl="4" w:tplc="04090003" w:tentative="1">
+      <w:start w:val="1"/>
+      <w:numFmt w:val="bullet"/>
+      <w:lvlText w:val="o"/>
+      <w:lvlJc w:val="left"/>
+      <w:pPr>
+        <w:ind w:left="3960" w:hanging="360"/>
+      </w:pPr>
+      <w:rPr>
+        <w:rFonts w:ascii="Courier New" w:hAnsi="Courier New" w:cs="Courier New" w:hint="default"/>
+      </w:rPr>
+    </w:lvl>
+    <w:lvl w:ilvl="5" w:tplc="04090005" w:tentative="1">
+      <w:start w:val="1"/>
+      <w:numFmt w:val="bullet"/>
+      <w:lvlText w:val=""/>
+      <w:lvlJc w:val="left"/>
+      <w:pPr>
+        <w:ind w:left="4680" w:hanging="360"/>
+      </w:pPr>
+      <w:rPr>
+        <w:rFonts w:ascii="Wingdings" w:hAnsi="Wingdings" w:hint="default"/>
+      </w:rPr>
+    </w:lvl>
+    <w:lvl w:ilvl="6" w:tplc="04090001" w:tentative="1">
+      <w:start w:val="1"/>
+      <w:numFmt w:val="bullet"/>
+      <w:lvlText w:val=""/>
+      <w:lvlJc w:val="left"/>
+      <w:pPr>
+        <w:ind w:left="5400" w:hanging="360"/>
+      </w:pPr>
+      <w:rPr>
+        <w:rFonts w:ascii="Symbol" w:hAnsi="Symbol" w:hint="default"/>
+      </w:rPr>
+    </w:lvl>
+    <w:lvl w:ilvl="7" w:tplc="04090003" w:tentative="1">
+      <w:start w:val="1"/>
+      <w:numFmt w:val="bullet"/>
+      <w:lvlText w:val="o"/>
+      <w:lvlJc w:val="left"/>
+      <w:pPr>
+        <w:ind w:left="6120" w:hanging="360"/>
+      </w:pPr>
+      <w:rPr>
+        <w:rFonts w:ascii="Courier New" w:hAnsi="Courier New" w:cs="Courier New" w:hint="default"/>
+      </w:rPr>
+    </w:lvl>
+    <w:lvl w:ilvl="8" w:tplc="04090005" w:tentative="1">
+      <w:start w:val="1"/>
+      <w:numFmt w:val="bullet"/>
+      <w:lvlText w:val=""/>
+      <w:lvlJc w:val="left"/>
+      <w:pPr>
+        <w:ind w:left="6840" w:hanging="360"/>
+      </w:pPr>
+      <w:rPr>
+        <w:rFonts w:ascii="Wingdings" w:hAnsi="Wingdings" w:hint="default"/>
+      </w:rPr>
+    </w:lvl>
+  </w:abstractNum>
+  <w:abstractNum w:abstractNumId="2" w15:restartNumberingAfterBreak="0">
+    <w:nsid w:val="13B70E91"/>
+    <w:multiLevelType w:val="hybridMultilevel"/>
+    <w:tmpl w:val="FC864184"/>
+    <w:lvl w:ilvl="0" w:tplc="04090001">
+      <w:start w:val="1"/>
+      <w:numFmt w:val="bullet"/>
+      <w:lvlText w:val=""/>
+      <w:lvlJc w:val="left"/>
+      <w:pPr>
+        <w:ind w:left="1470" w:hanging="360"/>
+      </w:pPr>
+      <w:rPr>
+        <w:rFonts w:ascii="Symbol" w:hAnsi="Symbol" w:hint="default"/>
+      </w:rPr>
+    </w:lvl>
+    <w:lvl w:ilvl="1" w:tplc="04090003" w:tentative="1">
+      <w:start w:val="1"/>
+      <w:numFmt w:val="bullet"/>
+      <w:lvlText w:val="o"/>
+      <w:lvlJc w:val="left"/>
+      <w:pPr>
+        <w:ind w:left="2190" w:hanging="360"/>
+      </w:pPr>
+      <w:rPr>
+        <w:rFonts w:ascii="Courier New" w:hAnsi="Courier New" w:cs="Courier New" w:hint="default"/>
+      </w:rPr>
+    </w:lvl>
+    <w:lvl w:ilvl="2" w:tplc="04090005" w:tentative="1">
+      <w:start w:val="1"/>
+      <w:numFmt w:val="bullet"/>
+      <w:lvlText w:val=""/>
+      <w:lvlJc w:val="left"/>
+      <w:pPr>
+        <w:ind w:left="2910" w:hanging="360"/>
+      </w:pPr>
+      <w:rPr>
+        <w:rFonts w:ascii="Wingdings" w:hAnsi="Wingdings" w:hint="default"/>
+      </w:rPr>
+    </w:lvl>
+    <w:lvl w:ilvl="3" w:tplc="04090001" w:tentative="1">
+      <w:start w:val="1"/>
+      <w:numFmt w:val="bullet"/>
+      <w:lvlText w:val=""/>
+      <w:lvlJc w:val="left"/>
+      <w:pPr>
+        <w:ind w:left="3630" w:hanging="360"/>
+      </w:pPr>
+      <w:rPr>
+        <w:rFonts w:ascii="Symbol" w:hAnsi="Symbol" w:hint="default"/>
+      </w:rPr>
+    </w:lvl>
+    <w:lvl w:ilvl="4" w:tplc="04090003" w:tentative="1">
+      <w:start w:val="1"/>
+      <w:numFmt w:val="bullet"/>
+      <w:lvlText w:val="o"/>
+      <w:lvlJc w:val="left"/>
+      <w:pPr>
+        <w:ind w:left="4350" w:hanging="360"/>
+      </w:pPr>
+      <w:rPr>
+        <w:rFonts w:ascii="Courier New" w:hAnsi="Courier New" w:cs="Courier New" w:hint="default"/>
+      </w:rPr>
+    </w:lvl>
+    <w:lvl w:ilvl="5" w:tplc="04090005" w:tentative="1">
+      <w:start w:val="1"/>
+      <w:numFmt w:val="bullet"/>
+      <w:lvlText w:val=""/>
+      <w:lvlJc w:val="left"/>
+      <w:pPr>
+        <w:ind w:left="5070" w:hanging="360"/>
+      </w:pPr>
+      <w:rPr>
+        <w:rFonts w:ascii="Wingdings" w:hAnsi="Wingdings" w:hint="default"/>
+      </w:rPr>
+    </w:lvl>
+    <w:lvl w:ilvl="6" w:tplc="04090001" w:tentative="1">
+      <w:start w:val="1"/>
+      <w:numFmt w:val="bullet"/>
+      <w:lvlText w:val=""/>
+      <w:lvlJc w:val="left"/>
+      <w:pPr>
+        <w:ind w:left="5790" w:hanging="360"/>
+      </w:pPr>
+      <w:rPr>
+        <w:rFonts w:ascii="Symbol" w:hAnsi="Symbol" w:hint="default"/>
+      </w:rPr>
+    </w:lvl>
+    <w:lvl w:ilvl="7" w:tplc="04090003" w:tentative="1">
+      <w:start w:val="1"/>
+      <w:numFmt w:val="bullet"/>
+      <w:lvlText w:val="o"/>
+      <w:lvlJc w:val="left"/>
+      <w:pPr>
+        <w:ind w:left="6510" w:hanging="360"/>
+      </w:pPr>
+      <w:rPr>
+        <w:rFonts w:ascii="Courier New" w:hAnsi="Courier New" w:cs="Courier New" w:hint="default"/>
+      </w:rPr>
+    </w:lvl>
+    <w:lvl w:ilvl="8" w:tplc="04090005" w:tentative="1">
+      <w:start w:val="1"/>
+      <w:numFmt w:val="bullet"/>
+      <w:lvlText w:val=""/>
+      <w:lvlJc w:val="left"/>
+      <w:pPr>
+        <w:ind w:left="7230" w:hanging="360"/>
+      </w:pPr>
+      <w:rPr>
+        <w:rFonts w:ascii="Wingdings" w:hAnsi="Wingdings" w:hint="default"/>
+      </w:rPr>
+    </w:lvl>
+  </w:abstractNum>
+  <w:abstractNum w:abstractNumId="3" w15:restartNumberingAfterBreak="0">
+    <w:nsid w:val="1B8043E9"/>
+    <w:multiLevelType w:val="hybridMultilevel"/>
+    <w:tmpl w:val="F9E464EA"/>
+    <w:lvl w:ilvl="0" w:tplc="04090001">
+      <w:start w:val="1"/>
+      <w:numFmt w:val="bullet"/>
+      <w:lvlText w:val=""/>
+      <w:lvlJc w:val="left"/>
+      <w:pPr>
+        <w:ind w:left="1080" w:hanging="360"/>
+      </w:pPr>
+      <w:rPr>
+        <w:rFonts w:ascii="Symbol" w:hAnsi="Symbol" w:hint="default"/>
+      </w:rPr>
+    </w:lvl>
+    <w:lvl w:ilvl="1" w:tplc="04090003" w:tentative="1">
+      <w:start w:val="1"/>
+      <w:numFmt w:val="bullet"/>
+      <w:lvlText w:val="o"/>
+      <w:lvlJc w:val="left"/>
+      <w:pPr>
+        <w:ind w:left="1800" w:hanging="360"/>
+      </w:pPr>
+      <w:rPr>
+        <w:rFonts w:ascii="Courier New" w:hAnsi="Courier New" w:cs="Courier New" w:hint="default"/>
+      </w:rPr>
+    </w:lvl>
+    <w:lvl w:ilvl="2" w:tplc="04090005" w:tentative="1">
+      <w:start w:val="1"/>
+      <w:numFmt w:val="bullet"/>
+      <w:lvlText w:val=""/>
+      <w:lvlJc w:val="left"/>
+      <w:pPr>
+        <w:ind w:left="2520" w:hanging="360"/>
+      </w:pPr>
+      <w:rPr>
+        <w:rFonts w:ascii="Wingdings" w:hAnsi="Wingdings" w:hint="default"/>
+      </w:rPr>
+    </w:lvl>
+    <w:lvl w:ilvl="3" w:tplc="04090001" w:tentative="1">
+      <w:start w:val="1"/>
+      <w:numFmt w:val="bullet"/>
+      <w:lvlText w:val=""/>
+      <w:lvlJc w:val="left"/>
+      <w:pPr>
+        <w:ind w:left="3240" w:hanging="360"/>
+      </w:pPr>
+      <w:rPr>
+        <w:rFonts w:ascii="Symbol" w:hAnsi="Symbol" w:hint="default"/>
+      </w:rPr>
+    </w:lvl>
+    <w:lvl w:ilvl="4" w:tplc="04090003" w:tentative="1">
+      <w:start w:val="1"/>
+      <w:numFmt w:val="bullet"/>
+      <w:lvlText w:val="o"/>
+      <w:lvlJc w:val="left"/>
+      <w:pPr>
+        <w:ind w:left="3960" w:hanging="360"/>
+      </w:pPr>
+      <w:rPr>
+        <w:rFonts w:ascii="Courier New" w:hAnsi="Courier New" w:cs="Courier New" w:hint="default"/>
+      </w:rPr>
+    </w:lvl>
+    <w:lvl w:ilvl="5" w:tplc="04090005" w:tentative="1">
+      <w:start w:val="1"/>
+      <w:numFmt w:val="bullet"/>
+      <w:lvlText w:val=""/>
+      <w:lvlJc w:val="left"/>
+      <w:pPr>
+        <w:ind w:left="4680" w:hanging="360"/>
+      </w:pPr>
+      <w:rPr>
+        <w:rFonts w:ascii="Wingdings" w:hAnsi="Wingdings" w:hint="default"/>
+      </w:rPr>
+    </w:lvl>
+    <w:lvl w:ilvl="6" w:tplc="04090001" w:tentative="1">
+      <w:start w:val="1"/>
+      <w:numFmt w:val="bullet"/>
+      <w:lvlText w:val=""/>
+      <w:lvlJc w:val="left"/>
+      <w:pPr>
+        <w:ind w:left="5400" w:hanging="360"/>
+      </w:pPr>
+      <w:rPr>
+        <w:rFonts w:ascii="Symbol" w:hAnsi="Symbol" w:hint="default"/>
+      </w:rPr>
+    </w:lvl>
+    <w:lvl w:ilvl="7" w:tplc="04090003" w:tentative="1">
+      <w:start w:val="1"/>
+      <w:numFmt w:val="bullet"/>
+      <w:lvlText w:val="o"/>
+      <w:lvlJc w:val="left"/>
+      <w:pPr>
+        <w:ind w:left="6120" w:hanging="360"/>
+      </w:pPr>
+      <w:rPr>
+        <w:rFonts w:ascii="Courier New" w:hAnsi="Courier New" w:cs="Courier New" w:hint="default"/>
+      </w:rPr>
+    </w:lvl>
+    <w:lvl w:ilvl="8" w:tplc="04090005" w:tentative="1">
+      <w:start w:val="1"/>
+      <w:numFmt w:val="bullet"/>
+      <w:lvlText w:val=""/>
+      <w:lvlJc w:val="left"/>
+      <w:pPr>
+        <w:ind w:left="6840" w:hanging="360"/>
+      </w:pPr>
+      <w:rPr>
+        <w:rFonts w:ascii="Wingdings" w:hAnsi="Wingdings" w:hint="default"/>
+      </w:rPr>
+    </w:lvl>
+  </w:abstractNum>
+  <w:abstractNum w:abstractNumId="4" w15:restartNumberingAfterBreak="0">
+    <w:nsid w:val="1E2228E1"/>
+    <w:multiLevelType w:val="hybridMultilevel"/>
+    <w:tmpl w:val="0E08C090"/>
+    <w:lvl w:ilvl="0" w:tplc="04090001">
+      <w:start w:val="1"/>
+      <w:numFmt w:val="bullet"/>
+      <w:lvlText w:val=""/>
+      <w:lvlJc w:val="left"/>
+      <w:pPr>
+        <w:ind w:left="720" w:hanging="360"/>
+      </w:pPr>
+      <w:rPr>
+        <w:rFonts w:ascii="Symbol" w:hAnsi="Symbol" w:hint="default"/>
+      </w:rPr>
+    </w:lvl>
+    <w:lvl w:ilvl="1" w:tplc="04090003" w:tentative="1">
+      <w:start w:val="1"/>
+      <w:numFmt w:val="bullet"/>
+      <w:lvlText w:val="o"/>
+      <w:lvlJc w:val="left"/>
+      <w:pPr>
+        <w:ind w:left="1440" w:hanging="360"/>
+      </w:pPr>
+      <w:rPr>
+        <w:rFonts w:ascii="Courier New" w:hAnsi="Courier New" w:cs="Courier New" w:hint="default"/>
+      </w:rPr>
+    </w:lvl>
+    <w:lvl w:ilvl="2" w:tplc="04090005" w:tentative="1">
+      <w:start w:val="1"/>
+      <w:numFmt w:val="bullet"/>
+      <w:lvlText w:val=""/>
+      <w:lvlJc w:val="left"/>
+      <w:pPr>
+        <w:ind w:left="2160" w:hanging="360"/>
+      </w:pPr>
+      <w:rPr>
+        <w:rFonts w:ascii="Wingdings" w:hAnsi="Wingdings" w:hint="default"/>
+      </w:rPr>
+    </w:lvl>
+    <w:lvl w:ilvl="3" w:tplc="04090001" w:tentative="1">
+      <w:start w:val="1"/>
+      <w:numFmt w:val="bullet"/>
+      <w:lvlText w:val=""/>
+      <w:lvlJc w:val="left"/>
+      <w:pPr>
+        <w:ind w:left="2880" w:hanging="360"/>
+      </w:pPr>
+      <w:rPr>
+        <w:rFonts w:ascii="Symbol" w:hAnsi="Symbol" w:hint="default"/>
+      </w:rPr>
+    </w:lvl>
+    <w:lvl w:ilvl="4" w:tplc="04090003" w:tentative="1">
+      <w:start w:val="1"/>
+      <w:numFmt w:val="bullet"/>
+      <w:lvlText w:val="o"/>
+      <w:lvlJc w:val="left"/>
+      <w:pPr>
+        <w:ind w:left="3600" w:hanging="360"/>
+      </w:pPr>
+      <w:rPr>
+        <w:rFonts w:ascii="Courier New" w:hAnsi="Courier New" w:cs="Courier New" w:hint="default"/>
+      </w:rPr>
+    </w:lvl>
+    <w:lvl w:ilvl="5" w:tplc="04090005" w:tentative="1">
+      <w:start w:val="1"/>
+      <w:numFmt w:val="bullet"/>
+      <w:lvlText w:val=""/>
+      <w:lvlJc w:val="left"/>
+      <w:pPr>
+        <w:ind w:left="4320" w:hanging="360"/>
+      </w:pPr>
+      <w:rPr>
+        <w:rFonts w:ascii="Wingdings" w:hAnsi="Wingdings" w:hint="default"/>
+      </w:rPr>
+    </w:lvl>
+    <w:lvl w:ilvl="6" w:tplc="04090001" w:tentative="1">
+      <w:start w:val="1"/>
+      <w:numFmt w:val="bullet"/>
+      <w:lvlText w:val=""/>
+      <w:lvlJc w:val="left"/>
+      <w:pPr>
+        <w:ind w:left="5040" w:hanging="360"/>
+      </w:pPr>
+      <w:rPr>
+        <w:rFonts w:ascii="Symbol" w:hAnsi="Symbol" w:hint="default"/>
+      </w:rPr>
+    </w:lvl>
+    <w:lvl w:ilvl="7" w:tplc="04090003" w:tentative="1">
+      <w:start w:val="1"/>
+      <w:numFmt w:val="bullet"/>
+      <w:lvlText w:val="o"/>
+      <w:lvlJc w:val="left"/>
+      <w:pPr>
+        <w:ind w:left="5760" w:hanging="360"/>
+      </w:pPr>
+      <w:rPr>
+        <w:rFonts w:ascii="Courier New" w:hAnsi="Courier New" w:cs="Courier New" w:hint="default"/>
+      </w:rPr>
+    </w:lvl>
+    <w:lvl w:ilvl="8" w:tplc="04090005" w:tentative="1">
+      <w:start w:val="1"/>
+      <w:numFmt w:val="bullet"/>
+      <w:lvlText w:val=""/>
+      <w:lvlJc w:val="left"/>
+      <w:pPr>
+        <w:ind w:left="6480" w:hanging="360"/>
+      </w:pPr>
+      <w:rPr>
+        <w:rFonts w:ascii="Wingdings" w:hAnsi="Wingdings" w:hint="default"/>
+      </w:rPr>
+    </w:lvl>
+  </w:abstractNum>
+  <w:abstractNum w:abstractNumId="5" w15:restartNumberingAfterBreak="0">
+    <w:nsid w:val="237212FB"/>
+    <w:multiLevelType w:val="hybridMultilevel"/>
+    <w:tmpl w:val="AC90A628"/>
+    <w:lvl w:ilvl="0" w:tplc="04090001">
+      <w:start w:val="1"/>
+      <w:numFmt w:val="bullet"/>
+      <w:lvlText w:val=""/>
+      <w:lvlJc w:val="left"/>
+      <w:pPr>
+        <w:ind w:left="1470" w:hanging="360"/>
+      </w:pPr>
+      <w:rPr>
+        <w:rFonts w:ascii="Symbol" w:hAnsi="Symbol" w:hint="default"/>
+      </w:rPr>
+    </w:lvl>
+    <w:lvl w:ilvl="1" w:tplc="04090003" w:tentative="1">
+      <w:start w:val="1"/>
+      <w:numFmt w:val="bullet"/>
+      <w:lvlText w:val="o"/>
+      <w:lvlJc w:val="left"/>
+      <w:pPr>
+        <w:ind w:left="2190" w:hanging="360"/>
+      </w:pPr>
+      <w:rPr>
+        <w:rFonts w:ascii="Courier New" w:hAnsi="Courier New" w:cs="Courier New" w:hint="default"/>
+      </w:rPr>
+    </w:lvl>
+    <w:lvl w:ilvl="2" w:tplc="04090005" w:tentative="1">
+      <w:start w:val="1"/>
+      <w:numFmt w:val="bullet"/>
+      <w:lvlText w:val=""/>
+      <w:lvlJc w:val="left"/>
+      <w:pPr>
+        <w:ind w:left="2910" w:hanging="360"/>
+      </w:pPr>
+      <w:rPr>
+        <w:rFonts w:ascii="Wingdings" w:hAnsi="Wingdings" w:hint="default"/>
+      </w:rPr>
+    </w:lvl>
+    <w:lvl w:ilvl="3" w:tplc="04090001" w:tentative="1">
+      <w:start w:val="1"/>
+      <w:numFmt w:val="bullet"/>
+      <w:lvlText w:val=""/>
+      <w:lvlJc w:val="left"/>
+      <w:pPr>
+        <w:ind w:left="3630" w:hanging="360"/>
+      </w:pPr>
+      <w:rPr>
+        <w:rFonts w:ascii="Symbol" w:hAnsi="Symbol" w:hint="default"/>
+      </w:rPr>
+    </w:lvl>
+    <w:lvl w:ilvl="4" w:tplc="04090003" w:tentative="1">
+      <w:start w:val="1"/>
+      <w:numFmt w:val="bullet"/>
+      <w:lvlText w:val="o"/>
+      <w:lvlJc w:val="left"/>
+      <w:pPr>
+        <w:ind w:left="4350" w:hanging="360"/>
+      </w:pPr>
+      <w:rPr>
+        <w:rFonts w:ascii="Courier New" w:hAnsi="Courier New" w:cs="Courier New" w:hint="default"/>
+      </w:rPr>
+    </w:lvl>
+    <w:lvl w:ilvl="5" w:tplc="04090005" w:tentative="1">
+      <w:start w:val="1"/>
+      <w:numFmt w:val="bullet"/>
+      <w:lvlText w:val=""/>
+      <w:lvlJc w:val="left"/>
+      <w:pPr>
+        <w:ind w:left="5070" w:hanging="360"/>
+      </w:pPr>
+      <w:rPr>
+        <w:rFonts w:ascii="Wingdings" w:hAnsi="Wingdings" w:hint="default"/>
+      </w:rPr>
+    </w:lvl>
+    <w:lvl w:ilvl="6" w:tplc="04090001" w:tentative="1">
+      <w:start w:val="1"/>
+      <w:numFmt w:val="bullet"/>
+      <w:lvlText w:val=""/>
+      <w:lvlJc w:val="left"/>
+      <w:pPr>
+        <w:ind w:left="5790" w:hanging="360"/>
+      </w:pPr>
+      <w:rPr>
+        <w:rFonts w:ascii="Symbol" w:hAnsi="Symbol" w:hint="default"/>
+      </w:rPr>
+    </w:lvl>
+    <w:lvl w:ilvl="7" w:tplc="04090003" w:tentative="1">
+      <w:start w:val="1"/>
+      <w:numFmt w:val="bullet"/>
+      <w:lvlText w:val="o"/>
+      <w:lvlJc w:val="left"/>
+      <w:pPr>
+        <w:ind w:left="6510" w:hanging="360"/>
+      </w:pPr>
+      <w:rPr>
+        <w:rFonts w:ascii="Courier New" w:hAnsi="Courier New" w:cs="Courier New" w:hint="default"/>
+      </w:rPr>
+    </w:lvl>
+    <w:lvl w:ilvl="8" w:tplc="04090005" w:tentative="1">
+      <w:start w:val="1"/>
+      <w:numFmt w:val="bullet"/>
+      <w:lvlText w:val=""/>
+      <w:lvlJc w:val="left"/>
+      <w:pPr>
+        <w:ind w:left="7230" w:hanging="360"/>
+      </w:pPr>
+      <w:rPr>
+        <w:rFonts w:ascii="Wingdings" w:hAnsi="Wingdings" w:hint="default"/>
+      </w:rPr>
+    </w:lvl>
+  </w:abstractNum>
+  <w:abstractNum w:abstractNumId="6" w15:restartNumberingAfterBreak="0">
+    <w:nsid w:val="26327885"/>
+    <w:multiLevelType w:val="hybridMultilevel"/>
+    <w:tmpl w:val="B114FCD2"/>
+    <w:lvl w:ilvl="0" w:tplc="04090001">
+      <w:start w:val="1"/>
+      <w:numFmt w:val="bullet"/>
+      <w:lvlText w:val=""/>
+      <w:lvlJc w:val="left"/>
+      <w:pPr>
+        <w:ind w:left="1470" w:hanging="360"/>
+      </w:pPr>
+      <w:rPr>
+        <w:rFonts w:ascii="Symbol" w:hAnsi="Symbol" w:hint="default"/>
+      </w:rPr>
+    </w:lvl>
+    <w:lvl w:ilvl="1" w:tplc="04090003" w:tentative="1">
+      <w:start w:val="1"/>
+      <w:numFmt w:val="bullet"/>
+      <w:lvlText w:val="o"/>
+      <w:lvlJc w:val="left"/>
+      <w:pPr>
+        <w:ind w:left="2190" w:hanging="360"/>
+      </w:pPr>
+      <w:rPr>
+        <w:rFonts w:ascii="Courier New" w:hAnsi="Courier New" w:cs="Courier New" w:hint="default"/>
+      </w:rPr>
+    </w:lvl>
+    <w:lvl w:ilvl="2" w:tplc="04090005" w:tentative="1">
+      <w:start w:val="1"/>
+      <w:numFmt w:val="bullet"/>
+      <w:lvlText w:val=""/>
+      <w:lvlJc w:val="left"/>
+      <w:pPr>
+        <w:ind w:left="2910" w:hanging="360"/>
+      </w:pPr>
+      <w:rPr>
+        <w:rFonts w:ascii="Wingdings" w:hAnsi="Wingdings" w:hint="default"/>
+      </w:rPr>
+    </w:lvl>
+    <w:lvl w:ilvl="3" w:tplc="04090001" w:tentative="1">
+      <w:start w:val="1"/>
+      <w:numFmt w:val="bullet"/>
+      <w:lvlText w:val=""/>
+      <w:lvlJc w:val="left"/>
+      <w:pPr>
+        <w:ind w:left="3630" w:hanging="360"/>
+      </w:pPr>
+      <w:rPr>
+        <w:rFonts w:ascii="Symbol" w:hAnsi="Symbol" w:hint="default"/>
+      </w:rPr>
+    </w:lvl>
+    <w:lvl w:ilvl="4" w:tplc="04090003" w:tentative="1">
+      <w:start w:val="1"/>
+      <w:numFmt w:val="bullet"/>
+      <w:lvlText w:val="o"/>
+      <w:lvlJc w:val="left"/>
+      <w:pPr>
+        <w:ind w:left="4350" w:hanging="360"/>
+      </w:pPr>
+      <w:rPr>
+        <w:rFonts w:ascii="Courier New" w:hAnsi="Courier New" w:cs="Courier New" w:hint="default"/>
+      </w:rPr>
+    </w:lvl>
+    <w:lvl w:ilvl="5" w:tplc="04090005" w:tentative="1">
+      <w:start w:val="1"/>
+      <w:numFmt w:val="bullet"/>
+      <w:lvlText w:val=""/>
+      <w:lvlJc w:val="left"/>
+      <w:pPr>
+        <w:ind w:left="5070" w:hanging="360"/>
+      </w:pPr>
+      <w:rPr>
+        <w:rFonts w:ascii="Wingdings" w:hAnsi="Wingdings" w:hint="default"/>
+      </w:rPr>
+    </w:lvl>
+    <w:lvl w:ilvl="6" w:tplc="04090001" w:tentative="1">
+      <w:start w:val="1"/>
+      <w:numFmt w:val="bullet"/>
+      <w:lvlText w:val=""/>
+      <w:lvlJc w:val="left"/>
+      <w:pPr>
+        <w:ind w:left="5790" w:hanging="360"/>
+      </w:pPr>
+      <w:rPr>
+        <w:rFonts w:ascii="Symbol" w:hAnsi="Symbol" w:hint="default"/>
+      </w:rPr>
+    </w:lvl>
+    <w:lvl w:ilvl="7" w:tplc="04090003" w:tentative="1">
+      <w:start w:val="1"/>
+      <w:numFmt w:val="bullet"/>
+      <w:lvlText w:val="o"/>
+      <w:lvlJc w:val="left"/>
+      <w:pPr>
+        <w:ind w:left="6510" w:hanging="360"/>
+      </w:pPr>
+      <w:rPr>
+        <w:rFonts w:ascii="Courier New" w:hAnsi="Courier New" w:cs="Courier New" w:hint="default"/>
+      </w:rPr>
+    </w:lvl>
+    <w:lvl w:ilvl="8" w:tplc="04090005" w:tentative="1">
+      <w:start w:val="1"/>
+      <w:numFmt w:val="bullet"/>
+      <w:lvlText w:val=""/>
+      <w:lvlJc w:val="left"/>
+      <w:pPr>
+        <w:ind w:left="7230" w:hanging="360"/>
+      </w:pPr>
+      <w:rPr>
+        <w:rFonts w:ascii="Wingdings" w:hAnsi="Wingdings" w:hint="default"/>
+      </w:rPr>
+    </w:lvl>
+  </w:abstractNum>
+  <w:abstractNum w:abstractNumId="7" w15:restartNumberingAfterBreak="0">
+    <w:nsid w:val="29E7402B"/>
+    <w:multiLevelType w:val="hybridMultilevel"/>
+    <w:tmpl w:val="D5B649D4"/>
+    <w:lvl w:ilvl="0" w:tplc="04090001">
+      <w:start w:val="1"/>
+      <w:numFmt w:val="bullet"/>
+      <w:lvlText w:val=""/>
+      <w:lvlJc w:val="left"/>
+      <w:pPr>
+        <w:ind w:left="1080" w:hanging="360"/>
+      </w:pPr>
+      <w:rPr>
+        <w:rFonts w:ascii="Symbol" w:hAnsi="Symbol" w:hint="default"/>
+      </w:rPr>
+    </w:lvl>
+    <w:lvl w:ilvl="1" w:tplc="04090003" w:tentative="1">
+      <w:start w:val="1"/>
+      <w:numFmt w:val="bullet"/>
+      <w:lvlText w:val="o"/>
+      <w:lvlJc w:val="left"/>
+      <w:pPr>
+        <w:ind w:left="1800" w:hanging="360"/>
+      </w:pPr>
+      <w:rPr>
+        <w:rFonts w:ascii="Courier New" w:hAnsi="Courier New" w:cs="Courier New" w:hint="default"/>
+      </w:rPr>
+    </w:lvl>
+    <w:lvl w:ilvl="2" w:tplc="04090005" w:tentative="1">
+      <w:start w:val="1"/>
+      <w:numFmt w:val="bullet"/>
+      <w:lvlText w:val=""/>
+      <w:lvlJc w:val="left"/>
+      <w:pPr>
+        <w:ind w:left="2520" w:hanging="360"/>
+      </w:pPr>
+      <w:rPr>
+        <w:rFonts w:ascii="Wingdings" w:hAnsi="Wingdings" w:hint="default"/>
+      </w:rPr>
+    </w:lvl>
+    <w:lvl w:ilvl="3" w:tplc="04090001" w:tentative="1">
+      <w:start w:val="1"/>
+      <w:numFmt w:val="bullet"/>
+      <w:lvlText w:val=""/>
+      <w:lvlJc w:val="left"/>
+      <w:pPr>
+        <w:ind w:left="3240" w:hanging="360"/>
+      </w:pPr>
+      <w:rPr>
+        <w:rFonts w:ascii="Symbol" w:hAnsi="Symbol" w:hint="default"/>
+      </w:rPr>
+    </w:lvl>
+    <w:lvl w:ilvl="4" w:tplc="04090003" w:tentative="1">
+      <w:start w:val="1"/>
+      <w:numFmt w:val="bullet"/>
+      <w:lvlText w:val="o"/>
+      <w:lvlJc w:val="left"/>
+      <w:pPr>
+        <w:ind w:left="3960" w:hanging="360"/>
+      </w:pPr>
+      <w:rPr>
+        <w:rFonts w:ascii="Courier New" w:hAnsi="Courier New" w:cs="Courier New" w:hint="default"/>
+      </w:rPr>
+    </w:lvl>
+    <w:lvl w:ilvl="5" w:tplc="04090005" w:tentative="1">
+      <w:start w:val="1"/>
+      <w:numFmt w:val="bullet"/>
+      <w:lvlText w:val=""/>
+      <w:lvlJc w:val="left"/>
+      <w:pPr>
+        <w:ind w:left="4680" w:hanging="360"/>
+      </w:pPr>
+      <w:rPr>
+        <w:rFonts w:ascii="Wingdings" w:hAnsi="Wingdings" w:hint="default"/>
+      </w:rPr>
+    </w:lvl>
+    <w:lvl w:ilvl="6" w:tplc="04090001" w:tentative="1">
+      <w:start w:val="1"/>
+      <w:numFmt w:val="bullet"/>
+      <w:lvlText w:val=""/>
+      <w:lvlJc w:val="left"/>
+      <w:pPr>
+        <w:ind w:left="5400" w:hanging="360"/>
+      </w:pPr>
+      <w:rPr>
+        <w:rFonts w:ascii="Symbol" w:hAnsi="Symbol" w:hint="default"/>
+      </w:rPr>
+    </w:lvl>
+    <w:lvl w:ilvl="7" w:tplc="04090003" w:tentative="1">
+      <w:start w:val="1"/>
+      <w:numFmt w:val="bullet"/>
+      <w:lvlText w:val="o"/>
+      <w:lvlJc w:val="left"/>
+      <w:pPr>
+        <w:ind w:left="6120" w:hanging="360"/>
+      </w:pPr>
+      <w:rPr>
+        <w:rFonts w:ascii="Courier New" w:hAnsi="Courier New" w:cs="Courier New" w:hint="default"/>
+      </w:rPr>
+    </w:lvl>
+    <w:lvl w:ilvl="8" w:tplc="04090005" w:tentative="1">
+      <w:start w:val="1"/>
+      <w:numFmt w:val="bullet"/>
+      <w:lvlText w:val=""/>
+      <w:lvlJc w:val="left"/>
+      <w:pPr>
+        <w:ind w:left="6840" w:hanging="360"/>
+      </w:pPr>
+      <w:rPr>
+        <w:rFonts w:ascii="Wingdings" w:hAnsi="Wingdings" w:hint="default"/>
+      </w:rPr>
+    </w:lvl>
+  </w:abstractNum>
+  <w:abstractNum w:abstractNumId="8" w15:restartNumberingAfterBreak="0">
+    <w:nsid w:val="2AE55D08"/>
+    <w:multiLevelType w:val="hybridMultilevel"/>
+    <w:tmpl w:val="9A9C0146"/>
+    <w:lvl w:ilvl="0" w:tplc="04090001">
+      <w:start w:val="1"/>
+      <w:numFmt w:val="bullet"/>
+      <w:lvlText w:val=""/>
+      <w:lvlJc w:val="left"/>
+      <w:pPr>
+        <w:ind w:left="1080" w:hanging="360"/>
+      </w:pPr>
+      <w:rPr>
+        <w:rFonts w:ascii="Symbol" w:hAnsi="Symbol" w:hint="default"/>
+      </w:rPr>
+    </w:lvl>
+    <w:lvl w:ilvl="1" w:tplc="04090003" w:tentative="1">
+      <w:start w:val="1"/>
+      <w:numFmt w:val="bullet"/>
+      <w:lvlText w:val="o"/>
+      <w:lvlJc w:val="left"/>
+      <w:pPr>
+        <w:ind w:left="1800" w:hanging="360"/>
+      </w:pPr>
+      <w:rPr>
+        <w:rFonts w:ascii="Courier New" w:hAnsi="Courier New" w:cs="Courier New" w:hint="default"/>
+      </w:rPr>
+    </w:lvl>
+    <w:lvl w:ilvl="2" w:tplc="04090005" w:tentative="1">
+      <w:start w:val="1"/>
+      <w:numFmt w:val="bullet"/>
+      <w:lvlText w:val=""/>
+      <w:lvlJc w:val="left"/>
+      <w:pPr>
+        <w:ind w:left="2520" w:hanging="360"/>
+      </w:pPr>
+      <w:rPr>
+        <w:rFonts w:ascii="Wingdings" w:hAnsi="Wingdings" w:hint="default"/>
+      </w:rPr>
+    </w:lvl>
+    <w:lvl w:ilvl="3" w:tplc="04090001" w:tentative="1">
+      <w:start w:val="1"/>
+      <w:numFmt w:val="bullet"/>
+      <w:lvlText w:val=""/>
+      <w:lvlJc w:val="left"/>
+      <w:pPr>
+        <w:ind w:left="3240" w:hanging="360"/>
+      </w:pPr>
+      <w:rPr>
+        <w:rFonts w:ascii="Symbol" w:hAnsi="Symbol" w:hint="default"/>
+      </w:rPr>
+    </w:lvl>
+    <w:lvl w:ilvl="4" w:tplc="04090003" w:tentative="1">
+      <w:start w:val="1"/>
+      <w:numFmt w:val="bullet"/>
+      <w:lvlText w:val="o"/>
+      <w:lvlJc w:val="left"/>
+      <w:pPr>
+        <w:ind w:left="3960" w:hanging="360"/>
+      </w:pPr>
+      <w:rPr>
+        <w:rFonts w:ascii="Courier New" w:hAnsi="Courier New" w:cs="Courier New" w:hint="default"/>
+      </w:rPr>
+    </w:lvl>
+    <w:lvl w:ilvl="5" w:tplc="04090005" w:tentative="1">
+      <w:start w:val="1"/>
+      <w:numFmt w:val="bullet"/>
+      <w:lvlText w:val=""/>
+      <w:lvlJc w:val="left"/>
+      <w:pPr>
+        <w:ind w:left="4680" w:hanging="360"/>
+      </w:pPr>
+      <w:rPr>
+        <w:rFonts w:ascii="Wingdings" w:hAnsi="Wingdings" w:hint="default"/>
+      </w:rPr>
+    </w:lvl>
+    <w:lvl w:ilvl="6" w:tplc="04090001" w:tentative="1">
+      <w:start w:val="1"/>
+      <w:numFmt w:val="bullet"/>
+      <w:lvlText w:val=""/>
+      <w:lvlJc w:val="left"/>
+      <w:pPr>
+        <w:ind w:left="5400" w:hanging="360"/>
+      </w:pPr>
+      <w:rPr>
+        <w:rFonts w:ascii="Symbol" w:hAnsi="Symbol" w:hint="default"/>
+      </w:rPr>
+    </w:lvl>
+    <w:lvl w:ilvl="7" w:tplc="04090003" w:tentative="1">
+      <w:start w:val="1"/>
+      <w:numFmt w:val="bullet"/>
+      <w:lvlText w:val="o"/>
+      <w:lvlJc w:val="left"/>
+      <w:pPr>
+        <w:ind w:left="6120" w:hanging="360"/>
+      </w:pPr>
+      <w:rPr>
+        <w:rFonts w:ascii="Courier New" w:hAnsi="Courier New" w:cs="Courier New" w:hint="default"/>
+      </w:rPr>
+    </w:lvl>
+    <w:lvl w:ilvl="8" w:tplc="04090005" w:tentative="1">
+      <w:start w:val="1"/>
+      <w:numFmt w:val="bullet"/>
+      <w:lvlText w:val=""/>
+      <w:lvlJc w:val="left"/>
+      <w:pPr>
+        <w:ind w:left="6840" w:hanging="360"/>
+      </w:pPr>
+      <w:rPr>
+        <w:rFonts w:ascii="Wingdings" w:hAnsi="Wingdings" w:hint="default"/>
+      </w:rPr>
+    </w:lvl>
+  </w:abstractNum>
+  <w:abstractNum w:abstractNumId="9" w15:restartNumberingAfterBreak="0">
+    <w:nsid w:val="30A452AC"/>
+    <w:multiLevelType w:val="hybridMultilevel"/>
+    <w:tmpl w:val="CF3CBB36"/>
+    <w:lvl w:ilvl="0" w:tplc="04090001">
+      <w:start w:val="1"/>
+      <w:numFmt w:val="bullet"/>
+      <w:lvlText w:val=""/>
+      <w:lvlJc w:val="left"/>
+      <w:pPr>
+        <w:ind w:left="1080" w:hanging="360"/>
+      </w:pPr>
+      <w:rPr>
+        <w:rFonts w:ascii="Symbol" w:hAnsi="Symbol" w:hint="default"/>
+      </w:rPr>
+    </w:lvl>
+    <w:lvl w:ilvl="1" w:tplc="04090003" w:tentative="1">
+      <w:start w:val="1"/>
+      <w:numFmt w:val="bullet"/>
+      <w:lvlText w:val="o"/>
+      <w:lvlJc w:val="left"/>
+      <w:pPr>
+        <w:ind w:left="1800" w:hanging="360"/>
+      </w:pPr>
+      <w:rPr>
+        <w:rFonts w:ascii="Courier New" w:hAnsi="Courier New" w:cs="Courier New" w:hint="default"/>
+      </w:rPr>
+    </w:lvl>
+    <w:lvl w:ilvl="2" w:tplc="04090005" w:tentative="1">
+      <w:start w:val="1"/>
+      <w:numFmt w:val="bullet"/>
+      <w:lvlText w:val=""/>
+      <w:lvlJc w:val="left"/>
+      <w:pPr>
+        <w:ind w:left="2520" w:hanging="360"/>
+      </w:pPr>
+      <w:rPr>
+        <w:rFonts w:ascii="Wingdings" w:hAnsi="Wingdings" w:hint="default"/>
+      </w:rPr>
+    </w:lvl>
+    <w:lvl w:ilvl="3" w:tplc="04090001" w:tentative="1">
+      <w:start w:val="1"/>
+      <w:numFmt w:val="bullet"/>
+      <w:lvlText w:val=""/>
+      <w:lvlJc w:val="left"/>
+      <w:pPr>
+        <w:ind w:left="3240" w:hanging="360"/>
+      </w:pPr>
+      <w:rPr>
+        <w:rFonts w:ascii="Symbol" w:hAnsi="Symbol" w:hint="default"/>
+      </w:rPr>
+    </w:lvl>
+    <w:lvl w:ilvl="4" w:tplc="04090003" w:tentative="1">
+      <w:start w:val="1"/>
+      <w:numFmt w:val="bullet"/>
+      <w:lvlText w:val="o"/>
+      <w:lvlJc w:val="left"/>
+      <w:pPr>
+        <w:ind w:left="3960" w:hanging="360"/>
+      </w:pPr>
+      <w:rPr>
+        <w:rFonts w:ascii="Courier New" w:hAnsi="Courier New" w:cs="Courier New" w:hint="default"/>
+      </w:rPr>
+    </w:lvl>
+    <w:lvl w:ilvl="5" w:tplc="04090005" w:tentative="1">
+      <w:start w:val="1"/>
+      <w:numFmt w:val="bullet"/>
+      <w:lvlText w:val=""/>
+      <w:lvlJc w:val="left"/>
+      <w:pPr>
+        <w:ind w:left="4680" w:hanging="360"/>
+      </w:pPr>
+      <w:rPr>
+        <w:rFonts w:ascii="Wingdings" w:hAnsi="Wingdings" w:hint="default"/>
+      </w:rPr>
+    </w:lvl>
+    <w:lvl w:ilvl="6" w:tplc="04090001" w:tentative="1">
+      <w:start w:val="1"/>
+      <w:numFmt w:val="bullet"/>
+      <w:lvlText w:val=""/>
+      <w:lvlJc w:val="left"/>
+      <w:pPr>
+        <w:ind w:left="5400" w:hanging="360"/>
+      </w:pPr>
+      <w:rPr>
+        <w:rFonts w:ascii="Symbol" w:hAnsi="Symbol" w:hint="default"/>
+      </w:rPr>
+    </w:lvl>
+    <w:lvl w:ilvl="7" w:tplc="04090003" w:tentative="1">
+      <w:start w:val="1"/>
+      <w:numFmt w:val="bullet"/>
+      <w:lvlText w:val="o"/>
+      <w:lvlJc w:val="left"/>
+      <w:pPr>
+        <w:ind w:left="6120" w:hanging="360"/>
+      </w:pPr>
+      <w:rPr>
+        <w:rFonts w:ascii="Courier New" w:hAnsi="Courier New" w:cs="Courier New" w:hint="default"/>
+      </w:rPr>
+    </w:lvl>
+    <w:lvl w:ilvl="8" w:tplc="04090005" w:tentative="1">
+      <w:start w:val="1"/>
+      <w:numFmt w:val="bullet"/>
+      <w:lvlText w:val=""/>
+      <w:lvlJc w:val="left"/>
+      <w:pPr>
+        <w:ind w:left="6840" w:hanging="360"/>
+      </w:pPr>
+      <w:rPr>
+        <w:rFonts w:ascii="Wingdings" w:hAnsi="Wingdings" w:hint="default"/>
+      </w:rPr>
+    </w:lvl>
+  </w:abstractNum>
+  <w:abstractNum w:abstractNumId="10" w15:restartNumberingAfterBreak="0">
+    <w:nsid w:val="39E67215"/>
+    <w:multiLevelType w:val="hybridMultilevel"/>
+    <w:tmpl w:val="AAA85C70"/>
+    <w:lvl w:ilvl="0" w:tplc="04090001">
+      <w:start w:val="1"/>
+      <w:numFmt w:val="bullet"/>
+      <w:lvlText w:val=""/>
+      <w:lvlJc w:val="left"/>
+      <w:pPr>
+        <w:ind w:left="1080" w:hanging="360"/>
+      </w:pPr>
+      <w:rPr>
+        <w:rFonts w:ascii="Symbol" w:hAnsi="Symbol" w:hint="default"/>
+      </w:rPr>
+    </w:lvl>
+    <w:lvl w:ilvl="1" w:tplc="04090003" w:tentative="1">
+      <w:start w:val="1"/>
+      <w:numFmt w:val="bullet"/>
+      <w:lvlText w:val="o"/>
+      <w:lvlJc w:val="left"/>
+      <w:pPr>
+        <w:ind w:left="1800" w:hanging="360"/>
+      </w:pPr>
+      <w:rPr>
+        <w:rFonts w:ascii="Courier New" w:hAnsi="Courier New" w:cs="Courier New" w:hint="default"/>
+      </w:rPr>
+    </w:lvl>
+    <w:lvl w:ilvl="2" w:tplc="04090005" w:tentative="1">
+      <w:start w:val="1"/>
+      <w:numFmt w:val="bullet"/>
+      <w:lvlText w:val=""/>
+      <w:lvlJc w:val="left"/>
+      <w:pPr>
+        <w:ind w:left="2520" w:hanging="360"/>
+      </w:pPr>
+      <w:rPr>
+        <w:rFonts w:ascii="Wingdings" w:hAnsi="Wingdings" w:hint="default"/>
+      </w:rPr>
+    </w:lvl>
+    <w:lvl w:ilvl="3" w:tplc="04090001" w:tentative="1">
+      <w:start w:val="1"/>
+      <w:numFmt w:val="bullet"/>
+      <w:lvlText w:val=""/>
+      <w:lvlJc w:val="left"/>
+      <w:pPr>
+        <w:ind w:left="3240" w:hanging="360"/>
+      </w:pPr>
+      <w:rPr>
+        <w:rFonts w:ascii="Symbol" w:hAnsi="Symbol" w:hint="default"/>
+      </w:rPr>
+    </w:lvl>
+    <w:lvl w:ilvl="4" w:tplc="04090003" w:tentative="1">
+      <w:start w:val="1"/>
+      <w:numFmt w:val="bullet"/>
+      <w:lvlText w:val="o"/>
+      <w:lvlJc w:val="left"/>
+      <w:pPr>
+        <w:ind w:left="3960" w:hanging="360"/>
+      </w:pPr>
+      <w:rPr>
+        <w:rFonts w:ascii="Courier New" w:hAnsi="Courier New" w:cs="Courier New" w:hint="default"/>
+      </w:rPr>
+    </w:lvl>
+    <w:lvl w:ilvl="5" w:tplc="04090005" w:tentative="1">
+      <w:start w:val="1"/>
+      <w:numFmt w:val="bullet"/>
+      <w:lvlText w:val=""/>
+      <w:lvlJc w:val="left"/>
+      <w:pPr>
+        <w:ind w:left="4680" w:hanging="360"/>
+      </w:pPr>
+      <w:rPr>
+        <w:rFonts w:ascii="Wingdings" w:hAnsi="Wingdings" w:hint="default"/>
+      </w:rPr>
+    </w:lvl>
+    <w:lvl w:ilvl="6" w:tplc="04090001" w:tentative="1">
+      <w:start w:val="1"/>
+      <w:numFmt w:val="bullet"/>
+      <w:lvlText w:val=""/>
+      <w:lvlJc w:val="left"/>
+      <w:pPr>
+        <w:ind w:left="5400" w:hanging="360"/>
+      </w:pPr>
+      <w:rPr>
+        <w:rFonts w:ascii="Symbol" w:hAnsi="Symbol" w:hint="default"/>
+      </w:rPr>
+    </w:lvl>
+    <w:lvl w:ilvl="7" w:tplc="04090003" w:tentative="1">
+      <w:start w:val="1"/>
+      <w:numFmt w:val="bullet"/>
+      <w:lvlText w:val="o"/>
+      <w:lvlJc w:val="left"/>
+      <w:pPr>
+        <w:ind w:left="6120" w:hanging="360"/>
+      </w:pPr>
+      <w:rPr>
+        <w:rFonts w:ascii="Courier New" w:hAnsi="Courier New" w:cs="Courier New" w:hint="default"/>
+      </w:rPr>
+    </w:lvl>
+    <w:lvl w:ilvl="8" w:tplc="04090005" w:tentative="1">
+      <w:start w:val="1"/>
+      <w:numFmt w:val="bullet"/>
+      <w:lvlText w:val=""/>
+      <w:lvlJc w:val="left"/>
+      <w:pPr>
+        <w:ind w:left="6840" w:hanging="360"/>
+      </w:pPr>
+      <w:rPr>
+        <w:rFonts w:ascii="Wingdings" w:hAnsi="Wingdings" w:hint="default"/>
+      </w:rPr>
+    </w:lvl>
+  </w:abstractNum>
+  <w:abstractNum w:abstractNumId="11" w15:restartNumberingAfterBreak="0">
+    <w:nsid w:val="49981B76"/>
+    <w:multiLevelType w:val="hybridMultilevel"/>
+    <w:tmpl w:val="5986C20A"/>
+    <w:lvl w:ilvl="0" w:tplc="04090001">
+      <w:start w:val="1"/>
+      <w:numFmt w:val="bullet"/>
+      <w:lvlText w:val=""/>
+      <w:lvlJc w:val="left"/>
+      <w:pPr>
+        <w:ind w:left="2190" w:hanging="360"/>
+      </w:pPr>
+      <w:rPr>
+        <w:rFonts w:ascii="Symbol" w:hAnsi="Symbol" w:hint="default"/>
+      </w:rPr>
+    </w:lvl>
+    <w:lvl w:ilvl="1" w:tplc="04090003" w:tentative="1">
+      <w:start w:val="1"/>
+      <w:numFmt w:val="bullet"/>
+      <w:lvlText w:val="o"/>
+      <w:lvlJc w:val="left"/>
+      <w:pPr>
+        <w:ind w:left="2910" w:hanging="360"/>
+      </w:pPr>
+      <w:rPr>
+        <w:rFonts w:ascii="Courier New" w:hAnsi="Courier New" w:cs="Courier New" w:hint="default"/>
+      </w:rPr>
+    </w:lvl>
+    <w:lvl w:ilvl="2" w:tplc="04090005" w:tentative="1">
+      <w:start w:val="1"/>
+      <w:numFmt w:val="bullet"/>
+      <w:lvlText w:val=""/>
+      <w:lvlJc w:val="left"/>
+      <w:pPr>
+        <w:ind w:left="3630" w:hanging="360"/>
+      </w:pPr>
+      <w:rPr>
+        <w:rFonts w:ascii="Wingdings" w:hAnsi="Wingdings" w:hint="default"/>
+      </w:rPr>
+    </w:lvl>
+    <w:lvl w:ilvl="3" w:tplc="04090001" w:tentative="1">
+      <w:start w:val="1"/>
+      <w:numFmt w:val="bullet"/>
+      <w:lvlText w:val=""/>
+      <w:lvlJc w:val="left"/>
+      <w:pPr>
+        <w:ind w:left="4350" w:hanging="360"/>
+      </w:pPr>
+      <w:rPr>
+        <w:rFonts w:ascii="Symbol" w:hAnsi="Symbol" w:hint="default"/>
+      </w:rPr>
+    </w:lvl>
+    <w:lvl w:ilvl="4" w:tplc="04090003" w:tentative="1">
+      <w:start w:val="1"/>
+      <w:numFmt w:val="bullet"/>
+      <w:lvlText w:val="o"/>
+      <w:lvlJc w:val="left"/>
+      <w:pPr>
+        <w:ind w:left="5070" w:hanging="360"/>
+      </w:pPr>
+      <w:rPr>
+        <w:rFonts w:ascii="Courier New" w:hAnsi="Courier New" w:cs="Courier New" w:hint="default"/>
+      </w:rPr>
+    </w:lvl>
+    <w:lvl w:ilvl="5" w:tplc="04090005" w:tentative="1">
+      <w:start w:val="1"/>
+      <w:numFmt w:val="bullet"/>
+      <w:lvlText w:val=""/>
+      <w:lvlJc w:val="left"/>
+      <w:pPr>
+        <w:ind w:left="5790" w:hanging="360"/>
+      </w:pPr>
+      <w:rPr>
+        <w:rFonts w:ascii="Wingdings" w:hAnsi="Wingdings" w:hint="default"/>
+      </w:rPr>
+    </w:lvl>
+    <w:lvl w:ilvl="6" w:tplc="04090001" w:tentative="1">
+      <w:start w:val="1"/>
+      <w:numFmt w:val="bullet"/>
+      <w:lvlText w:val=""/>
+      <w:lvlJc w:val="left"/>
+      <w:pPr>
+        <w:ind w:left="6510" w:hanging="360"/>
+      </w:pPr>
+      <w:rPr>
+        <w:rFonts w:ascii="Symbol" w:hAnsi="Symbol" w:hint="default"/>
+      </w:rPr>
+    </w:lvl>
+    <w:lvl w:ilvl="7" w:tplc="04090003" w:tentative="1">
+      <w:start w:val="1"/>
+      <w:numFmt w:val="bullet"/>
+      <w:lvlText w:val="o"/>
+      <w:lvlJc w:val="left"/>
+      <w:pPr>
+        <w:ind w:left="7230" w:hanging="360"/>
+      </w:pPr>
+      <w:rPr>
+        <w:rFonts w:ascii="Courier New" w:hAnsi="Courier New" w:cs="Courier New" w:hint="default"/>
+      </w:rPr>
+    </w:lvl>
+    <w:lvl w:ilvl="8" w:tplc="04090005" w:tentative="1">
+      <w:start w:val="1"/>
+      <w:numFmt w:val="bullet"/>
+      <w:lvlText w:val=""/>
+      <w:lvlJc w:val="left"/>
+      <w:pPr>
+        <w:ind w:left="7950" w:hanging="360"/>
+      </w:pPr>
+      <w:rPr>
+        <w:rFonts w:ascii="Wingdings" w:hAnsi="Wingdings" w:hint="default"/>
+      </w:rPr>
+    </w:lvl>
+  </w:abstractNum>
+  <w:abstractNum w:abstractNumId="12" w15:restartNumberingAfterBreak="0">
+    <w:nsid w:val="627D24F2"/>
+    <w:multiLevelType w:val="hybridMultilevel"/>
+    <w:tmpl w:val="18385CB0"/>
+    <w:lvl w:ilvl="0" w:tplc="04090001">
+      <w:start w:val="1"/>
+      <w:numFmt w:val="bullet"/>
+      <w:lvlText w:val=""/>
+      <w:lvlJc w:val="left"/>
+      <w:pPr>
+        <w:ind w:left="1080" w:hanging="360"/>
+      </w:pPr>
+      <w:rPr>
+        <w:rFonts w:ascii="Symbol" w:hAnsi="Symbol" w:hint="default"/>
+      </w:rPr>
+    </w:lvl>
+    <w:lvl w:ilvl="1" w:tplc="04090003" w:tentative="1">
+      <w:start w:val="1"/>
+      <w:numFmt w:val="bullet"/>
+      <w:lvlText w:val="o"/>
+      <w:lvlJc w:val="left"/>
+      <w:pPr>
+        <w:ind w:left="1800" w:hanging="360"/>
+      </w:pPr>
+      <w:rPr>
+        <w:rFonts w:ascii="Courier New" w:hAnsi="Courier New" w:cs="Courier New" w:hint="default"/>
+      </w:rPr>
+    </w:lvl>
+    <w:lvl w:ilvl="2" w:tplc="04090005" w:tentative="1">
+      <w:start w:val="1"/>
+      <w:numFmt w:val="bullet"/>
+      <w:lvlText w:val=""/>
+      <w:lvlJc w:val="left"/>
+      <w:pPr>
+        <w:ind w:left="2520" w:hanging="360"/>
+      </w:pPr>
+      <w:rPr>
+        <w:rFonts w:ascii="Wingdings" w:hAnsi="Wingdings" w:hint="default"/>
+      </w:rPr>
+    </w:lvl>
+    <w:lvl w:ilvl="3" w:tplc="04090001" w:tentative="1">
+      <w:start w:val="1"/>
+      <w:numFmt w:val="bullet"/>
+      <w:lvlText w:val=""/>
+      <w:lvlJc w:val="left"/>
+      <w:pPr>
+        <w:ind w:left="3240" w:hanging="360"/>
+      </w:pPr>
+      <w:rPr>
+        <w:rFonts w:ascii="Symbol" w:hAnsi="Symbol" w:hint="default"/>
+      </w:rPr>
+    </w:lvl>
+    <w:lvl w:ilvl="4" w:tplc="04090003" w:tentative="1">
+      <w:start w:val="1"/>
+      <w:numFmt w:val="bullet"/>
+      <w:lvlText w:val="o"/>
+      <w:lvlJc w:val="left"/>
+      <w:pPr>
+        <w:ind w:left="3960" w:hanging="360"/>
+      </w:pPr>
+      <w:rPr>
+        <w:rFonts w:ascii="Courier New" w:hAnsi="Courier New" w:cs="Courier New" w:hint="default"/>
+      </w:rPr>
+    </w:lvl>
+    <w:lvl w:ilvl="5" w:tplc="04090005" w:tentative="1">
+      <w:start w:val="1"/>
+      <w:numFmt w:val="bullet"/>
+      <w:lvlText w:val=""/>
+      <w:lvlJc w:val="left"/>
+      <w:pPr>
+        <w:ind w:left="4680" w:hanging="360"/>
+      </w:pPr>
+      <w:rPr>
+        <w:rFonts w:ascii="Wingdings" w:hAnsi="Wingdings" w:hint="default"/>
+      </w:rPr>
+    </w:lvl>
+    <w:lvl w:ilvl="6" w:tplc="04090001" w:tentative="1">
+      <w:start w:val="1"/>
+      <w:numFmt w:val="bullet"/>
+      <w:lvlText w:val=""/>
+      <w:lvlJc w:val="left"/>
+      <w:pPr>
+        <w:ind w:left="5400" w:hanging="360"/>
+      </w:pPr>
+      <w:rPr>
+        <w:rFonts w:ascii="Symbol" w:hAnsi="Symbol" w:hint="default"/>
+      </w:rPr>
+    </w:lvl>
+    <w:lvl w:ilvl="7" w:tplc="04090003" w:tentative="1">
+      <w:start w:val="1"/>
+      <w:numFmt w:val="bullet"/>
+      <w:lvlText w:val="o"/>
+      <w:lvlJc w:val="left"/>
+      <w:pPr>
+        <w:ind w:left="6120" w:hanging="360"/>
+      </w:pPr>
+      <w:rPr>
+        <w:rFonts w:ascii="Courier New" w:hAnsi="Courier New" w:cs="Courier New" w:hint="default"/>
+      </w:rPr>
+    </w:lvl>
+    <w:lvl w:ilvl="8" w:tplc="04090005" w:tentative="1">
+      <w:start w:val="1"/>
+      <w:numFmt w:val="bullet"/>
+      <w:lvlText w:val=""/>
+      <w:lvlJc w:val="left"/>
+      <w:pPr>
+        <w:ind w:left="6840" w:hanging="360"/>
+      </w:pPr>
+      <w:rPr>
+        <w:rFonts w:ascii="Wingdings" w:hAnsi="Wingdings" w:hint="default"/>
+      </w:rPr>
+    </w:lvl>
+  </w:abstractNum>
+  <w:abstractNum w:abstractNumId="13" w15:restartNumberingAfterBreak="0">
+    <w:nsid w:val="64210B60"/>
+    <w:multiLevelType w:val="hybridMultilevel"/>
+    <w:tmpl w:val="46ACB15A"/>
+    <w:lvl w:ilvl="0" w:tplc="04090001">
+      <w:start w:val="1"/>
+      <w:numFmt w:val="bullet"/>
+      <w:lvlText w:val=""/>
+      <w:lvlJc w:val="left"/>
+      <w:pPr>
+        <w:ind w:left="1080" w:hanging="360"/>
+      </w:pPr>
+      <w:rPr>
+        <w:rFonts w:ascii="Symbol" w:hAnsi="Symbol" w:hint="default"/>
+      </w:rPr>
+    </w:lvl>
+    <w:lvl w:ilvl="1" w:tplc="04090003" w:tentative="1">
+      <w:start w:val="1"/>
+      <w:numFmt w:val="bullet"/>
+      <w:lvlText w:val="o"/>
+      <w:lvlJc w:val="left"/>
+      <w:pPr>
+        <w:ind w:left="1800" w:hanging="360"/>
+      </w:pPr>
+      <w:rPr>
+        <w:rFonts w:ascii="Courier New" w:hAnsi="Courier New" w:cs="Courier New" w:hint="default"/>
+      </w:rPr>
+    </w:lvl>
+    <w:lvl w:ilvl="2" w:tplc="04090005" w:tentative="1">
+      <w:start w:val="1"/>
+      <w:numFmt w:val="bullet"/>
+      <w:lvlText w:val=""/>
+      <w:lvlJc w:val="left"/>
+      <w:pPr>
+        <w:ind w:left="2520" w:hanging="360"/>
+      </w:pPr>
+      <w:rPr>
+        <w:rFonts w:ascii="Wingdings" w:hAnsi="Wingdings" w:hint="default"/>
+      </w:rPr>
+    </w:lvl>
+    <w:lvl w:ilvl="3" w:tplc="04090001" w:tentative="1">
+      <w:start w:val="1"/>
+      <w:numFmt w:val="bullet"/>
+      <w:lvlText w:val=""/>
+      <w:lvlJc w:val="left"/>
+      <w:pPr>
+        <w:ind w:left="3240" w:hanging="360"/>
+      </w:pPr>
+      <w:rPr>
+        <w:rFonts w:ascii="Symbol" w:hAnsi="Symbol" w:hint="default"/>
+      </w:rPr>
+    </w:lvl>
+    <w:lvl w:ilvl="4" w:tplc="04090003" w:tentative="1">
+      <w:start w:val="1"/>
+      <w:numFmt w:val="bullet"/>
+      <w:lvlText w:val="o"/>
+      <w:lvlJc w:val="left"/>
+      <w:pPr>
+        <w:ind w:left="3960" w:hanging="360"/>
+      </w:pPr>
+      <w:rPr>
+        <w:rFonts w:ascii="Courier New" w:hAnsi="Courier New" w:cs="Courier New" w:hint="default"/>
+      </w:rPr>
+    </w:lvl>
+    <w:lvl w:ilvl="5" w:tplc="04090005" w:tentative="1">
+      <w:start w:val="1"/>
+      <w:numFmt w:val="bullet"/>
+      <w:lvlText w:val=""/>
+      <w:lvlJc w:val="left"/>
+      <w:pPr>
+        <w:ind w:left="4680" w:hanging="360"/>
+      </w:pPr>
+      <w:rPr>
+        <w:rFonts w:ascii="Wingdings" w:hAnsi="Wingdings" w:hint="default"/>
+      </w:rPr>
+    </w:lvl>
+    <w:lvl w:ilvl="6" w:tplc="04090001" w:tentative="1">
+      <w:start w:val="1"/>
+      <w:numFmt w:val="bullet"/>
+      <w:lvlText w:val=""/>
+      <w:lvlJc w:val="left"/>
+      <w:pPr>
+        <w:ind w:left="5400" w:hanging="360"/>
+      </w:pPr>
+      <w:rPr>
+        <w:rFonts w:ascii="Symbol" w:hAnsi="Symbol" w:hint="default"/>
+      </w:rPr>
+    </w:lvl>
+    <w:lvl w:ilvl="7" w:tplc="04090003" w:tentative="1">
+      <w:start w:val="1"/>
+      <w:numFmt w:val="bullet"/>
+      <w:lvlText w:val="o"/>
+      <w:lvlJc w:val="left"/>
+      <w:pPr>
+        <w:ind w:left="6120" w:hanging="360"/>
+      </w:pPr>
+      <w:rPr>
+        <w:rFonts w:ascii="Courier New" w:hAnsi="Courier New" w:cs="Courier New" w:hint="default"/>
+      </w:rPr>
+    </w:lvl>
+    <w:lvl w:ilvl="8" w:tplc="04090005" w:tentative="1">
+      <w:start w:val="1"/>
+      <w:numFmt w:val="bullet"/>
+      <w:lvlText w:val=""/>
+      <w:lvlJc w:val="left"/>
+      <w:pPr>
+        <w:ind w:left="6840" w:hanging="360"/>
+      </w:pPr>
+      <w:rPr>
+        <w:rFonts w:ascii="Wingdings" w:hAnsi="Wingdings" w:hint="default"/>
+      </w:rPr>
+    </w:lvl>
+  </w:abstractNum>
+  <w:abstractNum w:abstractNumId="14" w15:restartNumberingAfterBreak="0">
+    <w:nsid w:val="6472309F"/>
+    <w:multiLevelType w:val="hybridMultilevel"/>
+    <w:tmpl w:val="DDA6AB74"/>
+    <w:lvl w:ilvl="0" w:tplc="04090001">
+      <w:start w:val="1"/>
+      <w:numFmt w:val="bullet"/>
+      <w:lvlText w:val=""/>
+      <w:lvlJc w:val="left"/>
+      <w:pPr>
+        <w:ind w:left="1470" w:hanging="360"/>
+      </w:pPr>
+      <w:rPr>
+        <w:rFonts w:ascii="Symbol" w:hAnsi="Symbol" w:hint="default"/>
+      </w:rPr>
+    </w:lvl>
+    <w:lvl w:ilvl="1" w:tplc="04090003" w:tentative="1">
+      <w:start w:val="1"/>
+      <w:numFmt w:val="bullet"/>
+      <w:lvlText w:val="o"/>
+      <w:lvlJc w:val="left"/>
+      <w:pPr>
+        <w:ind w:left="2190" w:hanging="360"/>
+      </w:pPr>
+      <w:rPr>
+        <w:rFonts w:ascii="Courier New" w:hAnsi="Courier New" w:cs="Courier New" w:hint="default"/>
+      </w:rPr>
+    </w:lvl>
+    <w:lvl w:ilvl="2" w:tplc="04090005" w:tentative="1">
+      <w:start w:val="1"/>
+      <w:numFmt w:val="bullet"/>
+      <w:lvlText w:val=""/>
+      <w:lvlJc w:val="left"/>
+      <w:pPr>
+        <w:ind w:left="2910" w:hanging="360"/>
+      </w:pPr>
+      <w:rPr>
+        <w:rFonts w:ascii="Wingdings" w:hAnsi="Wingdings" w:hint="default"/>
+      </w:rPr>
+    </w:lvl>
+    <w:lvl w:ilvl="3" w:tplc="04090001" w:tentative="1">
+      <w:start w:val="1"/>
+      <w:numFmt w:val="bullet"/>
+      <w:lvlText w:val=""/>
+      <w:lvlJc w:val="left"/>
+      <w:pPr>
+        <w:ind w:left="3630" w:hanging="360"/>
+      </w:pPr>
+      <w:rPr>
+        <w:rFonts w:ascii="Symbol" w:hAnsi="Symbol" w:hint="default"/>
+      </w:rPr>
+    </w:lvl>
+    <w:lvl w:ilvl="4" w:tplc="04090003" w:tentative="1">
+      <w:start w:val="1"/>
+      <w:numFmt w:val="bullet"/>
+      <w:lvlText w:val="o"/>
+      <w:lvlJc w:val="left"/>
+      <w:pPr>
+        <w:ind w:left="4350" w:hanging="360"/>
+      </w:pPr>
+      <w:rPr>
+        <w:rFonts w:ascii="Courier New" w:hAnsi="Courier New" w:cs="Courier New" w:hint="default"/>
+      </w:rPr>
+    </w:lvl>
+    <w:lvl w:ilvl="5" w:tplc="04090005" w:tentative="1">
+      <w:start w:val="1"/>
+      <w:numFmt w:val="bullet"/>
+      <w:lvlText w:val=""/>
+      <w:lvlJc w:val="left"/>
+      <w:pPr>
+        <w:ind w:left="5070" w:hanging="360"/>
+      </w:pPr>
+      <w:rPr>
+        <w:rFonts w:ascii="Wingdings" w:hAnsi="Wingdings" w:hint="default"/>
+      </w:rPr>
+    </w:lvl>
+    <w:lvl w:ilvl="6" w:tplc="04090001" w:tentative="1">
+      <w:start w:val="1"/>
+      <w:numFmt w:val="bullet"/>
+      <w:lvlText w:val=""/>
+      <w:lvlJc w:val="left"/>
+      <w:pPr>
+        <w:ind w:left="5790" w:hanging="360"/>
+      </w:pPr>
+      <w:rPr>
+        <w:rFonts w:ascii="Symbol" w:hAnsi="Symbol" w:hint="default"/>
+      </w:rPr>
+    </w:lvl>
+    <w:lvl w:ilvl="7" w:tplc="04090003" w:tentative="1">
+      <w:start w:val="1"/>
+      <w:numFmt w:val="bullet"/>
+      <w:lvlText w:val="o"/>
+      <w:lvlJc w:val="left"/>
+      <w:pPr>
+        <w:ind w:left="6510" w:hanging="360"/>
+      </w:pPr>
+      <w:rPr>
+        <w:rFonts w:ascii="Courier New" w:hAnsi="Courier New" w:cs="Courier New" w:hint="default"/>
+      </w:rPr>
+    </w:lvl>
+    <w:lvl w:ilvl="8" w:tplc="04090005" w:tentative="1">
+      <w:start w:val="1"/>
+      <w:numFmt w:val="bullet"/>
+      <w:lvlText w:val=""/>
+      <w:lvlJc w:val="left"/>
+      <w:pPr>
+        <w:ind w:left="7230" w:hanging="360"/>
+      </w:pPr>
+      <w:rPr>
+        <w:rFonts w:ascii="Wingdings" w:hAnsi="Wingdings" w:hint="default"/>
+      </w:rPr>
+    </w:lvl>
+  </w:abstractNum>
+  <w:abstractNum w:abstractNumId="15" w15:restartNumberingAfterBreak="0">
+    <w:nsid w:val="66103E09"/>
+    <w:multiLevelType w:val="hybridMultilevel"/>
+    <w:tmpl w:val="34BA1A68"/>
+    <w:lvl w:ilvl="0" w:tplc="04090001">
+      <w:start w:val="1"/>
+      <w:numFmt w:val="bullet"/>
+      <w:lvlText w:val=""/>
+      <w:lvlJc w:val="left"/>
+      <w:pPr>
+        <w:ind w:left="1080" w:hanging="360"/>
+      </w:pPr>
+      <w:rPr>
+        <w:rFonts w:ascii="Symbol" w:hAnsi="Symbol" w:hint="default"/>
+      </w:rPr>
+    </w:lvl>
+    <w:lvl w:ilvl="1" w:tplc="04090003" w:tentative="1">
+      <w:start w:val="1"/>
+      <w:numFmt w:val="bullet"/>
+      <w:lvlText w:val="o"/>
+      <w:lvlJc w:val="left"/>
+      <w:pPr>
+        <w:ind w:left="1800" w:hanging="360"/>
+      </w:pPr>
+      <w:rPr>
+        <w:rFonts w:ascii="Courier New" w:hAnsi="Courier New" w:cs="Courier New" w:hint="default"/>
+      </w:rPr>
+    </w:lvl>
+    <w:lvl w:ilvl="2" w:tplc="04090005" w:tentative="1">
+      <w:start w:val="1"/>
+      <w:numFmt w:val="bullet"/>
+      <w:lvlText w:val=""/>
+      <w:lvlJc w:val="left"/>
+      <w:pPr>
+        <w:ind w:left="2520" w:hanging="360"/>
+      </w:pPr>
+      <w:rPr>
+        <w:rFonts w:ascii="Wingdings" w:hAnsi="Wingdings" w:hint="default"/>
+      </w:rPr>
+    </w:lvl>
+    <w:lvl w:ilvl="3" w:tplc="04090001" w:tentative="1">
+      <w:start w:val="1"/>
+      <w:numFmt w:val="bullet"/>
+      <w:lvlText w:val=""/>
+      <w:lvlJc w:val="left"/>
+      <w:pPr>
+        <w:ind w:left="3240" w:hanging="360"/>
+      </w:pPr>
+      <w:rPr>
+        <w:rFonts w:ascii="Symbol" w:hAnsi="Symbol" w:hint="default"/>
+      </w:rPr>
+    </w:lvl>
+    <w:lvl w:ilvl="4" w:tplc="04090003" w:tentative="1">
+      <w:start w:val="1"/>
+      <w:numFmt w:val="bullet"/>
+      <w:lvlText w:val="o"/>
+      <w:lvlJc w:val="left"/>
+      <w:pPr>
+        <w:ind w:left="3960" w:hanging="360"/>
+      </w:pPr>
+      <w:rPr>
+        <w:rFonts w:ascii="Courier New" w:hAnsi="Courier New" w:cs="Courier New" w:hint="default"/>
+      </w:rPr>
+    </w:lvl>
+    <w:lvl w:ilvl="5" w:tplc="04090005" w:tentative="1">
+      <w:start w:val="1"/>
+      <w:numFmt w:val="bullet"/>
+      <w:lvlText w:val=""/>
+      <w:lvlJc w:val="left"/>
+      <w:pPr>
+        <w:ind w:left="4680" w:hanging="360"/>
+      </w:pPr>
+      <w:rPr>
+        <w:rFonts w:ascii="Wingdings" w:hAnsi="Wingdings" w:hint="default"/>
+      </w:rPr>
+    </w:lvl>
+    <w:lvl w:ilvl="6" w:tplc="04090001" w:tentative="1">
+      <w:start w:val="1"/>
+      <w:numFmt w:val="bullet"/>
+      <w:lvlText w:val=""/>
+      <w:lvlJc w:val="left"/>
+      <w:pPr>
+        <w:ind w:left="5400" w:hanging="360"/>
+      </w:pPr>
+      <w:rPr>
+        <w:rFonts w:ascii="Symbol" w:hAnsi="Symbol" w:hint="default"/>
+      </w:rPr>
+    </w:lvl>
+    <w:lvl w:ilvl="7" w:tplc="04090003" w:tentative="1">
+      <w:start w:val="1"/>
+      <w:numFmt w:val="bullet"/>
+      <w:lvlText w:val="o"/>
+      <w:lvlJc w:val="left"/>
+      <w:pPr>
+        <w:ind w:left="6120" w:hanging="360"/>
+      </w:pPr>
+      <w:rPr>
+        <w:rFonts w:ascii="Courier New" w:hAnsi="Courier New" w:cs="Courier New" w:hint="default"/>
+      </w:rPr>
+    </w:lvl>
+    <w:lvl w:ilvl="8" w:tplc="04090005" w:tentative="1">
+      <w:start w:val="1"/>
+      <w:numFmt w:val="bullet"/>
+      <w:lvlText w:val=""/>
+      <w:lvlJc w:val="left"/>
+      <w:pPr>
+        <w:ind w:left="6840" w:hanging="360"/>
+      </w:pPr>
+      <w:rPr>
+        <w:rFonts w:ascii="Wingdings" w:hAnsi="Wingdings" w:hint="default"/>
+      </w:rPr>
+    </w:lvl>
+  </w:abstractNum>
+  <w:abstractNum w:abstractNumId="16" w15:restartNumberingAfterBreak="0">
+    <w:nsid w:val="705715C3"/>
+    <w:multiLevelType w:val="hybridMultilevel"/>
+    <w:tmpl w:val="3DF08A8E"/>
+    <w:lvl w:ilvl="0" w:tplc="04090001">
+      <w:start w:val="1"/>
+      <w:numFmt w:val="bullet"/>
+      <w:lvlText w:val=""/>
+      <w:lvlJc w:val="left"/>
+      <w:pPr>
+        <w:ind w:left="1080" w:hanging="360"/>
+      </w:pPr>
+      <w:rPr>
+        <w:rFonts w:ascii="Symbol" w:hAnsi="Symbol" w:hint="default"/>
+      </w:rPr>
+    </w:lvl>
+    <w:lvl w:ilvl="1" w:tplc="04090003" w:tentative="1">
+      <w:start w:val="1"/>
+      <w:numFmt w:val="bullet"/>
+      <w:lvlText w:val="o"/>
+      <w:lvlJc w:val="left"/>
+      <w:pPr>
+        <w:ind w:left="1800" w:hanging="360"/>
+      </w:pPr>
+      <w:rPr>
+        <w:rFonts w:ascii="Courier New" w:hAnsi="Courier New" w:cs="Courier New" w:hint="default"/>
+      </w:rPr>
+    </w:lvl>
+    <w:lvl w:ilvl="2" w:tplc="04090005" w:tentative="1">
+      <w:start w:val="1"/>
+      <w:numFmt w:val="bullet"/>
+      <w:lvlText w:val=""/>
+      <w:lvlJc w:val="left"/>
+      <w:pPr>
+        <w:ind w:left="2520" w:hanging="360"/>
+      </w:pPr>
+      <w:rPr>
+        <w:rFonts w:ascii="Wingdings" w:hAnsi="Wingdings" w:hint="default"/>
+      </w:rPr>
+    </w:lvl>
+    <w:lvl w:ilvl="3" w:tplc="04090001" w:tentative="1">
+      <w:start w:val="1"/>
+      <w:numFmt w:val="bullet"/>
+      <w:lvlText w:val=""/>
+      <w:lvlJc w:val="left"/>
+      <w:pPr>
+        <w:ind w:left="3240" w:hanging="360"/>
+      </w:pPr>
+      <w:rPr>
+        <w:rFonts w:ascii="Symbol" w:hAnsi="Symbol" w:hint="default"/>
+      </w:rPr>
+    </w:lvl>
+    <w:lvl w:ilvl="4" w:tplc="04090003" w:tentative="1">
+      <w:start w:val="1"/>
+      <w:numFmt w:val="bullet"/>
+      <w:lvlText w:val="o"/>
+      <w:lvlJc w:val="left"/>
+      <w:pPr>
+        <w:ind w:left="3960" w:hanging="360"/>
+      </w:pPr>
+      <w:rPr>
+        <w:rFonts w:ascii="Courier New" w:hAnsi="Courier New" w:cs="Courier New" w:hint="default"/>
+      </w:rPr>
+    </w:lvl>
+    <w:lvl w:ilvl="5" w:tplc="04090005" w:tentative="1">
+      <w:start w:val="1"/>
+      <w:numFmt w:val="bullet"/>
+      <w:lvlText w:val=""/>
+      <w:lvlJc w:val="left"/>
+      <w:pPr>
+        <w:ind w:left="4680" w:hanging="360"/>
+      </w:pPr>
+      <w:rPr>
+        <w:rFonts w:ascii="Wingdings" w:hAnsi="Wingdings" w:hint="default"/>
+      </w:rPr>
+    </w:lvl>
+    <w:lvl w:ilvl="6" w:tplc="04090001" w:tentative="1">
+      <w:start w:val="1"/>
+      <w:numFmt w:val="bullet"/>
+      <w:lvlText w:val=""/>
+      <w:lvlJc w:val="left"/>
+      <w:pPr>
+        <w:ind w:left="5400" w:hanging="360"/>
+      </w:pPr>
+      <w:rPr>
+        <w:rFonts w:ascii="Symbol" w:hAnsi="Symbol" w:hint="default"/>
+      </w:rPr>
+    </w:lvl>
+    <w:lvl w:ilvl="7" w:tplc="04090003" w:tentative="1">
+      <w:start w:val="1"/>
+      <w:numFmt w:val="bullet"/>
+      <w:lvlText w:val="o"/>
+      <w:lvlJc w:val="left"/>
+      <w:pPr>
+        <w:ind w:left="6120" w:hanging="360"/>
+      </w:pPr>
+      <w:rPr>
+        <w:rFonts w:ascii="Courier New" w:hAnsi="Courier New" w:cs="Courier New" w:hint="default"/>
+      </w:rPr>
+    </w:lvl>
+    <w:lvl w:ilvl="8" w:tplc="04090005" w:tentative="1">
+      <w:start w:val="1"/>
+      <w:numFmt w:val="bullet"/>
+      <w:lvlText w:val=""/>
+      <w:lvlJc w:val="left"/>
+      <w:pPr>
+        <w:ind w:left="6840" w:hanging="360"/>
+      </w:pPr>
+      <w:rPr>
+        <w:rFonts w:ascii="Wingdings" w:hAnsi="Wingdings" w:hint="default"/>
+      </w:rPr>
+    </w:lvl>
+  </w:abstractNum>
+  <w:abstractNum w:abstractNumId="17" w15:restartNumberingAfterBreak="0">
+    <w:nsid w:val="75CF4D9D"/>
+    <w:multiLevelType w:val="multilevel"/>
+    <w:tmpl w:val="E00A97A2"/>
+    <w:lvl w:ilvl="0">
+      <w:start w:val="1"/>
+      <w:numFmt w:val="decimal"/>
+      <w:lvlText w:val="%1."/>
+      <w:lvlJc w:val="left"/>
+      <w:pPr>
+        <w:ind w:left="720" w:hanging="360"/>
+      </w:pPr>
+      <w:rPr>
+        <w:rFonts w:hint="default"/>
+      </w:rPr>
+    </w:lvl>
+    <w:lvl w:ilvl="1">
+      <w:start w:val="1"/>
+      <w:numFmt w:val="decimal"/>
+      <w:isLgl/>
+      <w:lvlText w:val="%1.%2"/>
+      <w:lvlJc w:val="left"/>
+      <w:pPr>
+        <w:ind w:left="750" w:hanging="390"/>
+      </w:pPr>
+      <w:rPr>
+        <w:rFonts w:hint="default"/>
+      </w:rPr>
+    </w:lvl>
+    <w:lvl w:ilvl="2">
+      <w:start w:val="1"/>
+      <w:numFmt w:val="decimal"/>
+      <w:isLgl/>
+      <w:lvlText w:val="%1.%2.%3"/>
+      <w:lvlJc w:val="left"/>
+      <w:pPr>
+        <w:ind w:left="1080" w:hanging="720"/>
+      </w:pPr>
+      <w:rPr>
+        <w:rFonts w:hint="default"/>
+      </w:rPr>
+    </w:lvl>
+    <w:lvl w:ilvl="3">
+      <w:start w:val="1"/>
+      <w:numFmt w:val="decimal"/>
+      <w:isLgl/>
+      <w:lvlText w:val="%1.%2.%3.%4"/>
+      <w:lvlJc w:val="left"/>
+      <w:pPr>
+        <w:ind w:left="1080" w:hanging="720"/>
+      </w:pPr>
+      <w:rPr>
+        <w:rFonts w:hint="default"/>
+      </w:rPr>
+    </w:lvl>
+    <w:lvl w:ilvl="4">
+      <w:start w:val="1"/>
+      <w:numFmt w:val="decimal"/>
+      <w:isLgl/>
+      <w:lvlText w:val="%1.%2.%3.%4.%5"/>
+      <w:lvlJc w:val="left"/>
+      <w:pPr>
+        <w:ind w:left="1440" w:hanging="1080"/>
+      </w:pPr>
+      <w:rPr>
+        <w:rFonts w:hint="default"/>
+      </w:rPr>
+    </w:lvl>
+    <w:lvl w:ilvl="5">
+      <w:start w:val="1"/>
+      <w:numFmt w:val="decimal"/>
+      <w:isLgl/>
+      <w:lvlText w:val="%1.%2.%3.%4.%5.%6"/>
+      <w:lvlJc w:val="left"/>
+      <w:pPr>
+        <w:ind w:left="1440" w:hanging="1080"/>
+      </w:pPr>
+      <w:rPr>
+        <w:rFonts w:hint="default"/>
+      </w:rPr>
+    </w:lvl>
+    <w:lvl w:ilvl="6">
+      <w:start w:val="1"/>
+      <w:numFmt w:val="decimal"/>
+      <w:isLgl/>
+      <w:lvlText w:val="%1.%2.%3.%4.%5.%6.%7"/>
+      <w:lvlJc w:val="left"/>
+      <w:pPr>
+        <w:ind w:left="1800" w:hanging="1440"/>
+      </w:pPr>
+      <w:rPr>
+        <w:rFonts w:hint="default"/>
+      </w:rPr>
+    </w:lvl>
+    <w:lvl w:ilvl="7">
+      <w:start w:val="1"/>
+      <w:numFmt w:val="decimal"/>
+      <w:isLgl/>
+      <w:lvlText w:val="%1.%2.%3.%4.%5.%6.%7.%8"/>
+      <w:lvlJc w:val="left"/>
+      <w:pPr>
+        <w:ind w:left="1800" w:hanging="1440"/>
+      </w:pPr>
+      <w:rPr>
+        <w:rFonts w:hint="default"/>
+      </w:rPr>
+    </w:lvl>
+    <w:lvl w:ilvl="8">
+      <w:start w:val="1"/>
+      <w:numFmt w:val="decimal"/>
+      <w:isLgl/>
+      <w:lvlText w:val="%1.%2.%3.%4.%5.%6.%7.%8.%9"/>
+      <w:lvlJc w:val="left"/>
+      <w:pPr>
+        <w:ind w:left="1800" w:hanging="1440"/>
+      </w:pPr>
+      <w:rPr>
+        <w:rFonts w:hint="default"/>
+      </w:rPr>
+    </w:lvl>
+  </w:abstractNum>
+  <w:abstractNum w:abstractNumId="18" w15:restartNumberingAfterBreak="0">
+    <w:nsid w:val="7C8C6871"/>
+    <w:multiLevelType w:val="hybridMultilevel"/>
+    <w:tmpl w:val="13F63620"/>
+    <w:lvl w:ilvl="0" w:tplc="04090001">
+      <w:start w:val="1"/>
+      <w:numFmt w:val="bullet"/>
+      <w:lvlText w:val=""/>
+      <w:lvlJc w:val="left"/>
+      <w:pPr>
+        <w:ind w:left="1470" w:hanging="360"/>
+      </w:pPr>
+      <w:rPr>
+        <w:rFonts w:ascii="Symbol" w:hAnsi="Symbol" w:hint="default"/>
+      </w:rPr>
+    </w:lvl>
+    <w:lvl w:ilvl="1" w:tplc="04090003" w:tentative="1">
+      <w:start w:val="1"/>
+      <w:numFmt w:val="bullet"/>
+      <w:lvlText w:val="o"/>
+      <w:lvlJc w:val="left"/>
+      <w:pPr>
+        <w:ind w:left="2190" w:hanging="360"/>
+      </w:pPr>
+      <w:rPr>
+        <w:rFonts w:ascii="Courier New" w:hAnsi="Courier New" w:cs="Courier New" w:hint="default"/>
+      </w:rPr>
+    </w:lvl>
+    <w:lvl w:ilvl="2" w:tplc="04090005" w:tentative="1">
+      <w:start w:val="1"/>
+      <w:numFmt w:val="bullet"/>
+      <w:lvlText w:val=""/>
+      <w:lvlJc w:val="left"/>
+      <w:pPr>
+        <w:ind w:left="2910" w:hanging="360"/>
+      </w:pPr>
+      <w:rPr>
+        <w:rFonts w:ascii="Wingdings" w:hAnsi="Wingdings" w:hint="default"/>
+      </w:rPr>
+    </w:lvl>
+    <w:lvl w:ilvl="3" w:tplc="04090001" w:tentative="1">
+      <w:start w:val="1"/>
+      <w:numFmt w:val="bullet"/>
+      <w:lvlText w:val=""/>
+      <w:lvlJc w:val="left"/>
+      <w:pPr>
+        <w:ind w:left="3630" w:hanging="360"/>
+      </w:pPr>
+      <w:rPr>
+        <w:rFonts w:ascii="Symbol" w:hAnsi="Symbol" w:hint="default"/>
+      </w:rPr>
+    </w:lvl>
+    <w:lvl w:ilvl="4" w:tplc="04090003" w:tentative="1">
+      <w:start w:val="1"/>
+      <w:numFmt w:val="bullet"/>
+      <w:lvlText w:val="o"/>
+      <w:lvlJc w:val="left"/>
+      <w:pPr>
+        <w:ind w:left="4350" w:hanging="360"/>
+      </w:pPr>
+      <w:rPr>
+        <w:rFonts w:ascii="Courier New" w:hAnsi="Courier New" w:cs="Courier New" w:hint="default"/>
+      </w:rPr>
+    </w:lvl>
+    <w:lvl w:ilvl="5" w:tplc="04090005" w:tentative="1">
+      <w:start w:val="1"/>
+      <w:numFmt w:val="bullet"/>
+      <w:lvlText w:val=""/>
+      <w:lvlJc w:val="left"/>
+      <w:pPr>
+        <w:ind w:left="5070" w:hanging="360"/>
+      </w:pPr>
+      <w:rPr>
+        <w:rFonts w:ascii="Wingdings" w:hAnsi="Wingdings" w:hint="default"/>
+      </w:rPr>
+    </w:lvl>
+    <w:lvl w:ilvl="6" w:tplc="04090001" w:tentative="1">
+      <w:start w:val="1"/>
+      <w:numFmt w:val="bullet"/>
+      <w:lvlText w:val=""/>
+      <w:lvlJc w:val="left"/>
+      <w:pPr>
+        <w:ind w:left="5790" w:hanging="360"/>
+      </w:pPr>
+      <w:rPr>
+        <w:rFonts w:ascii="Symbol" w:hAnsi="Symbol" w:hint="default"/>
+      </w:rPr>
+    </w:lvl>
+    <w:lvl w:ilvl="7" w:tplc="04090003" w:tentative="1">
+      <w:start w:val="1"/>
+      <w:numFmt w:val="bullet"/>
+      <w:lvlText w:val="o"/>
+      <w:lvlJc w:val="left"/>
+      <w:pPr>
+        <w:ind w:left="6510" w:hanging="360"/>
+      </w:pPr>
+      <w:rPr>
+        <w:rFonts w:ascii="Courier New" w:hAnsi="Courier New" w:cs="Courier New" w:hint="default"/>
+      </w:rPr>
+    </w:lvl>
+    <w:lvl w:ilvl="8" w:tplc="04090005" w:tentative="1">
+      <w:start w:val="1"/>
+      <w:numFmt w:val="bullet"/>
+      <w:lvlText w:val=""/>
+      <w:lvlJc w:val="left"/>
+      <w:pPr>
+        <w:ind w:left="7230" w:hanging="360"/>
+      </w:pPr>
+      <w:rPr>
+        <w:rFonts w:ascii="Wingdings" w:hAnsi="Wingdings" w:hint="default"/>
+      </w:rPr>
+    </w:lvl>
+  </w:abstractNum>
+  <w:num w:numId="1">
+    <w:abstractNumId w:val="17"/>
+  </w:num>
+  <w:num w:numId="2">
+    <w:abstractNumId w:val="4"/>
+  </w:num>
+  <w:num w:numId="3">
+    <w:abstractNumId w:val="9"/>
+  </w:num>
+  <w:num w:numId="4">
+    <w:abstractNumId w:val="5"/>
+  </w:num>
+  <w:num w:numId="5">
+    <w:abstractNumId w:val="15"/>
+  </w:num>
+  <w:num w:numId="6">
+    <w:abstractNumId w:val="6"/>
+  </w:num>
+  <w:num w:numId="7">
+    <w:abstractNumId w:val="3"/>
+  </w:num>
+  <w:num w:numId="8">
+    <w:abstractNumId w:val="0"/>
+  </w:num>
+  <w:num w:numId="9">
+    <w:abstractNumId w:val="12"/>
+  </w:num>
+  <w:num w:numId="10">
+    <w:abstractNumId w:val="1"/>
+  </w:num>
+  <w:num w:numId="11">
+    <w:abstractNumId w:val="14"/>
+  </w:num>
+  <w:num w:numId="12">
+    <w:abstractNumId w:val="7"/>
+  </w:num>
+  <w:num w:numId="13">
+    <w:abstractNumId w:val="10"/>
+  </w:num>
+  <w:num w:numId="14">
+    <w:abstractNumId w:val="2"/>
+  </w:num>
+  <w:num w:numId="15">
+    <w:abstractNumId w:val="13"/>
+  </w:num>
+  <w:num w:numId="16">
+    <w:abstractNumId w:val="16"/>
+  </w:num>
+  <w:num w:numId="17">
+    <w:abstractNumId w:val="18"/>
+  </w:num>
+  <w:num w:numId="18">
+    <w:abstractNumId w:val="11"/>
+  </w:num>
+  <w:num w:numId="19">
+    <w:abstractNumId w:val="8"/>
+  </w:num>
+</w:numbering>
 </file>
 
 <file path=word/styles.xml><?xml version="1.0" encoding="utf-8"?>
@@ -592,7 +3999,7 @@
     <w:link w:val="Heading1Char"/>
     <w:uiPriority w:val="9"/>
     <w:qFormat/>
-    <w:rsid w:val="0022741C"/>
+    <w:rsid w:val="004C25B6"/>
     <w:pPr>
       <w:keepNext/>
       <w:keepLines/>
@@ -600,10 +4007,32 @@
       <w:outlineLvl w:val="0"/>
     </w:pPr>
     <w:rPr>
-      <w:rFonts w:asciiTheme="majorHAnsi" w:eastAsiaTheme="majorEastAsia" w:hAnsiTheme="majorHAnsi" w:cstheme="majorBidi"/>
+      <w:rFonts w:ascii="Georgia" w:eastAsiaTheme="majorEastAsia" w:hAnsi="Georgia" w:cstheme="majorBidi"/>
       <w:color w:val="2F5496" w:themeColor="accent1" w:themeShade="BF"/>
       <w:sz w:val="32"/>
       <w:szCs w:val="52"/>
+    </w:rPr>
+  </w:style>
+  <w:style w:type="paragraph" w:styleId="Heading2">
+    <w:name w:val="heading 2"/>
+    <w:basedOn w:val="Normal"/>
+    <w:next w:val="Normal"/>
+    <w:link w:val="Heading2Char"/>
+    <w:uiPriority w:val="9"/>
+    <w:unhideWhenUsed/>
+    <w:qFormat/>
+    <w:rsid w:val="00706B00"/>
+    <w:pPr>
+      <w:keepNext/>
+      <w:keepLines/>
+      <w:spacing w:before="40" w:after="0"/>
+      <w:outlineLvl w:val="1"/>
+    </w:pPr>
+    <w:rPr>
+      <w:rFonts w:ascii="Georgia" w:eastAsiaTheme="majorEastAsia" w:hAnsi="Georgia" w:cstheme="majorBidi"/>
+      <w:color w:val="2F5496" w:themeColor="accent1" w:themeShade="BF"/>
+      <w:sz w:val="26"/>
+      <w:szCs w:val="42"/>
     </w:rPr>
   </w:style>
   <w:style w:type="character" w:default="1" w:styleId="DefaultParagraphFont">
@@ -725,9 +4154,9 @@
     <w:basedOn w:val="DefaultParagraphFont"/>
     <w:link w:val="Heading1"/>
     <w:uiPriority w:val="9"/>
-    <w:rsid w:val="0022741C"/>
+    <w:rsid w:val="004C25B6"/>
     <w:rPr>
-      <w:rFonts w:asciiTheme="majorHAnsi" w:eastAsiaTheme="majorEastAsia" w:hAnsiTheme="majorHAnsi" w:cstheme="majorBidi"/>
+      <w:rFonts w:ascii="Georgia" w:eastAsiaTheme="majorEastAsia" w:hAnsi="Georgia" w:cstheme="majorBidi"/>
       <w:color w:val="2F5496" w:themeColor="accent1" w:themeShade="BF"/>
       <w:sz w:val="32"/>
       <w:szCs w:val="52"/>
@@ -756,6 +4185,82 @@
       <w:color w:val="605E5C"/>
       <w:shd w:val="clear" w:color="auto" w:fill="E1DFDD"/>
     </w:rPr>
+  </w:style>
+  <w:style w:type="paragraph" w:styleId="Subtitle">
+    <w:name w:val="Subtitle"/>
+    <w:basedOn w:val="Normal"/>
+    <w:next w:val="Normal"/>
+    <w:link w:val="SubtitleChar"/>
+    <w:uiPriority w:val="11"/>
+    <w:qFormat/>
+    <w:rsid w:val="002D704F"/>
+    <w:pPr>
+      <w:numPr>
+        <w:ilvl w:val="1"/>
+      </w:numPr>
+    </w:pPr>
+    <w:rPr>
+      <w:rFonts w:eastAsiaTheme="minorEastAsia" w:cstheme="minorBidi"/>
+      <w:color w:val="5A5A5A" w:themeColor="text1" w:themeTint="A5"/>
+      <w:spacing w:val="15"/>
+    </w:rPr>
+  </w:style>
+  <w:style w:type="character" w:customStyle="1" w:styleId="SubtitleChar">
+    <w:name w:val="Subtitle Char"/>
+    <w:basedOn w:val="DefaultParagraphFont"/>
+    <w:link w:val="Subtitle"/>
+    <w:uiPriority w:val="11"/>
+    <w:rsid w:val="002D704F"/>
+    <w:rPr>
+      <w:rFonts w:eastAsiaTheme="minorEastAsia"/>
+      <w:color w:val="5A5A5A" w:themeColor="text1" w:themeTint="A5"/>
+      <w:spacing w:val="15"/>
+      <w:lang w:val="en-AU"/>
+    </w:rPr>
+  </w:style>
+  <w:style w:type="paragraph" w:styleId="ListParagraph">
+    <w:name w:val="List Paragraph"/>
+    <w:basedOn w:val="Normal"/>
+    <w:uiPriority w:val="34"/>
+    <w:qFormat/>
+    <w:rsid w:val="004C25B6"/>
+    <w:pPr>
+      <w:ind w:left="720"/>
+      <w:contextualSpacing/>
+    </w:pPr>
+  </w:style>
+  <w:style w:type="character" w:customStyle="1" w:styleId="Heading2Char">
+    <w:name w:val="Heading 2 Char"/>
+    <w:basedOn w:val="DefaultParagraphFont"/>
+    <w:link w:val="Heading2"/>
+    <w:uiPriority w:val="9"/>
+    <w:rsid w:val="00706B00"/>
+    <w:rPr>
+      <w:rFonts w:ascii="Georgia" w:eastAsiaTheme="majorEastAsia" w:hAnsi="Georgia" w:cstheme="majorBidi"/>
+      <w:color w:val="2F5496" w:themeColor="accent1" w:themeShade="BF"/>
+      <w:sz w:val="26"/>
+      <w:szCs w:val="42"/>
+      <w:lang w:val="en-AU"/>
+    </w:rPr>
+  </w:style>
+  <w:style w:type="table" w:styleId="TableGrid">
+    <w:name w:val="Table Grid"/>
+    <w:basedOn w:val="TableNormal"/>
+    <w:uiPriority w:val="39"/>
+    <w:rsid w:val="00546EBE"/>
+    <w:pPr>
+      <w:spacing w:after="0" w:line="240" w:lineRule="auto"/>
+    </w:pPr>
+    <w:tblPr>
+      <w:tblBorders>
+        <w:top w:val="single" w:sz="4" w:space="0" w:color="auto"/>
+        <w:left w:val="single" w:sz="4" w:space="0" w:color="auto"/>
+        <w:bottom w:val="single" w:sz="4" w:space="0" w:color="auto"/>
+        <w:right w:val="single" w:sz="4" w:space="0" w:color="auto"/>
+        <w:insideH w:val="single" w:sz="4" w:space="0" w:color="auto"/>
+        <w:insideV w:val="single" w:sz="4" w:space="0" w:color="auto"/>
+      </w:tblBorders>
+    </w:tblPr>
   </w:style>
 </w:styles>
 </file>

</xml_diff>

<commit_message>
Add page number to the doc
</commit_message>
<xml_diff>
--- a/System Design Document.docx
+++ b/System Design Document.docx
@@ -104,8 +104,16 @@
         <w:rPr>
           <w:rFonts w:ascii="Georgia" w:hAnsi="Georgia"/>
         </w:rPr>
-        <w:t>Student Name: Kimchhay Leng</w:t>
-      </w:r>
+        <w:t xml:space="preserve">Student Name: Kimchhay </w:t>
+      </w:r>
+      <w:proofErr w:type="spellStart"/>
+      <w:r>
+        <w:rPr>
+          <w:rFonts w:ascii="Georgia" w:hAnsi="Georgia"/>
+        </w:rPr>
+        <w:t>Leng</w:t>
+      </w:r>
+      <w:proofErr w:type="spellEnd"/>
     </w:p>
     <w:p>
       <w:pPr>
@@ -307,11 +315,19 @@
           <w:rFonts w:ascii="Georgia" w:hAnsi="Georgia"/>
         </w:rPr>
       </w:pPr>
-      <w:r>
-        <w:rPr>
-          <w:rFonts w:ascii="Georgia" w:hAnsi="Georgia"/>
-        </w:rPr>
-        <w:t>CardHelper: shared utility functions used by card abilities.</w:t>
+      <w:proofErr w:type="spellStart"/>
+      <w:r>
+        <w:rPr>
+          <w:rFonts w:ascii="Georgia" w:hAnsi="Georgia"/>
+        </w:rPr>
+        <w:t>CardHelper</w:t>
+      </w:r>
+      <w:proofErr w:type="spellEnd"/>
+      <w:r>
+        <w:rPr>
+          <w:rFonts w:ascii="Georgia" w:hAnsi="Georgia"/>
+        </w:rPr>
+        <w:t>: shared utility functions used by card abilities.</w:t>
       </w:r>
     </w:p>
     <w:p>
@@ -438,7 +454,21 @@
         <w:rPr>
           <w:rFonts w:ascii="Georgia" w:hAnsi="Georgia"/>
         </w:rPr>
-        <w:t xml:space="preserve"> Game creates all 54 cards in createDeck() and is the only class that calls “</w:t>
+        <w:t xml:space="preserve"> Game creates all 54 cards in </w:t>
+      </w:r>
+      <w:proofErr w:type="spellStart"/>
+      <w:r>
+        <w:rPr>
+          <w:rFonts w:ascii="Georgia" w:hAnsi="Georgia"/>
+        </w:rPr>
+        <w:t>createDeck</w:t>
+      </w:r>
+      <w:proofErr w:type="spellEnd"/>
+      <w:r>
+        <w:rPr>
+          <w:rFonts w:ascii="Georgia" w:hAnsi="Georgia"/>
+        </w:rPr>
+        <w:t>() and is the only class that calls “</w:t>
       </w:r>
       <w:r>
         <w:rPr>
@@ -450,7 +480,21 @@
         <w:rPr>
           <w:rFonts w:ascii="Georgia" w:hAnsi="Georgia"/>
         </w:rPr>
-        <w:t>” on them. Cards live in _deck and _discard as CardCollection attributes. The * multiplicity reflects that the count varies as cards move around.</w:t>
+        <w:t xml:space="preserve">” on them. Cards live in _deck and _discard as </w:t>
+      </w:r>
+      <w:proofErr w:type="spellStart"/>
+      <w:r>
+        <w:rPr>
+          <w:rFonts w:ascii="Georgia" w:hAnsi="Georgia"/>
+        </w:rPr>
+        <w:t>CardCollection</w:t>
+      </w:r>
+      <w:proofErr w:type="spellEnd"/>
+      <w:r>
+        <w:rPr>
+          <w:rFonts w:ascii="Georgia" w:hAnsi="Georgia"/>
+        </w:rPr>
+        <w:t xml:space="preserve"> attributes. The * multiplicity reflects that the count varies as cards move around.</w:t>
       </w:r>
     </w:p>
     <w:p>
@@ -471,7 +515,21 @@
         <w:rPr>
           <w:rFonts w:ascii="Georgia" w:hAnsi="Georgia"/>
         </w:rPr>
-        <w:t xml:space="preserve"> Player holds card pointers in _playArea and _bank, but does not own them. Game owns all cards. </w:t>
+        <w:t xml:space="preserve"> Player holds card pointers in _</w:t>
+      </w:r>
+      <w:proofErr w:type="spellStart"/>
+      <w:r>
+        <w:rPr>
+          <w:rFonts w:ascii="Georgia" w:hAnsi="Georgia"/>
+        </w:rPr>
+        <w:t>playArea</w:t>
+      </w:r>
+      <w:proofErr w:type="spellEnd"/>
+      <w:r>
+        <w:rPr>
+          <w:rFonts w:ascii="Georgia" w:hAnsi="Georgia"/>
+        </w:rPr>
+        <w:t xml:space="preserve"> and _bank, but does not own them. Game owns all cards. </w:t>
       </w:r>
     </w:p>
     <w:p>
@@ -486,56 +544,222 @@
           <w:b/>
           <w:bCs/>
         </w:rPr>
-        <w:t>Card to CardType (dependency, 1 to 1):</w:t>
-      </w:r>
-      <w:r>
-        <w:rPr>
-          <w:rFonts w:ascii="Georgia" w:hAnsi="Georgia"/>
-        </w:rPr>
-        <w:t xml:space="preserve"> Card stores _cardType as an attribute and returns it from type(). The enum has no lifetime of its own, so it is a dependency rather than composition.</w:t>
-      </w:r>
-    </w:p>
-    <w:p>
-      <w:pPr>
-        <w:rPr>
-          <w:rFonts w:ascii="Georgia" w:hAnsi="Georgia"/>
-        </w:rPr>
-      </w:pPr>
+        <w:t xml:space="preserve">Card to </w:t>
+      </w:r>
+      <w:proofErr w:type="spellStart"/>
       <w:r>
         <w:rPr>
           <w:rFonts w:ascii="Georgia" w:hAnsi="Georgia"/>
           <w:b/>
           <w:bCs/>
         </w:rPr>
-        <w:t>Card to concrete card subclasses (inheritance):</w:t>
-      </w:r>
-      <w:r>
-        <w:rPr>
-          <w:rFonts w:ascii="Georgia" w:hAnsi="Georgia"/>
-        </w:rPr>
-        <w:t xml:space="preserve"> All 9 subclasses inherit from the abstract base class. ChestCard is the only one that overrides willAddToBank() in addition to str() and play().</w:t>
-      </w:r>
-    </w:p>
-    <w:p>
-      <w:pPr>
-        <w:rPr>
-          <w:rFonts w:ascii="Georgia" w:hAnsi="Georgia"/>
-        </w:rPr>
-      </w:pPr>
+        <w:t>CardType</w:t>
+      </w:r>
+      <w:proofErr w:type="spellEnd"/>
       <w:r>
         <w:rPr>
           <w:rFonts w:ascii="Georgia" w:hAnsi="Georgia"/>
           <w:b/>
           <w:bCs/>
         </w:rPr>
+        <w:t xml:space="preserve"> (dependency, 1 to 1):</w:t>
+      </w:r>
+      <w:r>
+        <w:rPr>
+          <w:rFonts w:ascii="Georgia" w:hAnsi="Georgia"/>
+        </w:rPr>
+        <w:t xml:space="preserve"> Card stores _</w:t>
+      </w:r>
+      <w:proofErr w:type="spellStart"/>
+      <w:r>
+        <w:rPr>
+          <w:rFonts w:ascii="Georgia" w:hAnsi="Georgia"/>
+        </w:rPr>
+        <w:t>cardType</w:t>
+      </w:r>
+      <w:proofErr w:type="spellEnd"/>
+      <w:r>
+        <w:rPr>
+          <w:rFonts w:ascii="Georgia" w:hAnsi="Georgia"/>
+        </w:rPr>
+        <w:t xml:space="preserve"> as an attribute and returns it from type(). The </w:t>
+      </w:r>
+      <w:proofErr w:type="spellStart"/>
+      <w:r>
+        <w:rPr>
+          <w:rFonts w:ascii="Georgia" w:hAnsi="Georgia"/>
+        </w:rPr>
+        <w:t>enum</w:t>
+      </w:r>
+      <w:proofErr w:type="spellEnd"/>
+      <w:r>
+        <w:rPr>
+          <w:rFonts w:ascii="Georgia" w:hAnsi="Georgia"/>
+        </w:rPr>
+        <w:t xml:space="preserve"> has no lifetime of its own, so it is a dependency rather than composition.</w:t>
+      </w:r>
+    </w:p>
+    <w:p>
+      <w:pPr>
+        <w:rPr>
+          <w:rFonts w:ascii="Georgia" w:hAnsi="Georgia"/>
+        </w:rPr>
+      </w:pPr>
+      <w:r>
+        <w:rPr>
+          <w:rFonts w:ascii="Georgia" w:hAnsi="Georgia"/>
+          <w:b/>
+          <w:bCs/>
+        </w:rPr>
+        <w:t>Card to concrete card subclasses (inheritance):</w:t>
+      </w:r>
+      <w:r>
+        <w:rPr>
+          <w:rFonts w:ascii="Georgia" w:hAnsi="Georgia"/>
+        </w:rPr>
+        <w:t xml:space="preserve"> All 9 subclasses inherit from the abstract base class. </w:t>
+      </w:r>
+      <w:proofErr w:type="spellStart"/>
+      <w:r>
+        <w:rPr>
+          <w:rFonts w:ascii="Georgia" w:hAnsi="Georgia"/>
+        </w:rPr>
+        <w:t>ChestCard</w:t>
+      </w:r>
+      <w:proofErr w:type="spellEnd"/>
+      <w:r>
+        <w:rPr>
+          <w:rFonts w:ascii="Georgia" w:hAnsi="Georgia"/>
+        </w:rPr>
+        <w:t xml:space="preserve"> is the only one that overrides </w:t>
+      </w:r>
+      <w:proofErr w:type="spellStart"/>
+      <w:r>
+        <w:rPr>
+          <w:rFonts w:ascii="Georgia" w:hAnsi="Georgia"/>
+        </w:rPr>
+        <w:t>willAddToBank</w:t>
+      </w:r>
+      <w:proofErr w:type="spellEnd"/>
+      <w:r>
+        <w:rPr>
+          <w:rFonts w:ascii="Georgia" w:hAnsi="Georgia"/>
+        </w:rPr>
+        <w:t>() in addition to str() and play().</w:t>
+      </w:r>
+    </w:p>
+    <w:p>
+      <w:pPr>
+        <w:rPr>
+          <w:rFonts w:ascii="Georgia" w:hAnsi="Georgia"/>
+        </w:rPr>
+      </w:pPr>
+      <w:proofErr w:type="spellStart"/>
+      <w:r>
+        <w:rPr>
+          <w:rFonts w:ascii="Georgia" w:hAnsi="Georgia"/>
+          <w:b/>
+          <w:bCs/>
+        </w:rPr>
         <w:lastRenderedPageBreak/>
-        <w:t>CannonCard, SwordCard, HookCard to CardHelper (dependency):</w:t>
-      </w:r>
-      <w:r>
-        <w:rPr>
-          <w:rFonts w:ascii="Georgia" w:hAnsi="Georgia"/>
-        </w:rPr>
-        <w:t xml:space="preserve"> These three classes depend on the selectSuit() and removeTopCard() methods.</w:t>
+        <w:t>CannonCard</w:t>
+      </w:r>
+      <w:proofErr w:type="spellEnd"/>
+      <w:r>
+        <w:rPr>
+          <w:rFonts w:ascii="Georgia" w:hAnsi="Georgia"/>
+          <w:b/>
+          <w:bCs/>
+        </w:rPr>
+        <w:t xml:space="preserve">, </w:t>
+      </w:r>
+      <w:proofErr w:type="spellStart"/>
+      <w:r>
+        <w:rPr>
+          <w:rFonts w:ascii="Georgia" w:hAnsi="Georgia"/>
+          <w:b/>
+          <w:bCs/>
+        </w:rPr>
+        <w:t>SwordCard</w:t>
+      </w:r>
+      <w:proofErr w:type="spellEnd"/>
+      <w:r>
+        <w:rPr>
+          <w:rFonts w:ascii="Georgia" w:hAnsi="Georgia"/>
+          <w:b/>
+          <w:bCs/>
+        </w:rPr>
+        <w:t xml:space="preserve">, </w:t>
+      </w:r>
+      <w:proofErr w:type="spellStart"/>
+      <w:r>
+        <w:rPr>
+          <w:rFonts w:ascii="Georgia" w:hAnsi="Georgia"/>
+          <w:b/>
+          <w:bCs/>
+        </w:rPr>
+        <w:t>HookCard</w:t>
+      </w:r>
+      <w:proofErr w:type="spellEnd"/>
+      <w:r>
+        <w:rPr>
+          <w:rFonts w:ascii="Georgia" w:hAnsi="Georgia"/>
+          <w:b/>
+          <w:bCs/>
+        </w:rPr>
+        <w:t xml:space="preserve"> to </w:t>
+      </w:r>
+      <w:proofErr w:type="spellStart"/>
+      <w:r>
+        <w:rPr>
+          <w:rFonts w:ascii="Georgia" w:hAnsi="Georgia"/>
+          <w:b/>
+          <w:bCs/>
+        </w:rPr>
+        <w:t>CardHelper</w:t>
+      </w:r>
+      <w:proofErr w:type="spellEnd"/>
+      <w:r>
+        <w:rPr>
+          <w:rFonts w:ascii="Georgia" w:hAnsi="Georgia"/>
+          <w:b/>
+          <w:bCs/>
+        </w:rPr>
+        <w:t xml:space="preserve"> (dependency):</w:t>
+      </w:r>
+      <w:r>
+        <w:rPr>
+          <w:rFonts w:ascii="Georgia" w:hAnsi="Georgia"/>
+        </w:rPr>
+        <w:t xml:space="preserve"> These three classes depend on the </w:t>
+      </w:r>
+      <w:proofErr w:type="spellStart"/>
+      <w:r>
+        <w:rPr>
+          <w:rFonts w:ascii="Georgia" w:hAnsi="Georgia"/>
+        </w:rPr>
+        <w:t>selectSuit</w:t>
+      </w:r>
+      <w:proofErr w:type="spellEnd"/>
+      <w:r>
+        <w:rPr>
+          <w:rFonts w:ascii="Georgia" w:hAnsi="Georgia"/>
+        </w:rPr>
+        <w:t xml:space="preserve">() and </w:t>
+      </w:r>
+      <w:proofErr w:type="spellStart"/>
+      <w:r>
+        <w:rPr>
+          <w:rFonts w:ascii="Georgia" w:hAnsi="Georgia"/>
+        </w:rPr>
+        <w:t>removeTopCard</w:t>
+      </w:r>
+      <w:proofErr w:type="spellEnd"/>
+      <w:r>
+        <w:rPr>
+          <w:rFonts w:ascii="Georgia" w:hAnsi="Georgia"/>
+        </w:rPr>
+        <w:t>() methods.</w:t>
       </w:r>
     </w:p>
     <w:p>
@@ -574,7 +798,35 @@
         <w:rPr>
           <w:rFonts w:ascii="Georgia" w:hAnsi="Georgia"/>
         </w:rPr>
-        <w:t>str() and play() are declared as pure virtual (=0), which means Card cannot be instantiated directly and only concrete subclasses, such as CannonCard or MermaidCard can be created.</w:t>
+        <w:t xml:space="preserve">str() and play() are declared as pure virtual (=0), which means Card cannot be instantiated directly and only concrete subclasses, such as </w:t>
+      </w:r>
+      <w:proofErr w:type="spellStart"/>
+      <w:r>
+        <w:rPr>
+          <w:rFonts w:ascii="Georgia" w:hAnsi="Georgia"/>
+        </w:rPr>
+        <w:t>CannonCard</w:t>
+      </w:r>
+      <w:proofErr w:type="spellEnd"/>
+      <w:r>
+        <w:rPr>
+          <w:rFonts w:ascii="Georgia" w:hAnsi="Georgia"/>
+        </w:rPr>
+        <w:t xml:space="preserve"> or </w:t>
+      </w:r>
+      <w:proofErr w:type="spellStart"/>
+      <w:r>
+        <w:rPr>
+          <w:rFonts w:ascii="Georgia" w:hAnsi="Georgia"/>
+        </w:rPr>
+        <w:t>MermaidCard</w:t>
+      </w:r>
+      <w:proofErr w:type="spellEnd"/>
+      <w:r>
+        <w:rPr>
+          <w:rFonts w:ascii="Georgia" w:hAnsi="Georgia"/>
+        </w:rPr>
+        <w:t xml:space="preserve"> can be created.</w:t>
       </w:r>
     </w:p>
     <w:p>
@@ -709,7 +961,21 @@
         <w:rPr>
           <w:rFonts w:ascii="Georgia" w:hAnsi="Georgia"/>
         </w:rPr>
-        <w:t>All 54 cards are created with new inside Game::createDeck() and stored in _deck</w:t>
+        <w:t>All 54 cards are created with new inside Game::</w:t>
+      </w:r>
+      <w:proofErr w:type="spellStart"/>
+      <w:r>
+        <w:rPr>
+          <w:rFonts w:ascii="Georgia" w:hAnsi="Georgia"/>
+        </w:rPr>
+        <w:t>createDeck</w:t>
+      </w:r>
+      <w:proofErr w:type="spellEnd"/>
+      <w:r>
+        <w:rPr>
+          <w:rFonts w:ascii="Georgia" w:hAnsi="Georgia"/>
+        </w:rPr>
+        <w:t>() and stored in _deck</w:t>
       </w:r>
     </w:p>
     <w:p>
@@ -780,8 +1046,13 @@
           <w:numId w:val="1"/>
         </w:numPr>
       </w:pPr>
-      <w:r>
-        <w:t>willAddToBank() exists as a separate virtual  method</w:t>
+      <w:proofErr w:type="spellStart"/>
+      <w:r>
+        <w:t>willAddToBank</w:t>
+      </w:r>
+      <w:proofErr w:type="spellEnd"/>
+      <w:r>
+        <w:t>() exists as a separate virtual  method</w:t>
       </w:r>
     </w:p>
     <w:p>
@@ -811,7 +1082,49 @@
         <w:rPr>
           <w:rFonts w:ascii="Georgia" w:hAnsi="Georgia"/>
         </w:rPr>
-        <w:t>Rather than adding special-case logic to Game or Player (e.g. ‘If this is a ChestCard and there is a KeyCard…’, a separate virtual method willAddToBank() is defined on Card.</w:t>
+        <w:t xml:space="preserve">Rather than adding special-case logic to Game or Player (e.g. ‘If this is a </w:t>
+      </w:r>
+      <w:proofErr w:type="spellStart"/>
+      <w:r>
+        <w:rPr>
+          <w:rFonts w:ascii="Georgia" w:hAnsi="Georgia"/>
+        </w:rPr>
+        <w:t>ChestCard</w:t>
+      </w:r>
+      <w:proofErr w:type="spellEnd"/>
+      <w:r>
+        <w:rPr>
+          <w:rFonts w:ascii="Georgia" w:hAnsi="Georgia"/>
+        </w:rPr>
+        <w:t xml:space="preserve"> and there is a </w:t>
+      </w:r>
+      <w:proofErr w:type="spellStart"/>
+      <w:r>
+        <w:rPr>
+          <w:rFonts w:ascii="Georgia" w:hAnsi="Georgia"/>
+        </w:rPr>
+        <w:t>KeyCard</w:t>
+      </w:r>
+      <w:proofErr w:type="spellEnd"/>
+      <w:r>
+        <w:rPr>
+          <w:rFonts w:ascii="Georgia" w:hAnsi="Georgia"/>
+        </w:rPr>
+        <w:t xml:space="preserve">…’, a separate virtual method </w:t>
+      </w:r>
+      <w:proofErr w:type="spellStart"/>
+      <w:r>
+        <w:rPr>
+          <w:rFonts w:ascii="Georgia" w:hAnsi="Georgia"/>
+        </w:rPr>
+        <w:t>willAddToBank</w:t>
+      </w:r>
+      <w:proofErr w:type="spellEnd"/>
+      <w:r>
+        <w:rPr>
+          <w:rFonts w:ascii="Georgia" w:hAnsi="Georgia"/>
+        </w:rPr>
+        <w:t>() is defined on Card.</w:t>
       </w:r>
     </w:p>
     <w:p>
@@ -841,7 +1154,21 @@
         <w:rPr>
           <w:rFonts w:ascii="Georgia" w:hAnsi="Georgia"/>
         </w:rPr>
-        <w:t>Only ChestCard overrides it to detect a Key in the play area and draw bonus cards.</w:t>
+        <w:t xml:space="preserve">Only </w:t>
+      </w:r>
+      <w:proofErr w:type="spellStart"/>
+      <w:r>
+        <w:rPr>
+          <w:rFonts w:ascii="Georgia" w:hAnsi="Georgia"/>
+        </w:rPr>
+        <w:t>ChestCard</w:t>
+      </w:r>
+      <w:proofErr w:type="spellEnd"/>
+      <w:r>
+        <w:rPr>
+          <w:rFonts w:ascii="Georgia" w:hAnsi="Georgia"/>
+        </w:rPr>
+        <w:t xml:space="preserve"> overrides it to detect a Key in the play area and draw bonus cards.</w:t>
       </w:r>
     </w:p>
     <w:p>
@@ -856,7 +1183,35 @@
         <w:rPr>
           <w:rFonts w:ascii="Georgia" w:hAnsi="Georgia"/>
         </w:rPr>
-        <w:t>Player::bankCard() calls willAddToBank() on every card uniformly. It does not need to know which cards respond to it.</w:t>
+        <w:t>Player::</w:t>
+      </w:r>
+      <w:proofErr w:type="spellStart"/>
+      <w:r>
+        <w:rPr>
+          <w:rFonts w:ascii="Georgia" w:hAnsi="Georgia"/>
+        </w:rPr>
+        <w:t>bankCard</w:t>
+      </w:r>
+      <w:proofErr w:type="spellEnd"/>
+      <w:r>
+        <w:rPr>
+          <w:rFonts w:ascii="Georgia" w:hAnsi="Georgia"/>
+        </w:rPr>
+        <w:t xml:space="preserve">() calls </w:t>
+      </w:r>
+      <w:proofErr w:type="spellStart"/>
+      <w:r>
+        <w:rPr>
+          <w:rFonts w:ascii="Georgia" w:hAnsi="Georgia"/>
+        </w:rPr>
+        <w:t>willAddToBank</w:t>
+      </w:r>
+      <w:proofErr w:type="spellEnd"/>
+      <w:r>
+        <w:rPr>
+          <w:rFonts w:ascii="Georgia" w:hAnsi="Georgia"/>
+        </w:rPr>
+        <w:t>() on every card uniformly. It does not need to know which cards respond to it.</w:t>
       </w:r>
     </w:p>
     <w:p>
@@ -869,7 +1224,15 @@
       </w:pPr>
       <w:r>
         <w:lastRenderedPageBreak/>
-        <w:t>_bustedThisTurn flag on Player</w:t>
+        <w:t>_</w:t>
+      </w:r>
+      <w:proofErr w:type="spellStart"/>
+      <w:r>
+        <w:t>bustedThisTurn</w:t>
+      </w:r>
+      <w:proofErr w:type="spellEnd"/>
+      <w:r>
+        <w:t xml:space="preserve"> flag on Player</w:t>
       </w:r>
     </w:p>
     <w:p>
@@ -884,7 +1247,21 @@
         <w:rPr>
           <w:rFonts w:ascii="Georgia" w:hAnsi="Georgia"/>
         </w:rPr>
-        <w:t>Without this flag, busts caused inside card abilities (Kraken, Sword, Hook) were invisible to Game::runTurn().</w:t>
+        <w:t>Without this flag, busts caused inside card abilities (Kraken, Sword, Hook) were invisible to Game::</w:t>
+      </w:r>
+      <w:proofErr w:type="spellStart"/>
+      <w:r>
+        <w:rPr>
+          <w:rFonts w:ascii="Georgia" w:hAnsi="Georgia"/>
+        </w:rPr>
+        <w:t>runTurn</w:t>
+      </w:r>
+      <w:proofErr w:type="spellEnd"/>
+      <w:r>
+        <w:rPr>
+          <w:rFonts w:ascii="Georgia" w:hAnsi="Georgia"/>
+        </w:rPr>
+        <w:t>().</w:t>
       </w:r>
     </w:p>
     <w:p>
@@ -899,7 +1276,49 @@
         <w:rPr>
           <w:rFonts w:ascii="Georgia" w:hAnsi="Georgia"/>
         </w:rPr>
-        <w:t>When Kraken’s play() calls player.playCard() and causes a bust internally, bustDiscard() fires inside the card ability and sets _bustedThisTurn = true.</w:t>
+        <w:t xml:space="preserve">When Kraken’s play() calls </w:t>
+      </w:r>
+      <w:proofErr w:type="spellStart"/>
+      <w:r>
+        <w:rPr>
+          <w:rFonts w:ascii="Georgia" w:hAnsi="Georgia"/>
+        </w:rPr>
+        <w:t>player.playCard</w:t>
+      </w:r>
+      <w:proofErr w:type="spellEnd"/>
+      <w:r>
+        <w:rPr>
+          <w:rFonts w:ascii="Georgia" w:hAnsi="Georgia"/>
+        </w:rPr>
+        <w:t xml:space="preserve">() and causes a bust internally, </w:t>
+      </w:r>
+      <w:proofErr w:type="spellStart"/>
+      <w:r>
+        <w:rPr>
+          <w:rFonts w:ascii="Georgia" w:hAnsi="Georgia"/>
+        </w:rPr>
+        <w:t>bustDiscard</w:t>
+      </w:r>
+      <w:proofErr w:type="spellEnd"/>
+      <w:r>
+        <w:rPr>
+          <w:rFonts w:ascii="Georgia" w:hAnsi="Georgia"/>
+        </w:rPr>
+        <w:t>() fires inside the card ability and sets _</w:t>
+      </w:r>
+      <w:proofErr w:type="spellStart"/>
+      <w:r>
+        <w:rPr>
+          <w:rFonts w:ascii="Georgia" w:hAnsi="Georgia"/>
+        </w:rPr>
+        <w:t>bustedThisTurn</w:t>
+      </w:r>
+      <w:proofErr w:type="spellEnd"/>
+      <w:r>
+        <w:rPr>
+          <w:rFonts w:ascii="Georgia" w:hAnsi="Georgia"/>
+        </w:rPr>
+        <w:t xml:space="preserve"> = true.</w:t>
       </w:r>
     </w:p>
     <w:p>
@@ -910,11 +1329,47 @@
           <w:numId w:val="10"/>
         </w:numPr>
       </w:pPr>
-      <w:r>
-        <w:rPr>
-          <w:rFonts w:ascii="Georgia" w:hAnsi="Georgia"/>
-        </w:rPr>
-        <w:t>runTurn() then checks hasBustedThisTurn() after the card ability returns, and ends the turn correctly without calling bustDiscard() a second time.</w:t>
+      <w:proofErr w:type="spellStart"/>
+      <w:r>
+        <w:rPr>
+          <w:rFonts w:ascii="Georgia" w:hAnsi="Georgia"/>
+        </w:rPr>
+        <w:t>runTurn</w:t>
+      </w:r>
+      <w:proofErr w:type="spellEnd"/>
+      <w:r>
+        <w:rPr>
+          <w:rFonts w:ascii="Georgia" w:hAnsi="Georgia"/>
+        </w:rPr>
+        <w:t xml:space="preserve">() then checks </w:t>
+      </w:r>
+      <w:proofErr w:type="spellStart"/>
+      <w:r>
+        <w:rPr>
+          <w:rFonts w:ascii="Georgia" w:hAnsi="Georgia"/>
+        </w:rPr>
+        <w:t>hasBustedThisTurn</w:t>
+      </w:r>
+      <w:proofErr w:type="spellEnd"/>
+      <w:r>
+        <w:rPr>
+          <w:rFonts w:ascii="Georgia" w:hAnsi="Georgia"/>
+        </w:rPr>
+        <w:t xml:space="preserve">() after the card ability returns, and ends the turn correctly without calling </w:t>
+      </w:r>
+      <w:proofErr w:type="spellStart"/>
+      <w:r>
+        <w:rPr>
+          <w:rFonts w:ascii="Georgia" w:hAnsi="Georgia"/>
+        </w:rPr>
+        <w:t>bustDiscard</w:t>
+      </w:r>
+      <w:proofErr w:type="spellEnd"/>
+      <w:r>
+        <w:rPr>
+          <w:rFonts w:ascii="Georgia" w:hAnsi="Georgia"/>
+        </w:rPr>
+        <w:t>() a second time.</w:t>
       </w:r>
     </w:p>
     <w:p>
@@ -929,7 +1384,35 @@
         <w:rPr>
           <w:rFonts w:ascii="Georgia" w:hAnsi="Georgia"/>
         </w:rPr>
-        <w:t>The flag is reset at the start of every turn via resetBust(), called in Game::runTurn() before the draw loop begins.</w:t>
+        <w:t xml:space="preserve">The flag is reset at the start of every turn via </w:t>
+      </w:r>
+      <w:proofErr w:type="spellStart"/>
+      <w:r>
+        <w:rPr>
+          <w:rFonts w:ascii="Georgia" w:hAnsi="Georgia"/>
+        </w:rPr>
+        <w:t>resetBust</w:t>
+      </w:r>
+      <w:proofErr w:type="spellEnd"/>
+      <w:r>
+        <w:rPr>
+          <w:rFonts w:ascii="Georgia" w:hAnsi="Georgia"/>
+        </w:rPr>
+        <w:t>(), called in Game::</w:t>
+      </w:r>
+      <w:proofErr w:type="spellStart"/>
+      <w:r>
+        <w:rPr>
+          <w:rFonts w:ascii="Georgia" w:hAnsi="Georgia"/>
+        </w:rPr>
+        <w:t>runTurn</w:t>
+      </w:r>
+      <w:proofErr w:type="spellEnd"/>
+      <w:r>
+        <w:rPr>
+          <w:rFonts w:ascii="Georgia" w:hAnsi="Georgia"/>
+        </w:rPr>
+        <w:t>() before the draw loop begins.</w:t>
       </w:r>
     </w:p>
     <w:p>
@@ -941,7 +1424,15 @@
         </w:numPr>
       </w:pPr>
       <w:r>
-        <w:t xml:space="preserve"> CardHelper contains shared free functions, not a class</w:t>
+        <w:t xml:space="preserve"> </w:t>
+      </w:r>
+      <w:proofErr w:type="spellStart"/>
+      <w:r>
+        <w:t>CardHelper</w:t>
+      </w:r>
+      <w:proofErr w:type="spellEnd"/>
+      <w:r>
+        <w:t xml:space="preserve"> contains shared free functions, not a class</w:t>
       </w:r>
     </w:p>
     <w:p>
@@ -952,11 +1443,75 @@
           <w:numId w:val="12"/>
         </w:numPr>
       </w:pPr>
-      <w:r>
-        <w:rPr>
-          <w:rFonts w:ascii="Georgia" w:hAnsi="Georgia"/>
-        </w:rPr>
-        <w:t>selectSuit() and removeTopCard() are used by three different card abilities such as CannonCard, SwordCard, and HookCard.</w:t>
+      <w:proofErr w:type="spellStart"/>
+      <w:r>
+        <w:rPr>
+          <w:rFonts w:ascii="Georgia" w:hAnsi="Georgia"/>
+        </w:rPr>
+        <w:t>selectSuit</w:t>
+      </w:r>
+      <w:proofErr w:type="spellEnd"/>
+      <w:r>
+        <w:rPr>
+          <w:rFonts w:ascii="Georgia" w:hAnsi="Georgia"/>
+        </w:rPr>
+        <w:t xml:space="preserve">() and </w:t>
+      </w:r>
+      <w:proofErr w:type="spellStart"/>
+      <w:r>
+        <w:rPr>
+          <w:rFonts w:ascii="Georgia" w:hAnsi="Georgia"/>
+        </w:rPr>
+        <w:t>removeTopCard</w:t>
+      </w:r>
+      <w:proofErr w:type="spellEnd"/>
+      <w:r>
+        <w:rPr>
+          <w:rFonts w:ascii="Georgia" w:hAnsi="Georgia"/>
+        </w:rPr>
+        <w:t xml:space="preserve">() are used by three different card abilities such as </w:t>
+      </w:r>
+      <w:proofErr w:type="spellStart"/>
+      <w:r>
+        <w:rPr>
+          <w:rFonts w:ascii="Georgia" w:hAnsi="Georgia"/>
+        </w:rPr>
+        <w:t>CannonCard</w:t>
+      </w:r>
+      <w:proofErr w:type="spellEnd"/>
+      <w:r>
+        <w:rPr>
+          <w:rFonts w:ascii="Georgia" w:hAnsi="Georgia"/>
+        </w:rPr>
+        <w:t xml:space="preserve">, </w:t>
+      </w:r>
+      <w:proofErr w:type="spellStart"/>
+      <w:r>
+        <w:rPr>
+          <w:rFonts w:ascii="Georgia" w:hAnsi="Georgia"/>
+        </w:rPr>
+        <w:t>SwordCard</w:t>
+      </w:r>
+      <w:proofErr w:type="spellEnd"/>
+      <w:r>
+        <w:rPr>
+          <w:rFonts w:ascii="Georgia" w:hAnsi="Georgia"/>
+        </w:rPr>
+        <w:t xml:space="preserve">, and </w:t>
+      </w:r>
+      <w:proofErr w:type="spellStart"/>
+      <w:r>
+        <w:rPr>
+          <w:rFonts w:ascii="Georgia" w:hAnsi="Georgia"/>
+        </w:rPr>
+        <w:t>HookCard</w:t>
+      </w:r>
+      <w:proofErr w:type="spellEnd"/>
+      <w:r>
+        <w:rPr>
+          <w:rFonts w:ascii="Georgia" w:hAnsi="Georgia"/>
+        </w:rPr>
+        <w:t>.</w:t>
       </w:r>
     </w:p>
     <w:p>
@@ -971,8 +1526,16 @@
         <w:rPr>
           <w:rFonts w:ascii="Georgia" w:hAnsi="Georgia"/>
         </w:rPr>
-        <w:t>Rather than duplicating this code in each card, it is extracted into two free functions in CardHelper.cpp with declarations in CardHelper.h</w:t>
-      </w:r>
+        <w:t xml:space="preserve">Rather than duplicating this code in each card, it is extracted into two free functions in CardHelper.cpp with declarations in </w:t>
+      </w:r>
+      <w:proofErr w:type="spellStart"/>
+      <w:r>
+        <w:rPr>
+          <w:rFonts w:ascii="Georgia" w:hAnsi="Georgia"/>
+        </w:rPr>
+        <w:t>CardHelper.h</w:t>
+      </w:r>
+      <w:proofErr w:type="spellEnd"/>
     </w:p>
     <w:p>
       <w:pPr>
@@ -1000,8 +1563,13 @@
       <w:r>
         <w:t xml:space="preserve"> </w:t>
       </w:r>
-      <w:r>
-        <w:t>CardCollection typedef</w:t>
+      <w:proofErr w:type="spellStart"/>
+      <w:r>
+        <w:t>CardCollection</w:t>
+      </w:r>
+      <w:proofErr w:type="spellEnd"/>
+      <w:r>
+        <w:t xml:space="preserve"> typedef</w:t>
       </w:r>
     </w:p>
     <w:p>
@@ -1016,7 +1584,35 @@
         <w:rPr>
           <w:rFonts w:ascii="Georgia" w:hAnsi="Georgia"/>
         </w:rPr>
-        <w:t>Typedef std::vector&lt;Card*&gt; CardCollection is defined once in Card.h.</w:t>
+        <w:t xml:space="preserve">Typedef std::vector&lt;Card*&gt; </w:t>
+      </w:r>
+      <w:proofErr w:type="spellStart"/>
+      <w:r>
+        <w:rPr>
+          <w:rFonts w:ascii="Georgia" w:hAnsi="Georgia"/>
+        </w:rPr>
+        <w:t>CardCollection</w:t>
+      </w:r>
+      <w:proofErr w:type="spellEnd"/>
+      <w:r>
+        <w:rPr>
+          <w:rFonts w:ascii="Georgia" w:hAnsi="Georgia"/>
+        </w:rPr>
+        <w:t xml:space="preserve"> is defined once in </w:t>
+      </w:r>
+      <w:proofErr w:type="spellStart"/>
+      <w:r>
+        <w:rPr>
+          <w:rFonts w:ascii="Georgia" w:hAnsi="Georgia"/>
+        </w:rPr>
+        <w:t>Card.h</w:t>
+      </w:r>
+      <w:proofErr w:type="spellEnd"/>
+      <w:r>
+        <w:rPr>
+          <w:rFonts w:ascii="Georgia" w:hAnsi="Georgia"/>
+        </w:rPr>
+        <w:t>.</w:t>
       </w:r>
     </w:p>
     <w:p>
@@ -1061,7 +1657,15 @@
         <w:t xml:space="preserve"> </w:t>
       </w:r>
       <w:r>
-        <w:t>Scoring using std::map&lt;CardType, int&gt;</w:t>
+        <w:t>Scoring using std::map&lt;</w:t>
+      </w:r>
+      <w:proofErr w:type="spellStart"/>
+      <w:r>
+        <w:t>CardType</w:t>
+      </w:r>
+      <w:proofErr w:type="spellEnd"/>
+      <w:r>
+        <w:t>, int&gt;</w:t>
       </w:r>
     </w:p>
     <w:p>
@@ -1103,7 +1707,21 @@
         <w:rPr>
           <w:rFonts w:ascii="Georgia" w:hAnsi="Georgia"/>
         </w:rPr>
-        <w:t xml:space="preserve"> CardType as key and highest-value-seen as the value</w:t>
+        <w:t xml:space="preserve"> </w:t>
+      </w:r>
+      <w:proofErr w:type="spellStart"/>
+      <w:r>
+        <w:rPr>
+          <w:rFonts w:ascii="Georgia" w:hAnsi="Georgia"/>
+        </w:rPr>
+        <w:t>CardType</w:t>
+      </w:r>
+      <w:proofErr w:type="spellEnd"/>
+      <w:r>
+        <w:rPr>
+          <w:rFonts w:ascii="Georgia" w:hAnsi="Georgia"/>
+        </w:rPr>
+        <w:t xml:space="preserve"> as key and highest-value-seen as the value</w:t>
       </w:r>
       <w:r>
         <w:rPr>
@@ -1151,8 +1769,13 @@
         </w:numPr>
       </w:pPr>
       <w:r>
-        <w:t xml:space="preserve"> Player switching uses the expression 1 - _currentPlayer</w:t>
-      </w:r>
+        <w:t xml:space="preserve"> Player switching uses the expression 1 - _</w:t>
+      </w:r>
+      <w:proofErr w:type="spellStart"/>
+      <w:r>
+        <w:t>currentPlayer</w:t>
+      </w:r>
+      <w:proofErr w:type="spellEnd"/>
     </w:p>
     <w:p>
       <w:pPr>
@@ -1166,7 +1789,21 @@
         <w:rPr>
           <w:rFonts w:ascii="Georgia" w:hAnsi="Georgia"/>
         </w:rPr>
-        <w:t>_currentPlayer is always 0 or 1, representing which of the two players is active in the current turn.</w:t>
+        <w:t>_</w:t>
+      </w:r>
+      <w:proofErr w:type="spellStart"/>
+      <w:r>
+        <w:rPr>
+          <w:rFonts w:ascii="Georgia" w:hAnsi="Georgia"/>
+        </w:rPr>
+        <w:t>currentPlayer</w:t>
+      </w:r>
+      <w:proofErr w:type="spellEnd"/>
+      <w:r>
+        <w:rPr>
+          <w:rFonts w:ascii="Georgia" w:hAnsi="Georgia"/>
+        </w:rPr>
+        <w:t xml:space="preserve"> is always 0 or 1, representing which of the two players is active in the current turn.</w:t>
       </w:r>
     </w:p>
     <w:p>
@@ -1225,8 +1862,13 @@
           <w:numId w:val="1"/>
         </w:numPr>
       </w:pPr>
-      <w:r>
-        <w:t>cin error handling in input loops</w:t>
+      <w:proofErr w:type="spellStart"/>
+      <w:r>
+        <w:t>cin</w:t>
+      </w:r>
+      <w:proofErr w:type="spellEnd"/>
+      <w:r>
+        <w:t xml:space="preserve"> error handling in input loops</w:t>
       </w:r>
     </w:p>
     <w:p>
@@ -1250,7 +1892,35 @@
         <w:rPr>
           <w:rFonts w:ascii="Georgia" w:hAnsi="Georgia"/>
         </w:rPr>
-        <w:t>user types a non-integer where std::cin &gt;&gt; expects one, cin enters a fail state and stops reading.</w:t>
+        <w:t>user types a non-integer where std::</w:t>
+      </w:r>
+      <w:proofErr w:type="spellStart"/>
+      <w:r>
+        <w:rPr>
+          <w:rFonts w:ascii="Georgia" w:hAnsi="Georgia"/>
+        </w:rPr>
+        <w:t>cin</w:t>
+      </w:r>
+      <w:proofErr w:type="spellEnd"/>
+      <w:r>
+        <w:rPr>
+          <w:rFonts w:ascii="Georgia" w:hAnsi="Georgia"/>
+        </w:rPr>
+        <w:t xml:space="preserve"> &gt;&gt; expects one, </w:t>
+      </w:r>
+      <w:proofErr w:type="spellStart"/>
+      <w:r>
+        <w:rPr>
+          <w:rFonts w:ascii="Georgia" w:hAnsi="Georgia"/>
+        </w:rPr>
+        <w:t>cin</w:t>
+      </w:r>
+      <w:proofErr w:type="spellEnd"/>
+      <w:r>
+        <w:rPr>
+          <w:rFonts w:ascii="Georgia" w:hAnsi="Georgia"/>
+        </w:rPr>
+        <w:t xml:space="preserve"> enters a fail state and stops reading.</w:t>
       </w:r>
     </w:p>
     <w:p>
@@ -1268,7 +1938,21 @@
         <w:rPr>
           <w:rFonts w:ascii="Georgia" w:hAnsi="Georgia"/>
         </w:rPr>
-        <w:t>This caused an infinite loop because the loop condition stayed true, cin kept returning immediately, and the prompt flooded the output.</w:t>
+        <w:t xml:space="preserve">This caused an infinite loop because the loop condition stayed true, </w:t>
+      </w:r>
+      <w:proofErr w:type="spellStart"/>
+      <w:r>
+        <w:rPr>
+          <w:rFonts w:ascii="Georgia" w:hAnsi="Georgia"/>
+        </w:rPr>
+        <w:t>cin</w:t>
+      </w:r>
+      <w:proofErr w:type="spellEnd"/>
+      <w:r>
+        <w:rPr>
+          <w:rFonts w:ascii="Georgia" w:hAnsi="Georgia"/>
+        </w:rPr>
+        <w:t xml:space="preserve"> kept returning immediately, and the prompt flooded the output.</w:t>
       </w:r>
     </w:p>
     <w:p>
@@ -1286,7 +1970,49 @@
         <w:rPr>
           <w:rFonts w:ascii="Georgia" w:hAnsi="Georgia"/>
         </w:rPr>
-        <w:t>The fix: check if (!(std::cin &gt;&gt; choice)) and if so call std::cin.clear() to reset the fail flag, then std::cin.ignore(1000, ‘\n’) to flush the bad input from the buffer.</w:t>
+        <w:t>The fix: check if (!(std::</w:t>
+      </w:r>
+      <w:proofErr w:type="spellStart"/>
+      <w:r>
+        <w:rPr>
+          <w:rFonts w:ascii="Georgia" w:hAnsi="Georgia"/>
+        </w:rPr>
+        <w:t>cin</w:t>
+      </w:r>
+      <w:proofErr w:type="spellEnd"/>
+      <w:r>
+        <w:rPr>
+          <w:rFonts w:ascii="Georgia" w:hAnsi="Georgia"/>
+        </w:rPr>
+        <w:t xml:space="preserve"> &gt;&gt; choice)) and if so call std::</w:t>
+      </w:r>
+      <w:proofErr w:type="spellStart"/>
+      <w:r>
+        <w:rPr>
+          <w:rFonts w:ascii="Georgia" w:hAnsi="Georgia"/>
+        </w:rPr>
+        <w:t>cin.clear</w:t>
+      </w:r>
+      <w:proofErr w:type="spellEnd"/>
+      <w:r>
+        <w:rPr>
+          <w:rFonts w:ascii="Georgia" w:hAnsi="Georgia"/>
+        </w:rPr>
+        <w:t>() to reset the fail flag, then std::</w:t>
+      </w:r>
+      <w:proofErr w:type="spellStart"/>
+      <w:r>
+        <w:rPr>
+          <w:rFonts w:ascii="Georgia" w:hAnsi="Georgia"/>
+        </w:rPr>
+        <w:t>cin.ignore</w:t>
+      </w:r>
+      <w:proofErr w:type="spellEnd"/>
+      <w:r>
+        <w:rPr>
+          <w:rFonts w:ascii="Georgia" w:hAnsi="Georgia"/>
+        </w:rPr>
+        <w:t>(1000, ‘\n’) to flush the bad input from the buffer.</w:t>
       </w:r>
     </w:p>
     <w:p>
@@ -1304,15 +2030,44 @@
         <w:rPr>
           <w:rFonts w:ascii="Georgia" w:hAnsi="Georgia"/>
         </w:rPr>
-        <w:t>This pattern is applied to both selectSuit() in CardHelper.cpp and MapCard::play().</w:t>
-      </w:r>
-    </w:p>
-    <w:p>
-      <w:pPr>
-        <w:ind w:left="360"/>
-      </w:pPr>
+        <w:t xml:space="preserve">This pattern is applied to both </w:t>
+      </w:r>
+      <w:proofErr w:type="spellStart"/>
+      <w:r>
+        <w:rPr>
+          <w:rFonts w:ascii="Georgia" w:hAnsi="Georgia"/>
+        </w:rPr>
+        <w:t>selectSuit</w:t>
+      </w:r>
+      <w:proofErr w:type="spellEnd"/>
+      <w:r>
+        <w:rPr>
+          <w:rFonts w:ascii="Georgia" w:hAnsi="Georgia"/>
+        </w:rPr>
+        <w:t xml:space="preserve">() in CardHelper.cpp and </w:t>
+      </w:r>
+      <w:proofErr w:type="spellStart"/>
+      <w:r>
+        <w:rPr>
+          <w:rFonts w:ascii="Georgia" w:hAnsi="Georgia"/>
+        </w:rPr>
+        <w:t>MapCard</w:t>
+      </w:r>
+      <w:proofErr w:type="spellEnd"/>
+      <w:r>
+        <w:rPr>
+          <w:rFonts w:ascii="Georgia" w:hAnsi="Georgia"/>
+        </w:rPr>
+        <w:t>::play().</w:t>
+      </w:r>
     </w:p>
     <w:sectPr>
+      <w:headerReference w:type="even" r:id="rId9"/>
+      <w:headerReference w:type="default" r:id="rId10"/>
+      <w:footerReference w:type="even" r:id="rId11"/>
+      <w:footerReference w:type="default" r:id="rId12"/>
+      <w:headerReference w:type="first" r:id="rId13"/>
+      <w:footerReference w:type="first" r:id="rId14"/>
       <w:pgSz w:w="12240" w:h="15840"/>
       <w:pgMar w:top="1440" w:right="1440" w:bottom="1440" w:left="1440" w:header="720" w:footer="720" w:gutter="0"/>
       <w:cols w:space="720"/>
@@ -1347,6 +2102,93 @@
 </w:endnotes>
 </file>
 
+<file path=word/footer1.xml><?xml version="1.0" encoding="utf-8"?>
+<w:ftr xmlns:wpc="http://schemas.microsoft.com/office/word/2010/wordprocessingCanvas" xmlns:cx="http://schemas.microsoft.com/office/drawing/2014/chartex" xmlns:cx1="http://schemas.microsoft.com/office/drawing/2015/9/8/chartex" xmlns:cx2="http://schemas.microsoft.com/office/drawing/2015/10/21/chartex" xmlns:cx3="http://schemas.microsoft.com/office/drawing/2016/5/9/chartex" xmlns:cx4="http://schemas.microsoft.com/office/drawing/2016/5/10/chartex" xmlns:cx5="http://schemas.microsoft.com/office/drawing/2016/5/11/chartex" xmlns:cx6="http://schemas.microsoft.com/office/drawing/2016/5/12/chartex" xmlns:cx7="http://schemas.microsoft.com/office/drawing/2016/5/13/chartex" xmlns:cx8="http://schemas.microsoft.com/office/drawing/2016/5/14/chartex" xmlns:mc="http://schemas.openxmlformats.org/markup-compatibility/2006" xmlns:aink="http://schemas.microsoft.com/office/drawing/2016/ink" xmlns:am3d="http://schemas.microsoft.com/office/drawing/2017/model3d" xmlns:o="urn:schemas-microsoft-com:office:office" xmlns:r="http://schemas.openxmlformats.org/officeDocument/2006/relationships" xmlns:m="http://schemas.openxmlformats.org/officeDocument/2006/math" xmlns:v="urn:schemas-microsoft-com:vml" xmlns:wp14="http://schemas.microsoft.com/office/word/2010/wordprocessingDrawing" xmlns:wp="http://schemas.openxmlformats.org/drawingml/2006/wordprocessingDrawing" xmlns:w10="urn:schemas-microsoft-com:office:word" xmlns:w="http://schemas.openxmlformats.org/wordprocessingml/2006/main" xmlns:w14="http://schemas.microsoft.com/office/word/2010/wordml" xmlns:w15="http://schemas.microsoft.com/office/word/2012/wordml" xmlns:w16cex="http://schemas.microsoft.com/office/word/2018/wordml/cex" xmlns:w16cid="http://schemas.microsoft.com/office/word/2016/wordml/cid" xmlns:w16="http://schemas.microsoft.com/office/word/2018/wordml" xmlns:w16sdtdh="http://schemas.microsoft.com/office/word/2020/wordml/sdtdatahash" xmlns:w16se="http://schemas.microsoft.com/office/word/2015/wordml/symex" xmlns:wpg="http://schemas.microsoft.com/office/word/2010/wordprocessingGroup" xmlns:wpi="http://schemas.microsoft.com/office/word/2010/wordprocessingInk" xmlns:wne="http://schemas.microsoft.com/office/word/2006/wordml" xmlns:wps="http://schemas.microsoft.com/office/word/2010/wordprocessingShape" mc:Ignorable="w14 w15 w16se w16cid w16 w16cex w16sdtdh wp14">
+  <w:p>
+    <w:pPr>
+      <w:pStyle w:val="Footer"/>
+    </w:pPr>
+  </w:p>
+</w:ftr>
+</file>
+
+<file path=word/footer2.xml><?xml version="1.0" encoding="utf-8"?>
+<w:ftr xmlns:wpc="http://schemas.microsoft.com/office/word/2010/wordprocessingCanvas" xmlns:cx="http://schemas.microsoft.com/office/drawing/2014/chartex" xmlns:cx1="http://schemas.microsoft.com/office/drawing/2015/9/8/chartex" xmlns:cx2="http://schemas.microsoft.com/office/drawing/2015/10/21/chartex" xmlns:cx3="http://schemas.microsoft.com/office/drawing/2016/5/9/chartex" xmlns:cx4="http://schemas.microsoft.com/office/drawing/2016/5/10/chartex" xmlns:cx5="http://schemas.microsoft.com/office/drawing/2016/5/11/chartex" xmlns:cx6="http://schemas.microsoft.com/office/drawing/2016/5/12/chartex" xmlns:cx7="http://schemas.microsoft.com/office/drawing/2016/5/13/chartex" xmlns:cx8="http://schemas.microsoft.com/office/drawing/2016/5/14/chartex" xmlns:mc="http://schemas.openxmlformats.org/markup-compatibility/2006" xmlns:aink="http://schemas.microsoft.com/office/drawing/2016/ink" xmlns:am3d="http://schemas.microsoft.com/office/drawing/2017/model3d" xmlns:o="urn:schemas-microsoft-com:office:office" xmlns:r="http://schemas.openxmlformats.org/officeDocument/2006/relationships" xmlns:m="http://schemas.openxmlformats.org/officeDocument/2006/math" xmlns:v="urn:schemas-microsoft-com:vml" xmlns:wp14="http://schemas.microsoft.com/office/word/2010/wordprocessingDrawing" xmlns:wp="http://schemas.openxmlformats.org/drawingml/2006/wordprocessingDrawing" xmlns:w10="urn:schemas-microsoft-com:office:word" xmlns:w="http://schemas.openxmlformats.org/wordprocessingml/2006/main" xmlns:w14="http://schemas.microsoft.com/office/word/2010/wordml" xmlns:w15="http://schemas.microsoft.com/office/word/2012/wordml" xmlns:w16cex="http://schemas.microsoft.com/office/word/2018/wordml/cex" xmlns:w16cid="http://schemas.microsoft.com/office/word/2016/wordml/cid" xmlns:w16="http://schemas.microsoft.com/office/word/2018/wordml" xmlns:w16sdtdh="http://schemas.microsoft.com/office/word/2020/wordml/sdtdatahash" xmlns:w16se="http://schemas.microsoft.com/office/word/2015/wordml/symex" xmlns:wpg="http://schemas.microsoft.com/office/word/2010/wordprocessingGroup" xmlns:wpi="http://schemas.microsoft.com/office/word/2010/wordprocessingInk" xmlns:wne="http://schemas.microsoft.com/office/word/2006/wordml" xmlns:wps="http://schemas.microsoft.com/office/word/2010/wordprocessingShape" mc:Ignorable="w14 w15 w16se w16cid w16 w16cex w16sdtdh wp14">
+  <w:sdt>
+    <w:sdtPr>
+      <w:id w:val="1894155633"/>
+      <w:docPartObj>
+        <w:docPartGallery w:val="Page Numbers (Bottom of Page)"/>
+        <w:docPartUnique/>
+      </w:docPartObj>
+    </w:sdtPr>
+    <w:sdtEndPr>
+      <w:rPr>
+        <w:color w:val="7F7F7F" w:themeColor="background1" w:themeShade="7F"/>
+        <w:spacing w:val="60"/>
+      </w:rPr>
+    </w:sdtEndPr>
+    <w:sdtContent>
+      <w:p>
+        <w:pPr>
+          <w:pStyle w:val="Footer"/>
+          <w:pBdr>
+            <w:top w:val="single" w:sz="4" w:space="1" w:color="D9D9D9" w:themeColor="background1" w:themeShade="D9"/>
+          </w:pBdr>
+          <w:jc w:val="right"/>
+        </w:pPr>
+        <w:r>
+          <w:fldChar w:fldCharType="begin"/>
+        </w:r>
+        <w:r>
+          <w:instrText xml:space="preserve"> PAGE   \* MERGEFORMAT </w:instrText>
+        </w:r>
+        <w:r>
+          <w:fldChar w:fldCharType="separate"/>
+        </w:r>
+        <w:r>
+          <w:rPr>
+            <w:noProof/>
+          </w:rPr>
+          <w:t>2</w:t>
+        </w:r>
+        <w:r>
+          <w:rPr>
+            <w:noProof/>
+          </w:rPr>
+          <w:fldChar w:fldCharType="end"/>
+        </w:r>
+        <w:r>
+          <w:t xml:space="preserve"> | </w:t>
+        </w:r>
+        <w:r>
+          <w:rPr>
+            <w:color w:val="7F7F7F" w:themeColor="background1" w:themeShade="7F"/>
+            <w:spacing w:val="60"/>
+          </w:rPr>
+          <w:t>Page</w:t>
+        </w:r>
+      </w:p>
+    </w:sdtContent>
+  </w:sdt>
+  <w:p>
+    <w:pPr>
+      <w:pStyle w:val="Footer"/>
+    </w:pPr>
+  </w:p>
+</w:ftr>
+</file>
+
+<file path=word/footer3.xml><?xml version="1.0" encoding="utf-8"?>
+<w:ftr xmlns:wpc="http://schemas.microsoft.com/office/word/2010/wordprocessingCanvas" xmlns:cx="http://schemas.microsoft.com/office/drawing/2014/chartex" xmlns:cx1="http://schemas.microsoft.com/office/drawing/2015/9/8/chartex" xmlns:cx2="http://schemas.microsoft.com/office/drawing/2015/10/21/chartex" xmlns:cx3="http://schemas.microsoft.com/office/drawing/2016/5/9/chartex" xmlns:cx4="http://schemas.microsoft.com/office/drawing/2016/5/10/chartex" xmlns:cx5="http://schemas.microsoft.com/office/drawing/2016/5/11/chartex" xmlns:cx6="http://schemas.microsoft.com/office/drawing/2016/5/12/chartex" xmlns:cx7="http://schemas.microsoft.com/office/drawing/2016/5/13/chartex" xmlns:cx8="http://schemas.microsoft.com/office/drawing/2016/5/14/chartex" xmlns:mc="http://schemas.openxmlformats.org/markup-compatibility/2006" xmlns:aink="http://schemas.microsoft.com/office/drawing/2016/ink" xmlns:am3d="http://schemas.microsoft.com/office/drawing/2017/model3d" xmlns:o="urn:schemas-microsoft-com:office:office" xmlns:r="http://schemas.openxmlformats.org/officeDocument/2006/relationships" xmlns:m="http://schemas.openxmlformats.org/officeDocument/2006/math" xmlns:v="urn:schemas-microsoft-com:vml" xmlns:wp14="http://schemas.microsoft.com/office/word/2010/wordprocessingDrawing" xmlns:wp="http://schemas.openxmlformats.org/drawingml/2006/wordprocessingDrawing" xmlns:w10="urn:schemas-microsoft-com:office:word" xmlns:w="http://schemas.openxmlformats.org/wordprocessingml/2006/main" xmlns:w14="http://schemas.microsoft.com/office/word/2010/wordml" xmlns:w15="http://schemas.microsoft.com/office/word/2012/wordml" xmlns:w16cex="http://schemas.microsoft.com/office/word/2018/wordml/cex" xmlns:w16cid="http://schemas.microsoft.com/office/word/2016/wordml/cid" xmlns:w16="http://schemas.microsoft.com/office/word/2018/wordml" xmlns:w16sdtdh="http://schemas.microsoft.com/office/word/2020/wordml/sdtdatahash" xmlns:w16se="http://schemas.microsoft.com/office/word/2015/wordml/symex" xmlns:wpg="http://schemas.microsoft.com/office/word/2010/wordprocessingGroup" xmlns:wpi="http://schemas.microsoft.com/office/word/2010/wordprocessingInk" xmlns:wne="http://schemas.microsoft.com/office/word/2006/wordml" xmlns:wps="http://schemas.microsoft.com/office/word/2010/wordprocessingShape" mc:Ignorable="w14 w15 w16se w16cid w16 w16cex w16sdtdh wp14">
+  <w:p>
+    <w:pPr>
+      <w:pStyle w:val="Footer"/>
+    </w:pPr>
+  </w:p>
+</w:ftr>
+</file>
+
 <file path=word/footnotes.xml><?xml version="1.0" encoding="utf-8"?>
 <w:footnotes xmlns:wpc="http://schemas.microsoft.com/office/word/2010/wordprocessingCanvas" xmlns:cx="http://schemas.microsoft.com/office/drawing/2014/chartex" xmlns:cx1="http://schemas.microsoft.com/office/drawing/2015/9/8/chartex" xmlns:cx2="http://schemas.microsoft.com/office/drawing/2015/10/21/chartex" xmlns:cx3="http://schemas.microsoft.com/office/drawing/2016/5/9/chartex" xmlns:cx4="http://schemas.microsoft.com/office/drawing/2016/5/10/chartex" xmlns:cx5="http://schemas.microsoft.com/office/drawing/2016/5/11/chartex" xmlns:cx6="http://schemas.microsoft.com/office/drawing/2016/5/12/chartex" xmlns:cx7="http://schemas.microsoft.com/office/drawing/2016/5/13/chartex" xmlns:cx8="http://schemas.microsoft.com/office/drawing/2016/5/14/chartex" xmlns:mc="http://schemas.openxmlformats.org/markup-compatibility/2006" xmlns:aink="http://schemas.microsoft.com/office/drawing/2016/ink" xmlns:am3d="http://schemas.microsoft.com/office/drawing/2017/model3d" xmlns:o="urn:schemas-microsoft-com:office:office" xmlns:r="http://schemas.openxmlformats.org/officeDocument/2006/relationships" xmlns:m="http://schemas.openxmlformats.org/officeDocument/2006/math" xmlns:v="urn:schemas-microsoft-com:vml" xmlns:wp14="http://schemas.microsoft.com/office/word/2010/wordprocessingDrawing" xmlns:wp="http://schemas.openxmlformats.org/drawingml/2006/wordprocessingDrawing" xmlns:w10="urn:schemas-microsoft-com:office:word" xmlns:w="http://schemas.openxmlformats.org/wordprocessingml/2006/main" xmlns:w14="http://schemas.microsoft.com/office/word/2010/wordml" xmlns:w15="http://schemas.microsoft.com/office/word/2012/wordml" xmlns:w16cex="http://schemas.microsoft.com/office/word/2018/wordml/cex" xmlns:w16cid="http://schemas.microsoft.com/office/word/2016/wordml/cid" xmlns:w16="http://schemas.microsoft.com/office/word/2018/wordml" xmlns:w16sdtdh="http://schemas.microsoft.com/office/word/2020/wordml/sdtdatahash" xmlns:w16se="http://schemas.microsoft.com/office/word/2015/wordml/symex" xmlns:wpg="http://schemas.microsoft.com/office/word/2010/wordprocessingGroup" xmlns:wpi="http://schemas.microsoft.com/office/word/2010/wordprocessingInk" xmlns:wne="http://schemas.microsoft.com/office/word/2006/wordml" xmlns:wps="http://schemas.microsoft.com/office/word/2010/wordprocessingShape" mc:Ignorable="w14 w15 w16se w16cid w16 w16cex w16sdtdh wp14">
   <w:footnote w:type="separator" w:id="-1">
@@ -1370,6 +2212,36 @@
     </w:p>
   </w:footnote>
 </w:footnotes>
+</file>
+
+<file path=word/header1.xml><?xml version="1.0" encoding="utf-8"?>
+<w:hdr xmlns:wpc="http://schemas.microsoft.com/office/word/2010/wordprocessingCanvas" xmlns:cx="http://schemas.microsoft.com/office/drawing/2014/chartex" xmlns:cx1="http://schemas.microsoft.com/office/drawing/2015/9/8/chartex" xmlns:cx2="http://schemas.microsoft.com/office/drawing/2015/10/21/chartex" xmlns:cx3="http://schemas.microsoft.com/office/drawing/2016/5/9/chartex" xmlns:cx4="http://schemas.microsoft.com/office/drawing/2016/5/10/chartex" xmlns:cx5="http://schemas.microsoft.com/office/drawing/2016/5/11/chartex" xmlns:cx6="http://schemas.microsoft.com/office/drawing/2016/5/12/chartex" xmlns:cx7="http://schemas.microsoft.com/office/drawing/2016/5/13/chartex" xmlns:cx8="http://schemas.microsoft.com/office/drawing/2016/5/14/chartex" xmlns:mc="http://schemas.openxmlformats.org/markup-compatibility/2006" xmlns:aink="http://schemas.microsoft.com/office/drawing/2016/ink" xmlns:am3d="http://schemas.microsoft.com/office/drawing/2017/model3d" xmlns:o="urn:schemas-microsoft-com:office:office" xmlns:r="http://schemas.openxmlformats.org/officeDocument/2006/relationships" xmlns:m="http://schemas.openxmlformats.org/officeDocument/2006/math" xmlns:v="urn:schemas-microsoft-com:vml" xmlns:wp14="http://schemas.microsoft.com/office/word/2010/wordprocessingDrawing" xmlns:wp="http://schemas.openxmlformats.org/drawingml/2006/wordprocessingDrawing" xmlns:w10="urn:schemas-microsoft-com:office:word" xmlns:w="http://schemas.openxmlformats.org/wordprocessingml/2006/main" xmlns:w14="http://schemas.microsoft.com/office/word/2010/wordml" xmlns:w15="http://schemas.microsoft.com/office/word/2012/wordml" xmlns:w16cex="http://schemas.microsoft.com/office/word/2018/wordml/cex" xmlns:w16cid="http://schemas.microsoft.com/office/word/2016/wordml/cid" xmlns:w16="http://schemas.microsoft.com/office/word/2018/wordml" xmlns:w16sdtdh="http://schemas.microsoft.com/office/word/2020/wordml/sdtdatahash" xmlns:w16se="http://schemas.microsoft.com/office/word/2015/wordml/symex" xmlns:wpg="http://schemas.microsoft.com/office/word/2010/wordprocessingGroup" xmlns:wpi="http://schemas.microsoft.com/office/word/2010/wordprocessingInk" xmlns:wne="http://schemas.microsoft.com/office/word/2006/wordml" xmlns:wps="http://schemas.microsoft.com/office/word/2010/wordprocessingShape" mc:Ignorable="w14 w15 w16se w16cid w16 w16cex w16sdtdh wp14">
+  <w:p>
+    <w:pPr>
+      <w:pStyle w:val="Header"/>
+    </w:pPr>
+  </w:p>
+</w:hdr>
+</file>
+
+<file path=word/header2.xml><?xml version="1.0" encoding="utf-8"?>
+<w:hdr xmlns:wpc="http://schemas.microsoft.com/office/word/2010/wordprocessingCanvas" xmlns:cx="http://schemas.microsoft.com/office/drawing/2014/chartex" xmlns:cx1="http://schemas.microsoft.com/office/drawing/2015/9/8/chartex" xmlns:cx2="http://schemas.microsoft.com/office/drawing/2015/10/21/chartex" xmlns:cx3="http://schemas.microsoft.com/office/drawing/2016/5/9/chartex" xmlns:cx4="http://schemas.microsoft.com/office/drawing/2016/5/10/chartex" xmlns:cx5="http://schemas.microsoft.com/office/drawing/2016/5/11/chartex" xmlns:cx6="http://schemas.microsoft.com/office/drawing/2016/5/12/chartex" xmlns:cx7="http://schemas.microsoft.com/office/drawing/2016/5/13/chartex" xmlns:cx8="http://schemas.microsoft.com/office/drawing/2016/5/14/chartex" xmlns:mc="http://schemas.openxmlformats.org/markup-compatibility/2006" xmlns:aink="http://schemas.microsoft.com/office/drawing/2016/ink" xmlns:am3d="http://schemas.microsoft.com/office/drawing/2017/model3d" xmlns:o="urn:schemas-microsoft-com:office:office" xmlns:r="http://schemas.openxmlformats.org/officeDocument/2006/relationships" xmlns:m="http://schemas.openxmlformats.org/officeDocument/2006/math" xmlns:v="urn:schemas-microsoft-com:vml" xmlns:wp14="http://schemas.microsoft.com/office/word/2010/wordprocessingDrawing" xmlns:wp="http://schemas.openxmlformats.org/drawingml/2006/wordprocessingDrawing" xmlns:w10="urn:schemas-microsoft-com:office:word" xmlns:w="http://schemas.openxmlformats.org/wordprocessingml/2006/main" xmlns:w14="http://schemas.microsoft.com/office/word/2010/wordml" xmlns:w15="http://schemas.microsoft.com/office/word/2012/wordml" xmlns:w16cex="http://schemas.microsoft.com/office/word/2018/wordml/cex" xmlns:w16cid="http://schemas.microsoft.com/office/word/2016/wordml/cid" xmlns:w16="http://schemas.microsoft.com/office/word/2018/wordml" xmlns:w16sdtdh="http://schemas.microsoft.com/office/word/2020/wordml/sdtdatahash" xmlns:w16se="http://schemas.microsoft.com/office/word/2015/wordml/symex" xmlns:wpg="http://schemas.microsoft.com/office/word/2010/wordprocessingGroup" xmlns:wpi="http://schemas.microsoft.com/office/word/2010/wordprocessingInk" xmlns:wne="http://schemas.microsoft.com/office/word/2006/wordml" xmlns:wps="http://schemas.microsoft.com/office/word/2010/wordprocessingShape" mc:Ignorable="w14 w15 w16se w16cid w16 w16cex w16sdtdh wp14">
+  <w:p>
+    <w:pPr>
+      <w:pStyle w:val="Header"/>
+    </w:pPr>
+  </w:p>
+</w:hdr>
+</file>
+
+<file path=word/header3.xml><?xml version="1.0" encoding="utf-8"?>
+<w:hdr xmlns:wpc="http://schemas.microsoft.com/office/word/2010/wordprocessingCanvas" xmlns:cx="http://schemas.microsoft.com/office/drawing/2014/chartex" xmlns:cx1="http://schemas.microsoft.com/office/drawing/2015/9/8/chartex" xmlns:cx2="http://schemas.microsoft.com/office/drawing/2015/10/21/chartex" xmlns:cx3="http://schemas.microsoft.com/office/drawing/2016/5/9/chartex" xmlns:cx4="http://schemas.microsoft.com/office/drawing/2016/5/10/chartex" xmlns:cx5="http://schemas.microsoft.com/office/drawing/2016/5/11/chartex" xmlns:cx6="http://schemas.microsoft.com/office/drawing/2016/5/12/chartex" xmlns:cx7="http://schemas.microsoft.com/office/drawing/2016/5/13/chartex" xmlns:cx8="http://schemas.microsoft.com/office/drawing/2016/5/14/chartex" xmlns:mc="http://schemas.openxmlformats.org/markup-compatibility/2006" xmlns:aink="http://schemas.microsoft.com/office/drawing/2016/ink" xmlns:am3d="http://schemas.microsoft.com/office/drawing/2017/model3d" xmlns:o="urn:schemas-microsoft-com:office:office" xmlns:r="http://schemas.openxmlformats.org/officeDocument/2006/relationships" xmlns:m="http://schemas.openxmlformats.org/officeDocument/2006/math" xmlns:v="urn:schemas-microsoft-com:vml" xmlns:wp14="http://schemas.microsoft.com/office/word/2010/wordprocessingDrawing" xmlns:wp="http://schemas.openxmlformats.org/drawingml/2006/wordprocessingDrawing" xmlns:w10="urn:schemas-microsoft-com:office:word" xmlns:w="http://schemas.openxmlformats.org/wordprocessingml/2006/main" xmlns:w14="http://schemas.microsoft.com/office/word/2010/wordml" xmlns:w15="http://schemas.microsoft.com/office/word/2012/wordml" xmlns:w16cex="http://schemas.microsoft.com/office/word/2018/wordml/cex" xmlns:w16cid="http://schemas.microsoft.com/office/word/2016/wordml/cid" xmlns:w16="http://schemas.microsoft.com/office/word/2018/wordml" xmlns:w16sdtdh="http://schemas.microsoft.com/office/word/2020/wordml/sdtdatahash" xmlns:w16se="http://schemas.microsoft.com/office/word/2015/wordml/symex" xmlns:wpg="http://schemas.microsoft.com/office/word/2010/wordprocessingGroup" xmlns:wpi="http://schemas.microsoft.com/office/word/2010/wordprocessingInk" xmlns:wne="http://schemas.microsoft.com/office/word/2006/wordml" xmlns:wps="http://schemas.microsoft.com/office/word/2010/wordprocessingShape" mc:Ignorable="w14 w15 w16se w16cid w16 w16cex w16sdtdh wp14">
+  <w:p>
+    <w:pPr>
+      <w:pStyle w:val="Header"/>
+    </w:pPr>
+  </w:p>
+</w:hdr>
 </file>
 
 <file path=word/numbering.xml><?xml version="1.0" encoding="utf-8"?>

</xml_diff>